<commit_message>
feat: finalize Member 4 benchmark and report
</commit_message>
<xml_diff>
--- a/Final_Report.docx
+++ b/Final_Report.docx
@@ -12,7 +12,7 @@
           <w:noProof/>
         </w:rPr>
         <w:drawing>
-          <wp:inline distT="0" distB="0" distL="0" distR="0" wp14:anchorId="0BE5A860" wp14:editId="04792FD0">
+          <wp:inline distT="0" distB="0" distL="0" distR="0" wp14:anchorId="02735602" wp14:editId="1DB74BC5">
             <wp:extent cx="733363" cy="1298448"/>
             <wp:effectExtent l="0" t="0" r="0" b="0"/>
             <wp:docPr id="1" name="Picture 1"/>
@@ -246,7 +246,7 @@
       <w:pPr>
         <w:pStyle w:val="Heading1"/>
       </w:pPr>
-      <w:bookmarkStart w:id="0" w:name="_Toc241327377"/>
+      <w:bookmarkStart w:id="0" w:name="_Toc241349623"/>
       <w:r>
         <w:t>บทคัดย่อ</w:t>
       </w:r>
@@ -254,7 +254,7 @@
     </w:p>
     <w:p>
       <w:r>
-        <w:t>โครงงานนี้เปรียบเทียบ Native IPO, Many-Independent-Objective (MIO) ใน EvoSuite, DeepSeek V4 Flash และ Gemini 3.8 Flash บน Defects4J 3.0.1-7-g8c16da82 ซึ่งมี active bugs 854 บั๊กจาก 17 โครงการ กำหนดผลหนึ่งรายการต่อบั๊กและเทคนิค รวม 3,416 ช่อง มี suite ที่ผ่านเกณฑ์สำหรับประเมิน 2,768 ช่อง และ 648 ช่องเป็น NO_SUITE. ผล BUG_DETECTED ต้องมีหลักฐานว่า test ล้มเหลวบน buggy version และผ่านบน fixed version.</w:t>
+        <w:t>โครงงานนี้เปรียบเทียบ Native IPO, Many-Independent-Objective (MIO) ใน EvoSuite, DeepSeek V4 Flash และ Gemini 3.8 Flash บน Defects4J 3.0.1-7-g8c16da82 ซึ่งมี active bugs 854 บั๊กจาก 17 โครงการ กำหนดผลหนึ่งรายการต่อบั๊กและเทคนิค รวม 3,416 ช่อง มีผลประเมิน suite 2,797 ช่อง และ 619 ช่องเป็น NO_SUITE. ผล BUG_DETECTED ต้องมีหลักฐานว่า test ล้มเหลวบน buggy version และผ่านบน fixed version.</w:t>
       </w:r>
     </w:p>
     <w:p>
@@ -262,12 +262,12 @@
         <w:t xml:space="preserve">Coverage </w:t>
       </w:r>
       <w:r>
-        <w:t>รวมทุก modified target class ตามค่า aggregate ใน Defects4J summary โดยรวมจำนวนบรรทัดและ branch ที่ครอบคลุมหารด้วยจำนวนทั้งหมด ไม่ได้จำกัดที่บั๊กคลาสเดียว. Gemini มี line/branch coverage เฉลี่ยสูงสุด 86.24%/79.45% (n=422). Native IPO ตรวจพบ 37/257 suite (14.40%), MIO 5/834 (0.60%), DeepSeek 11/836 (1.32%) และ Gemini 107/841 (12.72%).</w:t>
+        <w:t>รวมทุก modified target class ตามค่า aggregate ใน Defects4J summary. Gemini มี line/branch coverage เฉลี่ยสูงสุด 86.29%/79.54% (n=424). Native IPO ตรวจพบ 37/257 suite (14.40%), MIO 5/834 (0.60%), DeepSeek 11/853 (1.29%) และ Gemini 107/853 (12.54%).</w:t>
       </w:r>
     </w:p>
     <w:p>
       <w:r>
-        <w:t>ผลรวมสี่เทคนิคตรวจพบ 144 บั๊กไม่ซ้ำจาก 853 บั๊กที่มี suite อย่างน้อยหนึ่งเทคนิค (16.88%). สถิติ MIO budget และ token/เวลา AI แยกจาก benchmark กลางเพราะ generation logs ไม่มี run ID เชื่อมกับผลตรวจจับรายบั๊ก จึงไม่คำนวณ token ต่อบั๊กที่ตรวจพบ. ผลต้องอ่านควบคู่กับ compile errors และความพร้อมของ suite ที่ต่างกัน.</w:t>
+        <w:t>ผลรวมสี่เทคนิคตรวจพบ 144 บั๊กไม่ซ้ำจาก 853 บั๊กที่มี suite อย่างน้อยหนึ่งเทคนิค (16.88%). สถิติ MIO budget และ token/เวลา AI แยกจาก benchmark กลางเพราะ generation logs ไม่มี run ID เชื่อมกับผลตรวจจับรายบั๊ก จึงไม่คำนวณ token ต่อบั๊กที่ตรวจพบ.</w:t>
       </w:r>
     </w:p>
     <w:p>
@@ -290,7 +290,7 @@
       <w:pPr>
         <w:pStyle w:val="Heading1"/>
       </w:pPr>
-      <w:bookmarkStart w:id="1" w:name="_Toc241327378"/>
+      <w:bookmarkStart w:id="1" w:name="_Toc241349624"/>
       <w:r>
         <w:t>สารบัญ</w:t>
       </w:r>
@@ -303,14 +303,7 @@
           <w:tab w:val="right" w:leader="dot" w:pos="9868"/>
         </w:tabs>
         <w:rPr>
-          <w:rFonts w:asciiTheme="minorHAnsi" w:eastAsiaTheme="minorEastAsia" w:hAnsiTheme="minorHAnsi" w:cstheme="minorBidi"/>
           <w:noProof/>
-          <w:color w:val="auto"/>
-          <w:kern w:val="2"/>
-          <w:sz w:val="24"/>
-          <w:szCs w:val="30"/>
-          <w:lang w:bidi="th-TH"/>
-          <w14:ligatures w14:val="standardContextual"/>
         </w:rPr>
       </w:pPr>
       <w:r>
@@ -322,7 +315,7 @@
       <w:r>
         <w:fldChar w:fldCharType="separate"/>
       </w:r>
-      <w:hyperlink w:anchor="_Toc241327377" w:history="1">
+      <w:hyperlink w:anchor="_Toc241349623" w:history="1">
         <w:r>
           <w:rPr>
             <w:rStyle w:val="Hyperlink"/>
@@ -339,8 +332,9 @@
         </w:r>
         <w:r>
           <w:rPr>
+            <w:rStyle w:val="Hyperlink"/>
             <w:noProof/>
-            <w:webHidden/>
+            <w:cs/>
           </w:rPr>
           <w:fldChar w:fldCharType="begin"/>
         </w:r>
@@ -349,18 +343,20 @@
             <w:noProof/>
             <w:webHidden/>
           </w:rPr>
-          <w:instrText xml:space="preserve"> PAGEREF _Toc241327377 \h </w:instrText>
+          <w:instrText xml:space="preserve"> PAGEREF _Toc241349623 \h </w:instrText>
         </w:r>
         <w:r>
           <w:rPr>
+            <w:rStyle w:val="Hyperlink"/>
             <w:noProof/>
-            <w:webHidden/>
+            <w:cs/>
           </w:rPr>
         </w:r>
         <w:r>
           <w:rPr>
+            <w:rStyle w:val="Hyperlink"/>
             <w:noProof/>
-            <w:webHidden/>
+            <w:cs/>
           </w:rPr>
           <w:fldChar w:fldCharType="separate"/>
         </w:r>
@@ -373,8 +369,9 @@
         </w:r>
         <w:r>
           <w:rPr>
+            <w:rStyle w:val="Hyperlink"/>
             <w:noProof/>
-            <w:webHidden/>
+            <w:cs/>
           </w:rPr>
           <w:fldChar w:fldCharType="end"/>
         </w:r>
@@ -387,17 +384,10 @@
           <w:tab w:val="right" w:leader="dot" w:pos="9868"/>
         </w:tabs>
         <w:rPr>
-          <w:rFonts w:asciiTheme="minorHAnsi" w:eastAsiaTheme="minorEastAsia" w:hAnsiTheme="minorHAnsi" w:cstheme="minorBidi"/>
           <w:noProof/>
-          <w:color w:val="auto"/>
-          <w:kern w:val="2"/>
-          <w:sz w:val="24"/>
-          <w:szCs w:val="30"/>
-          <w:lang w:bidi="th-TH"/>
-          <w14:ligatures w14:val="standardContextual"/>
         </w:rPr>
       </w:pPr>
-      <w:hyperlink w:anchor="_Toc241327378" w:history="1">
+      <w:hyperlink w:anchor="_Toc241349624" w:history="1">
         <w:r>
           <w:rPr>
             <w:rStyle w:val="Hyperlink"/>
@@ -414,8 +404,9 @@
         </w:r>
         <w:r>
           <w:rPr>
+            <w:rStyle w:val="Hyperlink"/>
             <w:noProof/>
-            <w:webHidden/>
+            <w:cs/>
           </w:rPr>
           <w:fldChar w:fldCharType="begin"/>
         </w:r>
@@ -424,18 +415,20 @@
             <w:noProof/>
             <w:webHidden/>
           </w:rPr>
-          <w:instrText xml:space="preserve"> PAGEREF _Toc241327378 \h </w:instrText>
+          <w:instrText xml:space="preserve"> PAGEREF _Toc241349624 \h </w:instrText>
         </w:r>
         <w:r>
           <w:rPr>
+            <w:rStyle w:val="Hyperlink"/>
             <w:noProof/>
-            <w:webHidden/>
+            <w:cs/>
           </w:rPr>
         </w:r>
         <w:r>
           <w:rPr>
+            <w:rStyle w:val="Hyperlink"/>
             <w:noProof/>
-            <w:webHidden/>
+            <w:cs/>
           </w:rPr>
           <w:fldChar w:fldCharType="separate"/>
         </w:r>
@@ -448,8 +441,9 @@
         </w:r>
         <w:r>
           <w:rPr>
+            <w:rStyle w:val="Hyperlink"/>
             <w:noProof/>
-            <w:webHidden/>
+            <w:cs/>
           </w:rPr>
           <w:fldChar w:fldCharType="end"/>
         </w:r>
@@ -462,17 +456,10 @@
           <w:tab w:val="right" w:leader="dot" w:pos="9868"/>
         </w:tabs>
         <w:rPr>
-          <w:rFonts w:asciiTheme="minorHAnsi" w:eastAsiaTheme="minorEastAsia" w:hAnsiTheme="minorHAnsi" w:cstheme="minorBidi"/>
           <w:noProof/>
-          <w:color w:val="auto"/>
-          <w:kern w:val="2"/>
-          <w:sz w:val="24"/>
-          <w:szCs w:val="30"/>
-          <w:lang w:bidi="th-TH"/>
-          <w14:ligatures w14:val="standardContextual"/>
         </w:rPr>
       </w:pPr>
-      <w:hyperlink w:anchor="_Toc241327379" w:history="1">
+      <w:hyperlink w:anchor="_Toc241349625" w:history="1">
         <w:r>
           <w:rPr>
             <w:rStyle w:val="Hyperlink"/>
@@ -489,8 +476,9 @@
         </w:r>
         <w:r>
           <w:rPr>
+            <w:rStyle w:val="Hyperlink"/>
             <w:noProof/>
-            <w:webHidden/>
+            <w:cs/>
           </w:rPr>
           <w:fldChar w:fldCharType="begin"/>
         </w:r>
@@ -499,18 +487,20 @@
             <w:noProof/>
             <w:webHidden/>
           </w:rPr>
-          <w:instrText xml:space="preserve"> PAGEREF _Toc241327379 \h </w:instrText>
+          <w:instrText xml:space="preserve"> PAGEREF _Toc241349625 \h </w:instrText>
         </w:r>
         <w:r>
           <w:rPr>
+            <w:rStyle w:val="Hyperlink"/>
             <w:noProof/>
-            <w:webHidden/>
+            <w:cs/>
           </w:rPr>
         </w:r>
         <w:r>
           <w:rPr>
+            <w:rStyle w:val="Hyperlink"/>
             <w:noProof/>
-            <w:webHidden/>
+            <w:cs/>
           </w:rPr>
           <w:fldChar w:fldCharType="separate"/>
         </w:r>
@@ -523,8 +513,9 @@
         </w:r>
         <w:r>
           <w:rPr>
+            <w:rStyle w:val="Hyperlink"/>
             <w:noProof/>
-            <w:webHidden/>
+            <w:cs/>
           </w:rPr>
           <w:fldChar w:fldCharType="end"/>
         </w:r>
@@ -537,17 +528,10 @@
           <w:tab w:val="right" w:leader="dot" w:pos="9868"/>
         </w:tabs>
         <w:rPr>
-          <w:rFonts w:asciiTheme="minorHAnsi" w:eastAsiaTheme="minorEastAsia" w:hAnsiTheme="minorHAnsi" w:cstheme="minorBidi"/>
           <w:noProof/>
-          <w:color w:val="auto"/>
-          <w:kern w:val="2"/>
-          <w:sz w:val="24"/>
-          <w:szCs w:val="30"/>
-          <w:lang w:bidi="th-TH"/>
-          <w14:ligatures w14:val="standardContextual"/>
         </w:rPr>
       </w:pPr>
-      <w:hyperlink w:anchor="_Toc241327380" w:history="1">
+      <w:hyperlink w:anchor="_Toc241349626" w:history="1">
         <w:r>
           <w:rPr>
             <w:rStyle w:val="Hyperlink"/>
@@ -564,8 +548,9 @@
         </w:r>
         <w:r>
           <w:rPr>
+            <w:rStyle w:val="Hyperlink"/>
             <w:noProof/>
-            <w:webHidden/>
+            <w:cs/>
           </w:rPr>
           <w:fldChar w:fldCharType="begin"/>
         </w:r>
@@ -574,18 +559,20 @@
             <w:noProof/>
             <w:webHidden/>
           </w:rPr>
-          <w:instrText xml:space="preserve"> PAGEREF _Toc241327380 \h </w:instrText>
+          <w:instrText xml:space="preserve"> PAGEREF _Toc241349626 \h </w:instrText>
         </w:r>
         <w:r>
           <w:rPr>
+            <w:rStyle w:val="Hyperlink"/>
             <w:noProof/>
-            <w:webHidden/>
+            <w:cs/>
           </w:rPr>
         </w:r>
         <w:r>
           <w:rPr>
+            <w:rStyle w:val="Hyperlink"/>
             <w:noProof/>
-            <w:webHidden/>
+            <w:cs/>
           </w:rPr>
           <w:fldChar w:fldCharType="separate"/>
         </w:r>
@@ -598,8 +585,9 @@
         </w:r>
         <w:r>
           <w:rPr>
+            <w:rStyle w:val="Hyperlink"/>
             <w:noProof/>
-            <w:webHidden/>
+            <w:cs/>
           </w:rPr>
           <w:fldChar w:fldCharType="end"/>
         </w:r>
@@ -612,17 +600,10 @@
           <w:tab w:val="right" w:leader="dot" w:pos="9868"/>
         </w:tabs>
         <w:rPr>
-          <w:rFonts w:asciiTheme="minorHAnsi" w:eastAsiaTheme="minorEastAsia" w:hAnsiTheme="minorHAnsi" w:cstheme="minorBidi"/>
           <w:noProof/>
-          <w:color w:val="auto"/>
-          <w:kern w:val="2"/>
-          <w:sz w:val="24"/>
-          <w:szCs w:val="30"/>
-          <w:lang w:bidi="th-TH"/>
-          <w14:ligatures w14:val="standardContextual"/>
         </w:rPr>
       </w:pPr>
-      <w:hyperlink w:anchor="_Toc241327381" w:history="1">
+      <w:hyperlink w:anchor="_Toc241349627" w:history="1">
         <w:r>
           <w:rPr>
             <w:rStyle w:val="Hyperlink"/>
@@ -639,8 +620,9 @@
         </w:r>
         <w:r>
           <w:rPr>
+            <w:rStyle w:val="Hyperlink"/>
             <w:noProof/>
-            <w:webHidden/>
+            <w:cs/>
           </w:rPr>
           <w:fldChar w:fldCharType="begin"/>
         </w:r>
@@ -649,18 +631,20 @@
             <w:noProof/>
             <w:webHidden/>
           </w:rPr>
-          <w:instrText xml:space="preserve"> PAGEREF _Toc241327381 \h </w:instrText>
+          <w:instrText xml:space="preserve"> PAGEREF _Toc241349627 \h </w:instrText>
         </w:r>
         <w:r>
           <w:rPr>
+            <w:rStyle w:val="Hyperlink"/>
             <w:noProof/>
-            <w:webHidden/>
+            <w:cs/>
           </w:rPr>
         </w:r>
         <w:r>
           <w:rPr>
+            <w:rStyle w:val="Hyperlink"/>
             <w:noProof/>
-            <w:webHidden/>
+            <w:cs/>
           </w:rPr>
           <w:fldChar w:fldCharType="separate"/>
         </w:r>
@@ -673,8 +657,9 @@
         </w:r>
         <w:r>
           <w:rPr>
+            <w:rStyle w:val="Hyperlink"/>
             <w:noProof/>
-            <w:webHidden/>
+            <w:cs/>
           </w:rPr>
           <w:fldChar w:fldCharType="end"/>
         </w:r>
@@ -687,17 +672,10 @@
           <w:tab w:val="right" w:leader="dot" w:pos="9868"/>
         </w:tabs>
         <w:rPr>
-          <w:rFonts w:asciiTheme="minorHAnsi" w:eastAsiaTheme="minorEastAsia" w:hAnsiTheme="minorHAnsi" w:cstheme="minorBidi"/>
           <w:noProof/>
-          <w:color w:val="auto"/>
-          <w:kern w:val="2"/>
-          <w:sz w:val="24"/>
-          <w:szCs w:val="30"/>
-          <w:lang w:bidi="th-TH"/>
-          <w14:ligatures w14:val="standardContextual"/>
         </w:rPr>
       </w:pPr>
-      <w:hyperlink w:anchor="_Toc241327382" w:history="1">
+      <w:hyperlink w:anchor="_Toc241349628" w:history="1">
         <w:r>
           <w:rPr>
             <w:rStyle w:val="Hyperlink"/>
@@ -714,8 +692,9 @@
         </w:r>
         <w:r>
           <w:rPr>
+            <w:rStyle w:val="Hyperlink"/>
             <w:noProof/>
-            <w:webHidden/>
+            <w:cs/>
           </w:rPr>
           <w:fldChar w:fldCharType="begin"/>
         </w:r>
@@ -724,18 +703,20 @@
             <w:noProof/>
             <w:webHidden/>
           </w:rPr>
-          <w:instrText xml:space="preserve"> PAGEREF _Toc241327382 \h </w:instrText>
+          <w:instrText xml:space="preserve"> PAGEREF _Toc241349628 \h </w:instrText>
         </w:r>
         <w:r>
           <w:rPr>
+            <w:rStyle w:val="Hyperlink"/>
             <w:noProof/>
-            <w:webHidden/>
+            <w:cs/>
           </w:rPr>
         </w:r>
         <w:r>
           <w:rPr>
+            <w:rStyle w:val="Hyperlink"/>
             <w:noProof/>
-            <w:webHidden/>
+            <w:cs/>
           </w:rPr>
           <w:fldChar w:fldCharType="separate"/>
         </w:r>
@@ -748,8 +729,9 @@
         </w:r>
         <w:r>
           <w:rPr>
+            <w:rStyle w:val="Hyperlink"/>
             <w:noProof/>
-            <w:webHidden/>
+            <w:cs/>
           </w:rPr>
           <w:fldChar w:fldCharType="end"/>
         </w:r>
@@ -762,17 +744,10 @@
           <w:tab w:val="right" w:leader="dot" w:pos="9868"/>
         </w:tabs>
         <w:rPr>
-          <w:rFonts w:asciiTheme="minorHAnsi" w:eastAsiaTheme="minorEastAsia" w:hAnsiTheme="minorHAnsi" w:cstheme="minorBidi"/>
           <w:noProof/>
-          <w:color w:val="auto"/>
-          <w:kern w:val="2"/>
-          <w:sz w:val="24"/>
-          <w:szCs w:val="30"/>
-          <w:lang w:bidi="th-TH"/>
-          <w14:ligatures w14:val="standardContextual"/>
         </w:rPr>
       </w:pPr>
-      <w:hyperlink w:anchor="_Toc241327383" w:history="1">
+      <w:hyperlink w:anchor="_Toc241349629" w:history="1">
         <w:r>
           <w:rPr>
             <w:rStyle w:val="Hyperlink"/>
@@ -789,8 +764,9 @@
         </w:r>
         <w:r>
           <w:rPr>
+            <w:rStyle w:val="Hyperlink"/>
             <w:noProof/>
-            <w:webHidden/>
+            <w:cs/>
           </w:rPr>
           <w:fldChar w:fldCharType="begin"/>
         </w:r>
@@ -799,18 +775,20 @@
             <w:noProof/>
             <w:webHidden/>
           </w:rPr>
-          <w:instrText xml:space="preserve"> PAGEREF _Toc241327383 \h </w:instrText>
+          <w:instrText xml:space="preserve"> PAGEREF _Toc241349629 \h </w:instrText>
         </w:r>
         <w:r>
           <w:rPr>
+            <w:rStyle w:val="Hyperlink"/>
             <w:noProof/>
-            <w:webHidden/>
+            <w:cs/>
           </w:rPr>
         </w:r>
         <w:r>
           <w:rPr>
+            <w:rStyle w:val="Hyperlink"/>
             <w:noProof/>
-            <w:webHidden/>
+            <w:cs/>
           </w:rPr>
           <w:fldChar w:fldCharType="separate"/>
         </w:r>
@@ -823,8 +801,9 @@
         </w:r>
         <w:r>
           <w:rPr>
+            <w:rStyle w:val="Hyperlink"/>
             <w:noProof/>
-            <w:webHidden/>
+            <w:cs/>
           </w:rPr>
           <w:fldChar w:fldCharType="end"/>
         </w:r>
@@ -837,17 +816,10 @@
           <w:tab w:val="right" w:leader="dot" w:pos="9868"/>
         </w:tabs>
         <w:rPr>
-          <w:rFonts w:asciiTheme="minorHAnsi" w:eastAsiaTheme="minorEastAsia" w:hAnsiTheme="minorHAnsi" w:cstheme="minorBidi"/>
           <w:noProof/>
-          <w:color w:val="auto"/>
-          <w:kern w:val="2"/>
-          <w:sz w:val="24"/>
-          <w:szCs w:val="30"/>
-          <w:lang w:bidi="th-TH"/>
-          <w14:ligatures w14:val="standardContextual"/>
         </w:rPr>
       </w:pPr>
-      <w:hyperlink w:anchor="_Toc241327384" w:history="1">
+      <w:hyperlink w:anchor="_Toc241349630" w:history="1">
         <w:r>
           <w:rPr>
             <w:rStyle w:val="Hyperlink"/>
@@ -864,8 +836,9 @@
         </w:r>
         <w:r>
           <w:rPr>
+            <w:rStyle w:val="Hyperlink"/>
             <w:noProof/>
-            <w:webHidden/>
+            <w:cs/>
           </w:rPr>
           <w:fldChar w:fldCharType="begin"/>
         </w:r>
@@ -874,18 +847,20 @@
             <w:noProof/>
             <w:webHidden/>
           </w:rPr>
-          <w:instrText xml:space="preserve"> PAGEREF _Toc241327384 \h </w:instrText>
+          <w:instrText xml:space="preserve"> PAGEREF _Toc241349630 \h </w:instrText>
         </w:r>
         <w:r>
           <w:rPr>
+            <w:rStyle w:val="Hyperlink"/>
             <w:noProof/>
-            <w:webHidden/>
+            <w:cs/>
           </w:rPr>
         </w:r>
         <w:r>
           <w:rPr>
+            <w:rStyle w:val="Hyperlink"/>
             <w:noProof/>
-            <w:webHidden/>
+            <w:cs/>
           </w:rPr>
           <w:fldChar w:fldCharType="separate"/>
         </w:r>
@@ -898,8 +873,9 @@
         </w:r>
         <w:r>
           <w:rPr>
+            <w:rStyle w:val="Hyperlink"/>
             <w:noProof/>
-            <w:webHidden/>
+            <w:cs/>
           </w:rPr>
           <w:fldChar w:fldCharType="end"/>
         </w:r>
@@ -912,17 +888,10 @@
           <w:tab w:val="right" w:leader="dot" w:pos="9868"/>
         </w:tabs>
         <w:rPr>
-          <w:rFonts w:asciiTheme="minorHAnsi" w:eastAsiaTheme="minorEastAsia" w:hAnsiTheme="minorHAnsi" w:cstheme="minorBidi"/>
           <w:noProof/>
-          <w:color w:val="auto"/>
-          <w:kern w:val="2"/>
-          <w:sz w:val="24"/>
-          <w:szCs w:val="30"/>
-          <w:lang w:bidi="th-TH"/>
-          <w14:ligatures w14:val="standardContextual"/>
         </w:rPr>
       </w:pPr>
-      <w:hyperlink w:anchor="_Toc241327385" w:history="1">
+      <w:hyperlink w:anchor="_Toc241349631" w:history="1">
         <w:r>
           <w:rPr>
             <w:rStyle w:val="Hyperlink"/>
@@ -939,8 +908,9 @@
         </w:r>
         <w:r>
           <w:rPr>
+            <w:rStyle w:val="Hyperlink"/>
             <w:noProof/>
-            <w:webHidden/>
+            <w:cs/>
           </w:rPr>
           <w:fldChar w:fldCharType="begin"/>
         </w:r>
@@ -949,18 +919,20 @@
             <w:noProof/>
             <w:webHidden/>
           </w:rPr>
-          <w:instrText xml:space="preserve"> PAGEREF _Toc241327385 \h </w:instrText>
+          <w:instrText xml:space="preserve"> PAGEREF _Toc241349631 \h </w:instrText>
         </w:r>
         <w:r>
           <w:rPr>
+            <w:rStyle w:val="Hyperlink"/>
             <w:noProof/>
-            <w:webHidden/>
+            <w:cs/>
           </w:rPr>
         </w:r>
         <w:r>
           <w:rPr>
+            <w:rStyle w:val="Hyperlink"/>
             <w:noProof/>
-            <w:webHidden/>
+            <w:cs/>
           </w:rPr>
           <w:fldChar w:fldCharType="separate"/>
         </w:r>
@@ -973,8 +945,9 @@
         </w:r>
         <w:r>
           <w:rPr>
+            <w:rStyle w:val="Hyperlink"/>
             <w:noProof/>
-            <w:webHidden/>
+            <w:cs/>
           </w:rPr>
           <w:fldChar w:fldCharType="end"/>
         </w:r>
@@ -987,17 +960,10 @@
           <w:tab w:val="right" w:leader="dot" w:pos="9868"/>
         </w:tabs>
         <w:rPr>
-          <w:rFonts w:asciiTheme="minorHAnsi" w:eastAsiaTheme="minorEastAsia" w:hAnsiTheme="minorHAnsi" w:cstheme="minorBidi"/>
           <w:noProof/>
-          <w:color w:val="auto"/>
-          <w:kern w:val="2"/>
-          <w:sz w:val="24"/>
-          <w:szCs w:val="30"/>
-          <w:lang w:bidi="th-TH"/>
-          <w14:ligatures w14:val="standardContextual"/>
         </w:rPr>
       </w:pPr>
-      <w:hyperlink w:anchor="_Toc241327386" w:history="1">
+      <w:hyperlink w:anchor="_Toc241349632" w:history="1">
         <w:r>
           <w:rPr>
             <w:rStyle w:val="Hyperlink"/>
@@ -1014,8 +980,9 @@
         </w:r>
         <w:r>
           <w:rPr>
+            <w:rStyle w:val="Hyperlink"/>
             <w:noProof/>
-            <w:webHidden/>
+            <w:cs/>
           </w:rPr>
           <w:fldChar w:fldCharType="begin"/>
         </w:r>
@@ -1024,18 +991,20 @@
             <w:noProof/>
             <w:webHidden/>
           </w:rPr>
-          <w:instrText xml:space="preserve"> PAGEREF _Toc241327386 \h </w:instrText>
+          <w:instrText xml:space="preserve"> PAGEREF _Toc241349632 \h </w:instrText>
         </w:r>
         <w:r>
           <w:rPr>
+            <w:rStyle w:val="Hyperlink"/>
             <w:noProof/>
-            <w:webHidden/>
+            <w:cs/>
           </w:rPr>
         </w:r>
         <w:r>
           <w:rPr>
+            <w:rStyle w:val="Hyperlink"/>
             <w:noProof/>
-            <w:webHidden/>
+            <w:cs/>
           </w:rPr>
           <w:fldChar w:fldCharType="separate"/>
         </w:r>
@@ -1048,8 +1017,9 @@
         </w:r>
         <w:r>
           <w:rPr>
+            <w:rStyle w:val="Hyperlink"/>
             <w:noProof/>
-            <w:webHidden/>
+            <w:cs/>
           </w:rPr>
           <w:fldChar w:fldCharType="end"/>
         </w:r>
@@ -1062,17 +1032,10 @@
           <w:tab w:val="right" w:leader="dot" w:pos="9868"/>
         </w:tabs>
         <w:rPr>
-          <w:rFonts w:asciiTheme="minorHAnsi" w:eastAsiaTheme="minorEastAsia" w:hAnsiTheme="minorHAnsi" w:cstheme="minorBidi"/>
           <w:noProof/>
-          <w:color w:val="auto"/>
-          <w:kern w:val="2"/>
-          <w:sz w:val="24"/>
-          <w:szCs w:val="30"/>
-          <w:lang w:bidi="th-TH"/>
-          <w14:ligatures w14:val="standardContextual"/>
         </w:rPr>
       </w:pPr>
-      <w:hyperlink w:anchor="_Toc241327387" w:history="1">
+      <w:hyperlink w:anchor="_Toc241349633" w:history="1">
         <w:r>
           <w:rPr>
             <w:rStyle w:val="Hyperlink"/>
@@ -1089,8 +1052,9 @@
         </w:r>
         <w:r>
           <w:rPr>
+            <w:rStyle w:val="Hyperlink"/>
             <w:noProof/>
-            <w:webHidden/>
+            <w:cs/>
           </w:rPr>
           <w:fldChar w:fldCharType="begin"/>
         </w:r>
@@ -1099,18 +1063,20 @@
             <w:noProof/>
             <w:webHidden/>
           </w:rPr>
-          <w:instrText xml:space="preserve"> PAGEREF _Toc241327387 \h </w:instrText>
+          <w:instrText xml:space="preserve"> PAGEREF _Toc241349633 \h </w:instrText>
         </w:r>
         <w:r>
           <w:rPr>
+            <w:rStyle w:val="Hyperlink"/>
             <w:noProof/>
-            <w:webHidden/>
+            <w:cs/>
           </w:rPr>
         </w:r>
         <w:r>
           <w:rPr>
+            <w:rStyle w:val="Hyperlink"/>
             <w:noProof/>
-            <w:webHidden/>
+            <w:cs/>
           </w:rPr>
           <w:fldChar w:fldCharType="separate"/>
         </w:r>
@@ -1123,8 +1089,9 @@
         </w:r>
         <w:r>
           <w:rPr>
+            <w:rStyle w:val="Hyperlink"/>
             <w:noProof/>
-            <w:webHidden/>
+            <w:cs/>
           </w:rPr>
           <w:fldChar w:fldCharType="end"/>
         </w:r>
@@ -1137,17 +1104,10 @@
           <w:tab w:val="right" w:leader="dot" w:pos="9868"/>
         </w:tabs>
         <w:rPr>
-          <w:rFonts w:asciiTheme="minorHAnsi" w:eastAsiaTheme="minorEastAsia" w:hAnsiTheme="minorHAnsi" w:cstheme="minorBidi"/>
           <w:noProof/>
-          <w:color w:val="auto"/>
-          <w:kern w:val="2"/>
-          <w:sz w:val="24"/>
-          <w:szCs w:val="30"/>
-          <w:lang w:bidi="th-TH"/>
-          <w14:ligatures w14:val="standardContextual"/>
         </w:rPr>
       </w:pPr>
-      <w:hyperlink w:anchor="_Toc241327388" w:history="1">
+      <w:hyperlink w:anchor="_Toc241349634" w:history="1">
         <w:r>
           <w:rPr>
             <w:rStyle w:val="Hyperlink"/>
@@ -1164,8 +1124,9 @@
         </w:r>
         <w:r>
           <w:rPr>
+            <w:rStyle w:val="Hyperlink"/>
             <w:noProof/>
-            <w:webHidden/>
+            <w:cs/>
           </w:rPr>
           <w:fldChar w:fldCharType="begin"/>
         </w:r>
@@ -1174,18 +1135,20 @@
             <w:noProof/>
             <w:webHidden/>
           </w:rPr>
-          <w:instrText xml:space="preserve"> PAGEREF _Toc241327388 \h </w:instrText>
+          <w:instrText xml:space="preserve"> PAGEREF _Toc241349634 \h </w:instrText>
         </w:r>
         <w:r>
           <w:rPr>
+            <w:rStyle w:val="Hyperlink"/>
             <w:noProof/>
-            <w:webHidden/>
+            <w:cs/>
           </w:rPr>
         </w:r>
         <w:r>
           <w:rPr>
+            <w:rStyle w:val="Hyperlink"/>
             <w:noProof/>
-            <w:webHidden/>
+            <w:cs/>
           </w:rPr>
           <w:fldChar w:fldCharType="separate"/>
         </w:r>
@@ -1198,8 +1161,9 @@
         </w:r>
         <w:r>
           <w:rPr>
+            <w:rStyle w:val="Hyperlink"/>
             <w:noProof/>
-            <w:webHidden/>
+            <w:cs/>
           </w:rPr>
           <w:fldChar w:fldCharType="end"/>
         </w:r>
@@ -1212,17 +1176,10 @@
           <w:tab w:val="right" w:leader="dot" w:pos="9868"/>
         </w:tabs>
         <w:rPr>
-          <w:rFonts w:asciiTheme="minorHAnsi" w:eastAsiaTheme="minorEastAsia" w:hAnsiTheme="minorHAnsi" w:cstheme="minorBidi"/>
           <w:noProof/>
-          <w:color w:val="auto"/>
-          <w:kern w:val="2"/>
-          <w:sz w:val="24"/>
-          <w:szCs w:val="30"/>
-          <w:lang w:bidi="th-TH"/>
-          <w14:ligatures w14:val="standardContextual"/>
         </w:rPr>
       </w:pPr>
-      <w:hyperlink w:anchor="_Toc241327389" w:history="1">
+      <w:hyperlink w:anchor="_Toc241349635" w:history="1">
         <w:r>
           <w:rPr>
             <w:rStyle w:val="Hyperlink"/>
@@ -1239,8 +1196,9 @@
         </w:r>
         <w:r>
           <w:rPr>
+            <w:rStyle w:val="Hyperlink"/>
             <w:noProof/>
-            <w:webHidden/>
+            <w:cs/>
           </w:rPr>
           <w:fldChar w:fldCharType="begin"/>
         </w:r>
@@ -1249,18 +1207,20 @@
             <w:noProof/>
             <w:webHidden/>
           </w:rPr>
-          <w:instrText xml:space="preserve"> PAGEREF _Toc241327389 \h </w:instrText>
+          <w:instrText xml:space="preserve"> PAGEREF _Toc241349635 \h </w:instrText>
         </w:r>
         <w:r>
           <w:rPr>
+            <w:rStyle w:val="Hyperlink"/>
             <w:noProof/>
-            <w:webHidden/>
+            <w:cs/>
           </w:rPr>
         </w:r>
         <w:r>
           <w:rPr>
+            <w:rStyle w:val="Hyperlink"/>
             <w:noProof/>
-            <w:webHidden/>
+            <w:cs/>
           </w:rPr>
           <w:fldChar w:fldCharType="separate"/>
         </w:r>
@@ -1273,8 +1233,9 @@
         </w:r>
         <w:r>
           <w:rPr>
+            <w:rStyle w:val="Hyperlink"/>
             <w:noProof/>
-            <w:webHidden/>
+            <w:cs/>
           </w:rPr>
           <w:fldChar w:fldCharType="end"/>
         </w:r>
@@ -1287,17 +1248,10 @@
           <w:tab w:val="right" w:leader="dot" w:pos="9868"/>
         </w:tabs>
         <w:rPr>
-          <w:rFonts w:asciiTheme="minorHAnsi" w:eastAsiaTheme="minorEastAsia" w:hAnsiTheme="minorHAnsi" w:cstheme="minorBidi"/>
           <w:noProof/>
-          <w:color w:val="auto"/>
-          <w:kern w:val="2"/>
-          <w:sz w:val="24"/>
-          <w:szCs w:val="30"/>
-          <w:lang w:bidi="th-TH"/>
-          <w14:ligatures w14:val="standardContextual"/>
         </w:rPr>
       </w:pPr>
-      <w:hyperlink w:anchor="_Toc241327390" w:history="1">
+      <w:hyperlink w:anchor="_Toc241349636" w:history="1">
         <w:r>
           <w:rPr>
             <w:rStyle w:val="Hyperlink"/>
@@ -1314,8 +1268,9 @@
         </w:r>
         <w:r>
           <w:rPr>
+            <w:rStyle w:val="Hyperlink"/>
             <w:noProof/>
-            <w:webHidden/>
+            <w:cs/>
           </w:rPr>
           <w:fldChar w:fldCharType="begin"/>
         </w:r>
@@ -1324,18 +1279,20 @@
             <w:noProof/>
             <w:webHidden/>
           </w:rPr>
-          <w:instrText xml:space="preserve"> PAGEREF _Toc241327390 \h </w:instrText>
+          <w:instrText xml:space="preserve"> PAGEREF _Toc241349636 \h </w:instrText>
         </w:r>
         <w:r>
           <w:rPr>
+            <w:rStyle w:val="Hyperlink"/>
             <w:noProof/>
-            <w:webHidden/>
+            <w:cs/>
           </w:rPr>
         </w:r>
         <w:r>
           <w:rPr>
+            <w:rStyle w:val="Hyperlink"/>
             <w:noProof/>
-            <w:webHidden/>
+            <w:cs/>
           </w:rPr>
           <w:fldChar w:fldCharType="separate"/>
         </w:r>
@@ -1348,8 +1305,9 @@
         </w:r>
         <w:r>
           <w:rPr>
+            <w:rStyle w:val="Hyperlink"/>
             <w:noProof/>
-            <w:webHidden/>
+            <w:cs/>
           </w:rPr>
           <w:fldChar w:fldCharType="end"/>
         </w:r>
@@ -1369,11 +1327,971 @@
       <w:pPr>
         <w:pStyle w:val="Heading1"/>
       </w:pPr>
-      <w:bookmarkStart w:id="2" w:name="_Toc241327379"/>
+      <w:bookmarkStart w:id="2" w:name="_Toc241349625"/>
       <w:r>
         <w:t>สารบัญตาราง</w:t>
       </w:r>
       <w:bookmarkEnd w:id="2"/>
+    </w:p>
+    <w:p>
+      <w:pPr>
+        <w:pStyle w:val="TableofFigures"/>
+        <w:tabs>
+          <w:tab w:val="right" w:leader="dot" w:pos="9868"/>
+        </w:tabs>
+        <w:rPr>
+          <w:noProof/>
+        </w:rPr>
+      </w:pPr>
+      <w:r>
+        <w:fldChar w:fldCharType="begin"/>
+      </w:r>
+      <w:r>
+        <w:instrText xml:space="preserve"> TOC \h \z \c "Table" </w:instrText>
+      </w:r>
+      <w:r>
+        <w:fldChar w:fldCharType="separate"/>
+      </w:r>
+      <w:hyperlink w:anchor="_Toc241349637" w:history="1">
+        <w:r>
+          <w:rPr>
+            <w:rStyle w:val="Hyperlink"/>
+            <w:noProof/>
+          </w:rPr>
+          <w:t>ตารางที่ 1  คำถามวิจัยและหลักฐานที่ใช้ตอบ</w:t>
+        </w:r>
+        <w:r>
+          <w:rPr>
+            <w:noProof/>
+            <w:webHidden/>
+          </w:rPr>
+          <w:tab/>
+        </w:r>
+        <w:r>
+          <w:rPr>
+            <w:rStyle w:val="Hyperlink"/>
+            <w:noProof/>
+            <w:cs/>
+          </w:rPr>
+          <w:fldChar w:fldCharType="begin"/>
+        </w:r>
+        <w:r>
+          <w:rPr>
+            <w:noProof/>
+            <w:webHidden/>
+          </w:rPr>
+          <w:instrText xml:space="preserve"> PAGEREF _Toc241349637 \h </w:instrText>
+        </w:r>
+        <w:r>
+          <w:rPr>
+            <w:rStyle w:val="Hyperlink"/>
+            <w:noProof/>
+            <w:cs/>
+          </w:rPr>
+        </w:r>
+        <w:r>
+          <w:rPr>
+            <w:rStyle w:val="Hyperlink"/>
+            <w:noProof/>
+            <w:cs/>
+          </w:rPr>
+          <w:fldChar w:fldCharType="separate"/>
+        </w:r>
+        <w:r>
+          <w:rPr>
+            <w:noProof/>
+            <w:webHidden/>
+          </w:rPr>
+          <w:t>5</w:t>
+        </w:r>
+        <w:r>
+          <w:rPr>
+            <w:rStyle w:val="Hyperlink"/>
+            <w:noProof/>
+            <w:cs/>
+          </w:rPr>
+          <w:fldChar w:fldCharType="end"/>
+        </w:r>
+      </w:hyperlink>
+    </w:p>
+    <w:p>
+      <w:pPr>
+        <w:pStyle w:val="TableofFigures"/>
+        <w:tabs>
+          <w:tab w:val="right" w:leader="dot" w:pos="9868"/>
+        </w:tabs>
+        <w:rPr>
+          <w:noProof/>
+        </w:rPr>
+      </w:pPr>
+      <w:hyperlink w:anchor="_Toc241349638" w:history="1">
+        <w:r>
+          <w:rPr>
+            <w:rStyle w:val="Hyperlink"/>
+            <w:noProof/>
+          </w:rPr>
+          <w:t>ตารางที่ 2  วิธีสร้าง suite ที่นำมาประเมิน</w:t>
+        </w:r>
+        <w:r>
+          <w:rPr>
+            <w:noProof/>
+            <w:webHidden/>
+          </w:rPr>
+          <w:tab/>
+        </w:r>
+        <w:r>
+          <w:rPr>
+            <w:rStyle w:val="Hyperlink"/>
+            <w:noProof/>
+            <w:cs/>
+          </w:rPr>
+          <w:fldChar w:fldCharType="begin"/>
+        </w:r>
+        <w:r>
+          <w:rPr>
+            <w:noProof/>
+            <w:webHidden/>
+          </w:rPr>
+          <w:instrText xml:space="preserve"> PAGEREF _Toc241349638 \h </w:instrText>
+        </w:r>
+        <w:r>
+          <w:rPr>
+            <w:rStyle w:val="Hyperlink"/>
+            <w:noProof/>
+            <w:cs/>
+          </w:rPr>
+        </w:r>
+        <w:r>
+          <w:rPr>
+            <w:rStyle w:val="Hyperlink"/>
+            <w:noProof/>
+            <w:cs/>
+          </w:rPr>
+          <w:fldChar w:fldCharType="separate"/>
+        </w:r>
+        <w:r>
+          <w:rPr>
+            <w:noProof/>
+            <w:webHidden/>
+          </w:rPr>
+          <w:t>6</w:t>
+        </w:r>
+        <w:r>
+          <w:rPr>
+            <w:rStyle w:val="Hyperlink"/>
+            <w:noProof/>
+            <w:cs/>
+          </w:rPr>
+          <w:fldChar w:fldCharType="end"/>
+        </w:r>
+      </w:hyperlink>
+    </w:p>
+    <w:p>
+      <w:pPr>
+        <w:pStyle w:val="TableofFigures"/>
+        <w:tabs>
+          <w:tab w:val="right" w:leader="dot" w:pos="9868"/>
+        </w:tabs>
+        <w:rPr>
+          <w:noProof/>
+        </w:rPr>
+      </w:pPr>
+      <w:hyperlink w:anchor="_Toc241349639" w:history="1">
+        <w:r>
+          <w:rPr>
+            <w:rStyle w:val="Hyperlink"/>
+            <w:noProof/>
+          </w:rPr>
+          <w:t>ตารางที่ 3  สภาพแวดล้อมการประเมิน</w:t>
+        </w:r>
+        <w:r>
+          <w:rPr>
+            <w:noProof/>
+            <w:webHidden/>
+          </w:rPr>
+          <w:tab/>
+        </w:r>
+        <w:r>
+          <w:rPr>
+            <w:rStyle w:val="Hyperlink"/>
+            <w:noProof/>
+            <w:cs/>
+          </w:rPr>
+          <w:fldChar w:fldCharType="begin"/>
+        </w:r>
+        <w:r>
+          <w:rPr>
+            <w:noProof/>
+            <w:webHidden/>
+          </w:rPr>
+          <w:instrText xml:space="preserve"> PAGEREF _Toc241349639 \h </w:instrText>
+        </w:r>
+        <w:r>
+          <w:rPr>
+            <w:rStyle w:val="Hyperlink"/>
+            <w:noProof/>
+            <w:cs/>
+          </w:rPr>
+        </w:r>
+        <w:r>
+          <w:rPr>
+            <w:rStyle w:val="Hyperlink"/>
+            <w:noProof/>
+            <w:cs/>
+          </w:rPr>
+          <w:fldChar w:fldCharType="separate"/>
+        </w:r>
+        <w:r>
+          <w:rPr>
+            <w:noProof/>
+            <w:webHidden/>
+          </w:rPr>
+          <w:t>7</w:t>
+        </w:r>
+        <w:r>
+          <w:rPr>
+            <w:rStyle w:val="Hyperlink"/>
+            <w:noProof/>
+            <w:cs/>
+          </w:rPr>
+          <w:fldChar w:fldCharType="end"/>
+        </w:r>
+      </w:hyperlink>
+    </w:p>
+    <w:p>
+      <w:pPr>
+        <w:pStyle w:val="TableofFigures"/>
+        <w:tabs>
+          <w:tab w:val="right" w:leader="dot" w:pos="9868"/>
+        </w:tabs>
+        <w:rPr>
+          <w:noProof/>
+        </w:rPr>
+      </w:pPr>
+      <w:hyperlink w:anchor="_Toc241349640" w:history="1">
+        <w:r>
+          <w:rPr>
+            <w:rStyle w:val="Hyperlink"/>
+            <w:noProof/>
+          </w:rPr>
+          <w:t>ตารางที่ 4  นิยามสถานะผลการประเมิน</w:t>
+        </w:r>
+        <w:r>
+          <w:rPr>
+            <w:noProof/>
+            <w:webHidden/>
+          </w:rPr>
+          <w:tab/>
+        </w:r>
+        <w:r>
+          <w:rPr>
+            <w:rStyle w:val="Hyperlink"/>
+            <w:noProof/>
+            <w:cs/>
+          </w:rPr>
+          <w:fldChar w:fldCharType="begin"/>
+        </w:r>
+        <w:r>
+          <w:rPr>
+            <w:noProof/>
+            <w:webHidden/>
+          </w:rPr>
+          <w:instrText xml:space="preserve"> PAGEREF _Toc241349640 \h </w:instrText>
+        </w:r>
+        <w:r>
+          <w:rPr>
+            <w:rStyle w:val="Hyperlink"/>
+            <w:noProof/>
+            <w:cs/>
+          </w:rPr>
+        </w:r>
+        <w:r>
+          <w:rPr>
+            <w:rStyle w:val="Hyperlink"/>
+            <w:noProof/>
+            <w:cs/>
+          </w:rPr>
+          <w:fldChar w:fldCharType="separate"/>
+        </w:r>
+        <w:r>
+          <w:rPr>
+            <w:noProof/>
+            <w:webHidden/>
+          </w:rPr>
+          <w:t>7</w:t>
+        </w:r>
+        <w:r>
+          <w:rPr>
+            <w:rStyle w:val="Hyperlink"/>
+            <w:noProof/>
+            <w:cs/>
+          </w:rPr>
+          <w:fldChar w:fldCharType="end"/>
+        </w:r>
+      </w:hyperlink>
+    </w:p>
+    <w:p>
+      <w:pPr>
+        <w:pStyle w:val="TableofFigures"/>
+        <w:tabs>
+          <w:tab w:val="right" w:leader="dot" w:pos="9868"/>
+        </w:tabs>
+        <w:rPr>
+          <w:noProof/>
+        </w:rPr>
+      </w:pPr>
+      <w:hyperlink w:anchor="_Toc241349641" w:history="1">
+        <w:r>
+          <w:rPr>
+            <w:rStyle w:val="Hyperlink"/>
+            <w:noProof/>
+          </w:rPr>
+          <w:t>ตารางที่ 5  สถานะและ fault detection ต่อเทคนิค; FDR ต่อ suite รวม compile/flaky ในตัวหาร</w:t>
+        </w:r>
+        <w:r>
+          <w:rPr>
+            <w:noProof/>
+            <w:webHidden/>
+          </w:rPr>
+          <w:tab/>
+        </w:r>
+        <w:r>
+          <w:rPr>
+            <w:rStyle w:val="Hyperlink"/>
+            <w:noProof/>
+            <w:cs/>
+          </w:rPr>
+          <w:fldChar w:fldCharType="begin"/>
+        </w:r>
+        <w:r>
+          <w:rPr>
+            <w:noProof/>
+            <w:webHidden/>
+          </w:rPr>
+          <w:instrText xml:space="preserve"> PAGEREF _Toc241349641 \h </w:instrText>
+        </w:r>
+        <w:r>
+          <w:rPr>
+            <w:rStyle w:val="Hyperlink"/>
+            <w:noProof/>
+            <w:cs/>
+          </w:rPr>
+        </w:r>
+        <w:r>
+          <w:rPr>
+            <w:rStyle w:val="Hyperlink"/>
+            <w:noProof/>
+            <w:cs/>
+          </w:rPr>
+          <w:fldChar w:fldCharType="separate"/>
+        </w:r>
+        <w:r>
+          <w:rPr>
+            <w:noProof/>
+            <w:webHidden/>
+          </w:rPr>
+          <w:t>8</w:t>
+        </w:r>
+        <w:r>
+          <w:rPr>
+            <w:rStyle w:val="Hyperlink"/>
+            <w:noProof/>
+            <w:cs/>
+          </w:rPr>
+          <w:fldChar w:fldCharType="end"/>
+        </w:r>
+      </w:hyperlink>
+    </w:p>
+    <w:p>
+      <w:pPr>
+        <w:pStyle w:val="TableofFigures"/>
+        <w:tabs>
+          <w:tab w:val="right" w:leader="dot" w:pos="9868"/>
+        </w:tabs>
+        <w:rPr>
+          <w:noProof/>
+        </w:rPr>
+      </w:pPr>
+      <w:hyperlink w:anchor="_Toc241349642" w:history="1">
+        <w:r>
+          <w:rPr>
+            <w:rStyle w:val="Hyperlink"/>
+            <w:noProof/>
+          </w:rPr>
+          <w:t>ตารางที่ 6  Coverage ของ modified target classes ที่มีค่าการวัด</w:t>
+        </w:r>
+        <w:r>
+          <w:rPr>
+            <w:noProof/>
+            <w:webHidden/>
+          </w:rPr>
+          <w:tab/>
+        </w:r>
+        <w:r>
+          <w:rPr>
+            <w:rStyle w:val="Hyperlink"/>
+            <w:noProof/>
+            <w:cs/>
+          </w:rPr>
+          <w:fldChar w:fldCharType="begin"/>
+        </w:r>
+        <w:r>
+          <w:rPr>
+            <w:noProof/>
+            <w:webHidden/>
+          </w:rPr>
+          <w:instrText xml:space="preserve"> PAGEREF _Toc241349642 \h </w:instrText>
+        </w:r>
+        <w:r>
+          <w:rPr>
+            <w:rStyle w:val="Hyperlink"/>
+            <w:noProof/>
+            <w:cs/>
+          </w:rPr>
+        </w:r>
+        <w:r>
+          <w:rPr>
+            <w:rStyle w:val="Hyperlink"/>
+            <w:noProof/>
+            <w:cs/>
+          </w:rPr>
+          <w:fldChar w:fldCharType="separate"/>
+        </w:r>
+        <w:r>
+          <w:rPr>
+            <w:noProof/>
+            <w:webHidden/>
+          </w:rPr>
+          <w:t>9</w:t>
+        </w:r>
+        <w:r>
+          <w:rPr>
+            <w:rStyle w:val="Hyperlink"/>
+            <w:noProof/>
+            <w:cs/>
+          </w:rPr>
+          <w:fldChar w:fldCharType="end"/>
+        </w:r>
+      </w:hyperlink>
+    </w:p>
+    <w:p>
+      <w:pPr>
+        <w:pStyle w:val="TableofFigures"/>
+        <w:tabs>
+          <w:tab w:val="right" w:leader="dot" w:pos="9868"/>
+        </w:tabs>
+        <w:rPr>
+          <w:noProof/>
+        </w:rPr>
+      </w:pPr>
+      <w:hyperlink w:anchor="_Toc241349643" w:history="1">
+        <w:r>
+          <w:rPr>
+            <w:rStyle w:val="Hyperlink"/>
+            <w:noProof/>
+          </w:rPr>
+          <w:t>ตารางที่ 7  ผล Wilcoxon signed-rank สำหรับ line coverage ที่วัดได้</w:t>
+        </w:r>
+        <w:r>
+          <w:rPr>
+            <w:noProof/>
+            <w:webHidden/>
+          </w:rPr>
+          <w:tab/>
+        </w:r>
+        <w:r>
+          <w:rPr>
+            <w:rStyle w:val="Hyperlink"/>
+            <w:noProof/>
+            <w:cs/>
+          </w:rPr>
+          <w:fldChar w:fldCharType="begin"/>
+        </w:r>
+        <w:r>
+          <w:rPr>
+            <w:noProof/>
+            <w:webHidden/>
+          </w:rPr>
+          <w:instrText xml:space="preserve"> PAGEREF _Toc241349643 \h </w:instrText>
+        </w:r>
+        <w:r>
+          <w:rPr>
+            <w:rStyle w:val="Hyperlink"/>
+            <w:noProof/>
+            <w:cs/>
+          </w:rPr>
+        </w:r>
+        <w:r>
+          <w:rPr>
+            <w:rStyle w:val="Hyperlink"/>
+            <w:noProof/>
+            <w:cs/>
+          </w:rPr>
+          <w:fldChar w:fldCharType="separate"/>
+        </w:r>
+        <w:r>
+          <w:rPr>
+            <w:noProof/>
+            <w:webHidden/>
+          </w:rPr>
+          <w:t>9</w:t>
+        </w:r>
+        <w:r>
+          <w:rPr>
+            <w:rStyle w:val="Hyperlink"/>
+            <w:noProof/>
+            <w:cs/>
+          </w:rPr>
+          <w:fldChar w:fldCharType="end"/>
+        </w:r>
+      </w:hyperlink>
+    </w:p>
+    <w:p>
+      <w:pPr>
+        <w:pStyle w:val="TableofFigures"/>
+        <w:tabs>
+          <w:tab w:val="right" w:leader="dot" w:pos="9868"/>
+        </w:tabs>
+        <w:rPr>
+          <w:noProof/>
+        </w:rPr>
+      </w:pPr>
+      <w:hyperlink w:anchor="_Toc241349644" w:history="1">
+        <w:r>
+          <w:rPr>
+            <w:rStyle w:val="Hyperlink"/>
+            <w:noProof/>
+          </w:rPr>
+          <w:t>ตารางที่ 8  จำนวนการตรวจพบทั้งหมดและการมีส่วนร่วมที่ไม่ซ้ำ</w:t>
+        </w:r>
+        <w:r>
+          <w:rPr>
+            <w:noProof/>
+            <w:webHidden/>
+          </w:rPr>
+          <w:tab/>
+        </w:r>
+        <w:r>
+          <w:rPr>
+            <w:rStyle w:val="Hyperlink"/>
+            <w:noProof/>
+            <w:cs/>
+          </w:rPr>
+          <w:fldChar w:fldCharType="begin"/>
+        </w:r>
+        <w:r>
+          <w:rPr>
+            <w:noProof/>
+            <w:webHidden/>
+          </w:rPr>
+          <w:instrText xml:space="preserve"> PAGEREF _Toc241349644 \h </w:instrText>
+        </w:r>
+        <w:r>
+          <w:rPr>
+            <w:rStyle w:val="Hyperlink"/>
+            <w:noProof/>
+            <w:cs/>
+          </w:rPr>
+        </w:r>
+        <w:r>
+          <w:rPr>
+            <w:rStyle w:val="Hyperlink"/>
+            <w:noProof/>
+            <w:cs/>
+          </w:rPr>
+          <w:fldChar w:fldCharType="separate"/>
+        </w:r>
+        <w:r>
+          <w:rPr>
+            <w:noProof/>
+            <w:webHidden/>
+          </w:rPr>
+          <w:t>10</w:t>
+        </w:r>
+        <w:r>
+          <w:rPr>
+            <w:rStyle w:val="Hyperlink"/>
+            <w:noProof/>
+            <w:cs/>
+          </w:rPr>
+          <w:fldChar w:fldCharType="end"/>
+        </w:r>
+      </w:hyperlink>
+    </w:p>
+    <w:p>
+      <w:pPr>
+        <w:pStyle w:val="TableofFigures"/>
+        <w:tabs>
+          <w:tab w:val="right" w:leader="dot" w:pos="9868"/>
+        </w:tabs>
+        <w:rPr>
+          <w:noProof/>
+        </w:rPr>
+      </w:pPr>
+      <w:hyperlink w:anchor="_Toc241349645" w:history="1">
+        <w:r>
+          <w:rPr>
+            <w:rStyle w:val="Hyperlink"/>
+            <w:noProof/>
+          </w:rPr>
+          <w:t>ตารางที่ 9  ข้อมูลการสร้าง MIO suite แยกตาม budget</w:t>
+        </w:r>
+        <w:r>
+          <w:rPr>
+            <w:noProof/>
+            <w:webHidden/>
+          </w:rPr>
+          <w:tab/>
+        </w:r>
+        <w:r>
+          <w:rPr>
+            <w:rStyle w:val="Hyperlink"/>
+            <w:noProof/>
+            <w:cs/>
+          </w:rPr>
+          <w:fldChar w:fldCharType="begin"/>
+        </w:r>
+        <w:r>
+          <w:rPr>
+            <w:noProof/>
+            <w:webHidden/>
+          </w:rPr>
+          <w:instrText xml:space="preserve"> PAGEREF _Toc241349645 \h </w:instrText>
+        </w:r>
+        <w:r>
+          <w:rPr>
+            <w:rStyle w:val="Hyperlink"/>
+            <w:noProof/>
+            <w:cs/>
+          </w:rPr>
+        </w:r>
+        <w:r>
+          <w:rPr>
+            <w:rStyle w:val="Hyperlink"/>
+            <w:noProof/>
+            <w:cs/>
+          </w:rPr>
+          <w:fldChar w:fldCharType="separate"/>
+        </w:r>
+        <w:r>
+          <w:rPr>
+            <w:noProof/>
+            <w:webHidden/>
+          </w:rPr>
+          <w:t>11</w:t>
+        </w:r>
+        <w:r>
+          <w:rPr>
+            <w:rStyle w:val="Hyperlink"/>
+            <w:noProof/>
+            <w:cs/>
+          </w:rPr>
+          <w:fldChar w:fldCharType="end"/>
+        </w:r>
+      </w:hyperlink>
+    </w:p>
+    <w:p>
+      <w:pPr>
+        <w:pStyle w:val="TableofFigures"/>
+        <w:tabs>
+          <w:tab w:val="right" w:leader="dot" w:pos="9868"/>
+        </w:tabs>
+        <w:rPr>
+          <w:noProof/>
+        </w:rPr>
+      </w:pPr>
+      <w:hyperlink w:anchor="_Toc241349646" w:history="1">
+        <w:r>
+          <w:rPr>
+            <w:rStyle w:val="Hyperlink"/>
+            <w:noProof/>
+          </w:rPr>
+          <w:t>ตารางที่ 10  สถิติจาก log การสร้างชุดทดสอบ AI</w:t>
+        </w:r>
+        <w:r>
+          <w:rPr>
+            <w:noProof/>
+            <w:webHidden/>
+          </w:rPr>
+          <w:tab/>
+        </w:r>
+        <w:r>
+          <w:rPr>
+            <w:rStyle w:val="Hyperlink"/>
+            <w:noProof/>
+            <w:cs/>
+          </w:rPr>
+          <w:fldChar w:fldCharType="begin"/>
+        </w:r>
+        <w:r>
+          <w:rPr>
+            <w:noProof/>
+            <w:webHidden/>
+          </w:rPr>
+          <w:instrText xml:space="preserve"> PAGEREF _Toc241349646 \h </w:instrText>
+        </w:r>
+        <w:r>
+          <w:rPr>
+            <w:rStyle w:val="Hyperlink"/>
+            <w:noProof/>
+            <w:cs/>
+          </w:rPr>
+        </w:r>
+        <w:r>
+          <w:rPr>
+            <w:rStyle w:val="Hyperlink"/>
+            <w:noProof/>
+            <w:cs/>
+          </w:rPr>
+          <w:fldChar w:fldCharType="separate"/>
+        </w:r>
+        <w:r>
+          <w:rPr>
+            <w:noProof/>
+            <w:webHidden/>
+          </w:rPr>
+          <w:t>11</w:t>
+        </w:r>
+        <w:r>
+          <w:rPr>
+            <w:rStyle w:val="Hyperlink"/>
+            <w:noProof/>
+            <w:cs/>
+          </w:rPr>
+          <w:fldChar w:fldCharType="end"/>
+        </w:r>
+      </w:hyperlink>
+    </w:p>
+    <w:p>
+      <w:pPr>
+        <w:pStyle w:val="TableofFigures"/>
+        <w:tabs>
+          <w:tab w:val="right" w:leader="dot" w:pos="9868"/>
+        </w:tabs>
+        <w:rPr>
+          <w:noProof/>
+        </w:rPr>
+      </w:pPr>
+      <w:hyperlink w:anchor="_Toc241349647" w:history="1">
+        <w:r>
+          <w:rPr>
+            <w:rStyle w:val="Hyperlink"/>
+            <w:noProof/>
+          </w:rPr>
+          <w:t>ตารางที่ 11  ไฟล์หลักสำหรับตรวจสอบและทำซ้ำ</w:t>
+        </w:r>
+        <w:r>
+          <w:rPr>
+            <w:noProof/>
+            <w:webHidden/>
+          </w:rPr>
+          <w:tab/>
+        </w:r>
+        <w:r>
+          <w:rPr>
+            <w:rStyle w:val="Hyperlink"/>
+            <w:noProof/>
+            <w:cs/>
+          </w:rPr>
+          <w:fldChar w:fldCharType="begin"/>
+        </w:r>
+        <w:r>
+          <w:rPr>
+            <w:noProof/>
+            <w:webHidden/>
+          </w:rPr>
+          <w:instrText xml:space="preserve"> PAGEREF _Toc241349647 \h </w:instrText>
+        </w:r>
+        <w:r>
+          <w:rPr>
+            <w:rStyle w:val="Hyperlink"/>
+            <w:noProof/>
+            <w:cs/>
+          </w:rPr>
+        </w:r>
+        <w:r>
+          <w:rPr>
+            <w:rStyle w:val="Hyperlink"/>
+            <w:noProof/>
+            <w:cs/>
+          </w:rPr>
+          <w:fldChar w:fldCharType="separate"/>
+        </w:r>
+        <w:r>
+          <w:rPr>
+            <w:noProof/>
+            <w:webHidden/>
+          </w:rPr>
+          <w:t>15</w:t>
+        </w:r>
+        <w:r>
+          <w:rPr>
+            <w:rStyle w:val="Hyperlink"/>
+            <w:noProof/>
+            <w:cs/>
+          </w:rPr>
+          <w:fldChar w:fldCharType="end"/>
+        </w:r>
+      </w:hyperlink>
+    </w:p>
+    <w:p>
+      <w:pPr>
+        <w:pStyle w:val="TableofFigures"/>
+        <w:tabs>
+          <w:tab w:val="right" w:leader="dot" w:pos="9868"/>
+        </w:tabs>
+        <w:rPr>
+          <w:noProof/>
+        </w:rPr>
+      </w:pPr>
+      <w:hyperlink w:anchor="_Toc241349648" w:history="1">
+        <w:r>
+          <w:rPr>
+            <w:rStyle w:val="Hyperlink"/>
+            <w:noProof/>
+          </w:rPr>
+          <w:t>ตารางที่ 12  ตัวอย่าง BUG_DETECTED ที่ตรวจ buggy/fixed และ provenance แล้ว</w:t>
+        </w:r>
+        <w:r>
+          <w:rPr>
+            <w:noProof/>
+            <w:webHidden/>
+          </w:rPr>
+          <w:tab/>
+        </w:r>
+        <w:r>
+          <w:rPr>
+            <w:rStyle w:val="Hyperlink"/>
+            <w:noProof/>
+            <w:cs/>
+          </w:rPr>
+          <w:fldChar w:fldCharType="begin"/>
+        </w:r>
+        <w:r>
+          <w:rPr>
+            <w:noProof/>
+            <w:webHidden/>
+          </w:rPr>
+          <w:instrText xml:space="preserve"> PAGEREF _Toc241349648 \h </w:instrText>
+        </w:r>
+        <w:r>
+          <w:rPr>
+            <w:rStyle w:val="Hyperlink"/>
+            <w:noProof/>
+            <w:cs/>
+          </w:rPr>
+        </w:r>
+        <w:r>
+          <w:rPr>
+            <w:rStyle w:val="Hyperlink"/>
+            <w:noProof/>
+            <w:cs/>
+          </w:rPr>
+          <w:fldChar w:fldCharType="separate"/>
+        </w:r>
+        <w:r>
+          <w:rPr>
+            <w:noProof/>
+            <w:webHidden/>
+          </w:rPr>
+          <w:t>15</w:t>
+        </w:r>
+        <w:r>
+          <w:rPr>
+            <w:rStyle w:val="Hyperlink"/>
+            <w:noProof/>
+            <w:cs/>
+          </w:rPr>
+          <w:fldChar w:fldCharType="end"/>
+        </w:r>
+      </w:hyperlink>
+    </w:p>
+    <w:p>
+      <w:pPr>
+        <w:pStyle w:val="TableofFigures"/>
+        <w:tabs>
+          <w:tab w:val="right" w:leader="dot" w:pos="9868"/>
+        </w:tabs>
+        <w:rPr>
+          <w:noProof/>
+        </w:rPr>
+      </w:pPr>
+      <w:hyperlink w:anchor="_Toc241349649" w:history="1">
+        <w:r>
+          <w:rPr>
+            <w:rStyle w:val="Hyperlink"/>
+            <w:noProof/>
+          </w:rPr>
+          <w:t>ตารางที่ 13  ความหมายฟิลด์สำหรับตรวจย้อนกลับ</w:t>
+        </w:r>
+        <w:r>
+          <w:rPr>
+            <w:noProof/>
+            <w:webHidden/>
+          </w:rPr>
+          <w:tab/>
+        </w:r>
+        <w:r>
+          <w:rPr>
+            <w:rStyle w:val="Hyperlink"/>
+            <w:noProof/>
+            <w:cs/>
+          </w:rPr>
+          <w:fldChar w:fldCharType="begin"/>
+        </w:r>
+        <w:r>
+          <w:rPr>
+            <w:noProof/>
+            <w:webHidden/>
+          </w:rPr>
+          <w:instrText xml:space="preserve"> PAGEREF _Toc241349649 \h </w:instrText>
+        </w:r>
+        <w:r>
+          <w:rPr>
+            <w:rStyle w:val="Hyperlink"/>
+            <w:noProof/>
+            <w:cs/>
+          </w:rPr>
+        </w:r>
+        <w:r>
+          <w:rPr>
+            <w:rStyle w:val="Hyperlink"/>
+            <w:noProof/>
+            <w:cs/>
+          </w:rPr>
+          <w:fldChar w:fldCharType="separate"/>
+        </w:r>
+        <w:r>
+          <w:rPr>
+            <w:noProof/>
+            <w:webHidden/>
+          </w:rPr>
+          <w:t>15</w:t>
+        </w:r>
+        <w:r>
+          <w:rPr>
+            <w:rStyle w:val="Hyperlink"/>
+            <w:noProof/>
+            <w:cs/>
+          </w:rPr>
+          <w:fldChar w:fldCharType="end"/>
+        </w:r>
+      </w:hyperlink>
+    </w:p>
+    <w:p>
+      <w:r>
+        <w:fldChar w:fldCharType="end"/>
+      </w:r>
+    </w:p>
+    <w:p>
+      <w:pPr>
+        <w:pStyle w:val="Heading1"/>
+      </w:pPr>
+      <w:bookmarkStart w:id="3" w:name="_Toc241349626"/>
+      <w:r>
+        <w:t>สารบัญภาพ</w:t>
+      </w:r>
+      <w:bookmarkEnd w:id="3"/>
     </w:p>
     <w:p>
       <w:pPr>
@@ -1396,18 +2314,18 @@
         <w:fldChar w:fldCharType="begin"/>
       </w:r>
       <w:r>
-        <w:instrText xml:space="preserve"> TOC \h \z \c "Table" </w:instrText>
+        <w:instrText xml:space="preserve"> TOC \h \z \c "Figure" </w:instrText>
       </w:r>
       <w:r>
         <w:fldChar w:fldCharType="separate"/>
       </w:r>
-      <w:hyperlink w:anchor="_Toc241327391" w:history="1">
+      <w:hyperlink w:anchor="_Toc241349650" w:history="1">
         <w:r>
           <w:rPr>
             <w:rStyle w:val="Hyperlink"/>
             <w:noProof/>
           </w:rPr>
-          <w:t>ตารางที่ 1  คำถามวิจัยและหลักฐานที่ใช้ตอบ</w:t>
+          <w:t>รูปที่ 1  สัดส่วนสถานะใน suite ที่นำมาประเมิน; n ระบุใต้แต่ละเทคนิค</w:t>
         </w:r>
         <w:r>
           <w:rPr>
@@ -1418,8 +2336,9 @@
         </w:r>
         <w:r>
           <w:rPr>
+            <w:rStyle w:val="Hyperlink"/>
             <w:noProof/>
-            <w:webHidden/>
+            <w:cs/>
           </w:rPr>
           <w:fldChar w:fldCharType="begin"/>
         </w:r>
@@ -1428,18 +2347,20 @@
             <w:noProof/>
             <w:webHidden/>
           </w:rPr>
-          <w:instrText xml:space="preserve"> PAGEREF _Toc241327391 \h </w:instrText>
+          <w:instrText xml:space="preserve"> PAGEREF _Toc241349650 \h </w:instrText>
         </w:r>
         <w:r>
           <w:rPr>
+            <w:rStyle w:val="Hyperlink"/>
             <w:noProof/>
-            <w:webHidden/>
+            <w:cs/>
           </w:rPr>
         </w:r>
         <w:r>
           <w:rPr>
+            <w:rStyle w:val="Hyperlink"/>
             <w:noProof/>
-            <w:webHidden/>
+            <w:cs/>
           </w:rPr>
           <w:fldChar w:fldCharType="separate"/>
         </w:r>
@@ -1448,12 +2369,13 @@
             <w:noProof/>
             <w:webHidden/>
           </w:rPr>
-          <w:t>5</w:t>
+          <w:t>8</w:t>
         </w:r>
         <w:r>
           <w:rPr>
+            <w:rStyle w:val="Hyperlink"/>
             <w:noProof/>
-            <w:webHidden/>
+            <w:cs/>
           </w:rPr>
           <w:fldChar w:fldCharType="end"/>
         </w:r>
@@ -1476,13 +2398,13 @@
           <w14:ligatures w14:val="standardContextual"/>
         </w:rPr>
       </w:pPr>
-      <w:hyperlink w:anchor="_Toc241327392" w:history="1">
+      <w:hyperlink w:anchor="_Toc241349651" w:history="1">
         <w:r>
           <w:rPr>
             <w:rStyle w:val="Hyperlink"/>
             <w:noProof/>
           </w:rPr>
-          <w:t>ตารางที่ 2  วิธีสร้าง suite ที่นำมาประเมิน</w:t>
+          <w:t>รูปที่ 2  Line และ branch coverage เฉลี่ยของทุก modified target class ที่วัดได้; n คือจำนวนบั๊ก</w:t>
         </w:r>
         <w:r>
           <w:rPr>
@@ -1493,8 +2415,9 @@
         </w:r>
         <w:r>
           <w:rPr>
+            <w:rStyle w:val="Hyperlink"/>
             <w:noProof/>
-            <w:webHidden/>
+            <w:cs/>
           </w:rPr>
           <w:fldChar w:fldCharType="begin"/>
         </w:r>
@@ -1503,18 +2426,20 @@
             <w:noProof/>
             <w:webHidden/>
           </w:rPr>
-          <w:instrText xml:space="preserve"> PAGEREF _Toc241327392 \h </w:instrText>
+          <w:instrText xml:space="preserve"> PAGEREF _Toc241349651 \h </w:instrText>
         </w:r>
         <w:r>
           <w:rPr>
+            <w:rStyle w:val="Hyperlink"/>
             <w:noProof/>
-            <w:webHidden/>
+            <w:cs/>
           </w:rPr>
         </w:r>
         <w:r>
           <w:rPr>
+            <w:rStyle w:val="Hyperlink"/>
             <w:noProof/>
-            <w:webHidden/>
+            <w:cs/>
           </w:rPr>
           <w:fldChar w:fldCharType="separate"/>
         </w:r>
@@ -1523,12 +2448,13 @@
             <w:noProof/>
             <w:webHidden/>
           </w:rPr>
-          <w:t>6</w:t>
+          <w:t>9</w:t>
         </w:r>
         <w:r>
           <w:rPr>
+            <w:rStyle w:val="Hyperlink"/>
             <w:noProof/>
-            <w:webHidden/>
+            <w:cs/>
           </w:rPr>
           <w:fldChar w:fldCharType="end"/>
         </w:r>
@@ -1551,1006 +2477,7 @@
           <w14:ligatures w14:val="standardContextual"/>
         </w:rPr>
       </w:pPr>
-      <w:hyperlink w:anchor="_Toc241327393" w:history="1">
-        <w:r>
-          <w:rPr>
-            <w:rStyle w:val="Hyperlink"/>
-            <w:noProof/>
-          </w:rPr>
-          <w:t>ตารางที่ 3  สภาพแวดล้อมการประเมิน</w:t>
-        </w:r>
-        <w:r>
-          <w:rPr>
-            <w:noProof/>
-            <w:webHidden/>
-          </w:rPr>
-          <w:tab/>
-        </w:r>
-        <w:r>
-          <w:rPr>
-            <w:noProof/>
-            <w:webHidden/>
-          </w:rPr>
-          <w:fldChar w:fldCharType="begin"/>
-        </w:r>
-        <w:r>
-          <w:rPr>
-            <w:noProof/>
-            <w:webHidden/>
-          </w:rPr>
-          <w:instrText xml:space="preserve"> PAGEREF _Toc241327393 \h </w:instrText>
-        </w:r>
-        <w:r>
-          <w:rPr>
-            <w:noProof/>
-            <w:webHidden/>
-          </w:rPr>
-        </w:r>
-        <w:r>
-          <w:rPr>
-            <w:noProof/>
-            <w:webHidden/>
-          </w:rPr>
-          <w:fldChar w:fldCharType="separate"/>
-        </w:r>
-        <w:r>
-          <w:rPr>
-            <w:noProof/>
-            <w:webHidden/>
-          </w:rPr>
-          <w:t>7</w:t>
-        </w:r>
-        <w:r>
-          <w:rPr>
-            <w:noProof/>
-            <w:webHidden/>
-          </w:rPr>
-          <w:fldChar w:fldCharType="end"/>
-        </w:r>
-      </w:hyperlink>
-    </w:p>
-    <w:p>
-      <w:pPr>
-        <w:pStyle w:val="TableofFigures"/>
-        <w:tabs>
-          <w:tab w:val="right" w:leader="dot" w:pos="9868"/>
-        </w:tabs>
-        <w:rPr>
-          <w:rFonts w:asciiTheme="minorHAnsi" w:eastAsiaTheme="minorEastAsia" w:hAnsiTheme="minorHAnsi" w:cstheme="minorBidi"/>
-          <w:noProof/>
-          <w:color w:val="auto"/>
-          <w:kern w:val="2"/>
-          <w:sz w:val="24"/>
-          <w:szCs w:val="30"/>
-          <w:lang w:bidi="th-TH"/>
-          <w14:ligatures w14:val="standardContextual"/>
-        </w:rPr>
-      </w:pPr>
-      <w:hyperlink w:anchor="_Toc241327394" w:history="1">
-        <w:r>
-          <w:rPr>
-            <w:rStyle w:val="Hyperlink"/>
-            <w:noProof/>
-          </w:rPr>
-          <w:t>ตารางที่ 4  นิยามสถานะผลการประเมิน</w:t>
-        </w:r>
-        <w:r>
-          <w:rPr>
-            <w:noProof/>
-            <w:webHidden/>
-          </w:rPr>
-          <w:tab/>
-        </w:r>
-        <w:r>
-          <w:rPr>
-            <w:noProof/>
-            <w:webHidden/>
-          </w:rPr>
-          <w:fldChar w:fldCharType="begin"/>
-        </w:r>
-        <w:r>
-          <w:rPr>
-            <w:noProof/>
-            <w:webHidden/>
-          </w:rPr>
-          <w:instrText xml:space="preserve"> PAGEREF _Toc241327394 \h </w:instrText>
-        </w:r>
-        <w:r>
-          <w:rPr>
-            <w:noProof/>
-            <w:webHidden/>
-          </w:rPr>
-        </w:r>
-        <w:r>
-          <w:rPr>
-            <w:noProof/>
-            <w:webHidden/>
-          </w:rPr>
-          <w:fldChar w:fldCharType="separate"/>
-        </w:r>
-        <w:r>
-          <w:rPr>
-            <w:noProof/>
-            <w:webHidden/>
-          </w:rPr>
-          <w:t>7</w:t>
-        </w:r>
-        <w:r>
-          <w:rPr>
-            <w:noProof/>
-            <w:webHidden/>
-          </w:rPr>
-          <w:fldChar w:fldCharType="end"/>
-        </w:r>
-      </w:hyperlink>
-    </w:p>
-    <w:p>
-      <w:pPr>
-        <w:pStyle w:val="TableofFigures"/>
-        <w:tabs>
-          <w:tab w:val="right" w:leader="dot" w:pos="9868"/>
-        </w:tabs>
-        <w:rPr>
-          <w:rFonts w:asciiTheme="minorHAnsi" w:eastAsiaTheme="minorEastAsia" w:hAnsiTheme="minorHAnsi" w:cstheme="minorBidi"/>
-          <w:noProof/>
-          <w:color w:val="auto"/>
-          <w:kern w:val="2"/>
-          <w:sz w:val="24"/>
-          <w:szCs w:val="30"/>
-          <w:lang w:bidi="th-TH"/>
-          <w14:ligatures w14:val="standardContextual"/>
-        </w:rPr>
-      </w:pPr>
-      <w:hyperlink w:anchor="_Toc241327395" w:history="1">
-        <w:r>
-          <w:rPr>
-            <w:rStyle w:val="Hyperlink"/>
-            <w:noProof/>
-          </w:rPr>
-          <w:t>ตารางที่ 5  สถานะและ fault detection ต่อเทคนิค; FDR ต่อ suite รวม compile/flaky ในตัวหาร</w:t>
-        </w:r>
-        <w:r>
-          <w:rPr>
-            <w:noProof/>
-            <w:webHidden/>
-          </w:rPr>
-          <w:tab/>
-        </w:r>
-        <w:r>
-          <w:rPr>
-            <w:noProof/>
-            <w:webHidden/>
-          </w:rPr>
-          <w:fldChar w:fldCharType="begin"/>
-        </w:r>
-        <w:r>
-          <w:rPr>
-            <w:noProof/>
-            <w:webHidden/>
-          </w:rPr>
-          <w:instrText xml:space="preserve"> PAGEREF _Toc241327395 \h </w:instrText>
-        </w:r>
-        <w:r>
-          <w:rPr>
-            <w:noProof/>
-            <w:webHidden/>
-          </w:rPr>
-        </w:r>
-        <w:r>
-          <w:rPr>
-            <w:noProof/>
-            <w:webHidden/>
-          </w:rPr>
-          <w:fldChar w:fldCharType="separate"/>
-        </w:r>
-        <w:r>
-          <w:rPr>
-            <w:noProof/>
-            <w:webHidden/>
-          </w:rPr>
-          <w:t>8</w:t>
-        </w:r>
-        <w:r>
-          <w:rPr>
-            <w:noProof/>
-            <w:webHidden/>
-          </w:rPr>
-          <w:fldChar w:fldCharType="end"/>
-        </w:r>
-      </w:hyperlink>
-    </w:p>
-    <w:p>
-      <w:pPr>
-        <w:pStyle w:val="TableofFigures"/>
-        <w:tabs>
-          <w:tab w:val="right" w:leader="dot" w:pos="9868"/>
-        </w:tabs>
-        <w:rPr>
-          <w:rFonts w:asciiTheme="minorHAnsi" w:eastAsiaTheme="minorEastAsia" w:hAnsiTheme="minorHAnsi" w:cstheme="minorBidi"/>
-          <w:noProof/>
-          <w:color w:val="auto"/>
-          <w:kern w:val="2"/>
-          <w:sz w:val="24"/>
-          <w:szCs w:val="30"/>
-          <w:lang w:bidi="th-TH"/>
-          <w14:ligatures w14:val="standardContextual"/>
-        </w:rPr>
-      </w:pPr>
-      <w:hyperlink w:anchor="_Toc241327396" w:history="1">
-        <w:r>
-          <w:rPr>
-            <w:rStyle w:val="Hyperlink"/>
-            <w:noProof/>
-          </w:rPr>
-          <w:t>ตารางที่ 6  Coverage ของ modified target classes ที่มีค่าการวัด</w:t>
-        </w:r>
-        <w:r>
-          <w:rPr>
-            <w:noProof/>
-            <w:webHidden/>
-          </w:rPr>
-          <w:tab/>
-        </w:r>
-        <w:r>
-          <w:rPr>
-            <w:noProof/>
-            <w:webHidden/>
-          </w:rPr>
-          <w:fldChar w:fldCharType="begin"/>
-        </w:r>
-        <w:r>
-          <w:rPr>
-            <w:noProof/>
-            <w:webHidden/>
-          </w:rPr>
-          <w:instrText xml:space="preserve"> PAGEREF _Toc241327396 \h </w:instrText>
-        </w:r>
-        <w:r>
-          <w:rPr>
-            <w:noProof/>
-            <w:webHidden/>
-          </w:rPr>
-        </w:r>
-        <w:r>
-          <w:rPr>
-            <w:noProof/>
-            <w:webHidden/>
-          </w:rPr>
-          <w:fldChar w:fldCharType="separate"/>
-        </w:r>
-        <w:r>
-          <w:rPr>
-            <w:noProof/>
-            <w:webHidden/>
-          </w:rPr>
-          <w:t>9</w:t>
-        </w:r>
-        <w:r>
-          <w:rPr>
-            <w:noProof/>
-            <w:webHidden/>
-          </w:rPr>
-          <w:fldChar w:fldCharType="end"/>
-        </w:r>
-      </w:hyperlink>
-    </w:p>
-    <w:p>
-      <w:pPr>
-        <w:pStyle w:val="TableofFigures"/>
-        <w:tabs>
-          <w:tab w:val="right" w:leader="dot" w:pos="9868"/>
-        </w:tabs>
-        <w:rPr>
-          <w:rFonts w:asciiTheme="minorHAnsi" w:eastAsiaTheme="minorEastAsia" w:hAnsiTheme="minorHAnsi" w:cstheme="minorBidi"/>
-          <w:noProof/>
-          <w:color w:val="auto"/>
-          <w:kern w:val="2"/>
-          <w:sz w:val="24"/>
-          <w:szCs w:val="30"/>
-          <w:lang w:bidi="th-TH"/>
-          <w14:ligatures w14:val="standardContextual"/>
-        </w:rPr>
-      </w:pPr>
-      <w:hyperlink w:anchor="_Toc241327397" w:history="1">
-        <w:r>
-          <w:rPr>
-            <w:rStyle w:val="Hyperlink"/>
-            <w:noProof/>
-          </w:rPr>
-          <w:t>ตารางที่ 7  ผล Wilcoxon signed-rank สำหรับ line coverage ที่วัดได้</w:t>
-        </w:r>
-        <w:r>
-          <w:rPr>
-            <w:noProof/>
-            <w:webHidden/>
-          </w:rPr>
-          <w:tab/>
-        </w:r>
-        <w:r>
-          <w:rPr>
-            <w:noProof/>
-            <w:webHidden/>
-          </w:rPr>
-          <w:fldChar w:fldCharType="begin"/>
-        </w:r>
-        <w:r>
-          <w:rPr>
-            <w:noProof/>
-            <w:webHidden/>
-          </w:rPr>
-          <w:instrText xml:space="preserve"> PAGEREF _Toc241327397 \h </w:instrText>
-        </w:r>
-        <w:r>
-          <w:rPr>
-            <w:noProof/>
-            <w:webHidden/>
-          </w:rPr>
-        </w:r>
-        <w:r>
-          <w:rPr>
-            <w:noProof/>
-            <w:webHidden/>
-          </w:rPr>
-          <w:fldChar w:fldCharType="separate"/>
-        </w:r>
-        <w:r>
-          <w:rPr>
-            <w:noProof/>
-            <w:webHidden/>
-          </w:rPr>
-          <w:t>9</w:t>
-        </w:r>
-        <w:r>
-          <w:rPr>
-            <w:noProof/>
-            <w:webHidden/>
-          </w:rPr>
-          <w:fldChar w:fldCharType="end"/>
-        </w:r>
-      </w:hyperlink>
-    </w:p>
-    <w:p>
-      <w:pPr>
-        <w:pStyle w:val="TableofFigures"/>
-        <w:tabs>
-          <w:tab w:val="right" w:leader="dot" w:pos="9868"/>
-        </w:tabs>
-        <w:rPr>
-          <w:rFonts w:asciiTheme="minorHAnsi" w:eastAsiaTheme="minorEastAsia" w:hAnsiTheme="minorHAnsi" w:cstheme="minorBidi"/>
-          <w:noProof/>
-          <w:color w:val="auto"/>
-          <w:kern w:val="2"/>
-          <w:sz w:val="24"/>
-          <w:szCs w:val="30"/>
-          <w:lang w:bidi="th-TH"/>
-          <w14:ligatures w14:val="standardContextual"/>
-        </w:rPr>
-      </w:pPr>
-      <w:hyperlink w:anchor="_Toc241327398" w:history="1">
-        <w:r>
-          <w:rPr>
-            <w:rStyle w:val="Hyperlink"/>
-            <w:noProof/>
-          </w:rPr>
-          <w:t>ตารางที่ 8  จำนวนการตรวจพบทั้งหมดและการมีส่วนร่วมที่ไม่ซ้ำ</w:t>
-        </w:r>
-        <w:r>
-          <w:rPr>
-            <w:noProof/>
-            <w:webHidden/>
-          </w:rPr>
-          <w:tab/>
-        </w:r>
-        <w:r>
-          <w:rPr>
-            <w:noProof/>
-            <w:webHidden/>
-          </w:rPr>
-          <w:fldChar w:fldCharType="begin"/>
-        </w:r>
-        <w:r>
-          <w:rPr>
-            <w:noProof/>
-            <w:webHidden/>
-          </w:rPr>
-          <w:instrText xml:space="preserve"> PAGEREF _Toc241327398 \h </w:instrText>
-        </w:r>
-        <w:r>
-          <w:rPr>
-            <w:noProof/>
-            <w:webHidden/>
-          </w:rPr>
-        </w:r>
-        <w:r>
-          <w:rPr>
-            <w:noProof/>
-            <w:webHidden/>
-          </w:rPr>
-          <w:fldChar w:fldCharType="separate"/>
-        </w:r>
-        <w:r>
-          <w:rPr>
-            <w:noProof/>
-            <w:webHidden/>
-          </w:rPr>
-          <w:t>10</w:t>
-        </w:r>
-        <w:r>
-          <w:rPr>
-            <w:noProof/>
-            <w:webHidden/>
-          </w:rPr>
-          <w:fldChar w:fldCharType="end"/>
-        </w:r>
-      </w:hyperlink>
-    </w:p>
-    <w:p>
-      <w:pPr>
-        <w:pStyle w:val="TableofFigures"/>
-        <w:tabs>
-          <w:tab w:val="right" w:leader="dot" w:pos="9868"/>
-        </w:tabs>
-        <w:rPr>
-          <w:rFonts w:asciiTheme="minorHAnsi" w:eastAsiaTheme="minorEastAsia" w:hAnsiTheme="minorHAnsi" w:cstheme="minorBidi"/>
-          <w:noProof/>
-          <w:color w:val="auto"/>
-          <w:kern w:val="2"/>
-          <w:sz w:val="24"/>
-          <w:szCs w:val="30"/>
-          <w:lang w:bidi="th-TH"/>
-          <w14:ligatures w14:val="standardContextual"/>
-        </w:rPr>
-      </w:pPr>
-      <w:hyperlink w:anchor="_Toc241327399" w:history="1">
-        <w:r>
-          <w:rPr>
-            <w:rStyle w:val="Hyperlink"/>
-            <w:noProof/>
-          </w:rPr>
-          <w:t>ตารางที่ 9  ข้อมูลการสร้าง MIO suite แยกตาม budget</w:t>
-        </w:r>
-        <w:r>
-          <w:rPr>
-            <w:noProof/>
-            <w:webHidden/>
-          </w:rPr>
-          <w:tab/>
-        </w:r>
-        <w:r>
-          <w:rPr>
-            <w:noProof/>
-            <w:webHidden/>
-          </w:rPr>
-          <w:fldChar w:fldCharType="begin"/>
-        </w:r>
-        <w:r>
-          <w:rPr>
-            <w:noProof/>
-            <w:webHidden/>
-          </w:rPr>
-          <w:instrText xml:space="preserve"> PAGEREF _Toc241327399 \h </w:instrText>
-        </w:r>
-        <w:r>
-          <w:rPr>
-            <w:noProof/>
-            <w:webHidden/>
-          </w:rPr>
-        </w:r>
-        <w:r>
-          <w:rPr>
-            <w:noProof/>
-            <w:webHidden/>
-          </w:rPr>
-          <w:fldChar w:fldCharType="separate"/>
-        </w:r>
-        <w:r>
-          <w:rPr>
-            <w:noProof/>
-            <w:webHidden/>
-          </w:rPr>
-          <w:t>11</w:t>
-        </w:r>
-        <w:r>
-          <w:rPr>
-            <w:noProof/>
-            <w:webHidden/>
-          </w:rPr>
-          <w:fldChar w:fldCharType="end"/>
-        </w:r>
-      </w:hyperlink>
-    </w:p>
-    <w:p>
-      <w:pPr>
-        <w:pStyle w:val="TableofFigures"/>
-        <w:tabs>
-          <w:tab w:val="right" w:leader="dot" w:pos="9868"/>
-        </w:tabs>
-        <w:rPr>
-          <w:rFonts w:asciiTheme="minorHAnsi" w:eastAsiaTheme="minorEastAsia" w:hAnsiTheme="minorHAnsi" w:cstheme="minorBidi"/>
-          <w:noProof/>
-          <w:color w:val="auto"/>
-          <w:kern w:val="2"/>
-          <w:sz w:val="24"/>
-          <w:szCs w:val="30"/>
-          <w:lang w:bidi="th-TH"/>
-          <w14:ligatures w14:val="standardContextual"/>
-        </w:rPr>
-      </w:pPr>
-      <w:hyperlink w:anchor="_Toc241327400" w:history="1">
-        <w:r>
-          <w:rPr>
-            <w:rStyle w:val="Hyperlink"/>
-            <w:noProof/>
-          </w:rPr>
-          <w:t>ตารางที่ 10  สถิติจาก log การสร้างชุดทดสอบ AI</w:t>
-        </w:r>
-        <w:r>
-          <w:rPr>
-            <w:noProof/>
-            <w:webHidden/>
-          </w:rPr>
-          <w:tab/>
-        </w:r>
-        <w:r>
-          <w:rPr>
-            <w:noProof/>
-            <w:webHidden/>
-          </w:rPr>
-          <w:fldChar w:fldCharType="begin"/>
-        </w:r>
-        <w:r>
-          <w:rPr>
-            <w:noProof/>
-            <w:webHidden/>
-          </w:rPr>
-          <w:instrText xml:space="preserve"> PAGEREF _Toc241327400 \h </w:instrText>
-        </w:r>
-        <w:r>
-          <w:rPr>
-            <w:noProof/>
-            <w:webHidden/>
-          </w:rPr>
-        </w:r>
-        <w:r>
-          <w:rPr>
-            <w:noProof/>
-            <w:webHidden/>
-          </w:rPr>
-          <w:fldChar w:fldCharType="separate"/>
-        </w:r>
-        <w:r>
-          <w:rPr>
-            <w:noProof/>
-            <w:webHidden/>
-          </w:rPr>
-          <w:t>11</w:t>
-        </w:r>
-        <w:r>
-          <w:rPr>
-            <w:noProof/>
-            <w:webHidden/>
-          </w:rPr>
-          <w:fldChar w:fldCharType="end"/>
-        </w:r>
-      </w:hyperlink>
-    </w:p>
-    <w:p>
-      <w:pPr>
-        <w:pStyle w:val="TableofFigures"/>
-        <w:tabs>
-          <w:tab w:val="right" w:leader="dot" w:pos="9868"/>
-        </w:tabs>
-        <w:rPr>
-          <w:rFonts w:asciiTheme="minorHAnsi" w:eastAsiaTheme="minorEastAsia" w:hAnsiTheme="minorHAnsi" w:cstheme="minorBidi"/>
-          <w:noProof/>
-          <w:color w:val="auto"/>
-          <w:kern w:val="2"/>
-          <w:sz w:val="24"/>
-          <w:szCs w:val="30"/>
-          <w:lang w:bidi="th-TH"/>
-          <w14:ligatures w14:val="standardContextual"/>
-        </w:rPr>
-      </w:pPr>
-      <w:hyperlink w:anchor="_Toc241327401" w:history="1">
-        <w:r>
-          <w:rPr>
-            <w:rStyle w:val="Hyperlink"/>
-            <w:noProof/>
-          </w:rPr>
-          <w:t>ตารางที่ 11  ไฟล์หลักสำหรับตรวจสอบและทำซ้ำ</w:t>
-        </w:r>
-        <w:r>
-          <w:rPr>
-            <w:noProof/>
-            <w:webHidden/>
-          </w:rPr>
-          <w:tab/>
-        </w:r>
-        <w:r>
-          <w:rPr>
-            <w:noProof/>
-            <w:webHidden/>
-          </w:rPr>
-          <w:fldChar w:fldCharType="begin"/>
-        </w:r>
-        <w:r>
-          <w:rPr>
-            <w:noProof/>
-            <w:webHidden/>
-          </w:rPr>
-          <w:instrText xml:space="preserve"> PAGEREF _Toc241327401 \h </w:instrText>
-        </w:r>
-        <w:r>
-          <w:rPr>
-            <w:noProof/>
-            <w:webHidden/>
-          </w:rPr>
-        </w:r>
-        <w:r>
-          <w:rPr>
-            <w:noProof/>
-            <w:webHidden/>
-          </w:rPr>
-          <w:fldChar w:fldCharType="separate"/>
-        </w:r>
-        <w:r>
-          <w:rPr>
-            <w:noProof/>
-            <w:webHidden/>
-          </w:rPr>
-          <w:t>15</w:t>
-        </w:r>
-        <w:r>
-          <w:rPr>
-            <w:noProof/>
-            <w:webHidden/>
-          </w:rPr>
-          <w:fldChar w:fldCharType="end"/>
-        </w:r>
-      </w:hyperlink>
-    </w:p>
-    <w:p>
-      <w:pPr>
-        <w:pStyle w:val="TableofFigures"/>
-        <w:tabs>
-          <w:tab w:val="right" w:leader="dot" w:pos="9868"/>
-        </w:tabs>
-        <w:rPr>
-          <w:rFonts w:asciiTheme="minorHAnsi" w:eastAsiaTheme="minorEastAsia" w:hAnsiTheme="minorHAnsi" w:cstheme="minorBidi"/>
-          <w:noProof/>
-          <w:color w:val="auto"/>
-          <w:kern w:val="2"/>
-          <w:sz w:val="24"/>
-          <w:szCs w:val="30"/>
-          <w:lang w:bidi="th-TH"/>
-          <w14:ligatures w14:val="standardContextual"/>
-        </w:rPr>
-      </w:pPr>
-      <w:hyperlink w:anchor="_Toc241327402" w:history="1">
-        <w:r>
-          <w:rPr>
-            <w:rStyle w:val="Hyperlink"/>
-            <w:noProof/>
-          </w:rPr>
-          <w:t>ตารางที่ 12  ตัวอย่าง BUG_DETECTED ที่ตรวจ buggy/fixed และ provenance แล้ว</w:t>
-        </w:r>
-        <w:r>
-          <w:rPr>
-            <w:noProof/>
-            <w:webHidden/>
-          </w:rPr>
-          <w:tab/>
-        </w:r>
-        <w:r>
-          <w:rPr>
-            <w:noProof/>
-            <w:webHidden/>
-          </w:rPr>
-          <w:fldChar w:fldCharType="begin"/>
-        </w:r>
-        <w:r>
-          <w:rPr>
-            <w:noProof/>
-            <w:webHidden/>
-          </w:rPr>
-          <w:instrText xml:space="preserve"> PAGEREF _Toc241327402 \h </w:instrText>
-        </w:r>
-        <w:r>
-          <w:rPr>
-            <w:noProof/>
-            <w:webHidden/>
-          </w:rPr>
-        </w:r>
-        <w:r>
-          <w:rPr>
-            <w:noProof/>
-            <w:webHidden/>
-          </w:rPr>
-          <w:fldChar w:fldCharType="separate"/>
-        </w:r>
-        <w:r>
-          <w:rPr>
-            <w:noProof/>
-            <w:webHidden/>
-          </w:rPr>
-          <w:t>15</w:t>
-        </w:r>
-        <w:r>
-          <w:rPr>
-            <w:noProof/>
-            <w:webHidden/>
-          </w:rPr>
-          <w:fldChar w:fldCharType="end"/>
-        </w:r>
-      </w:hyperlink>
-    </w:p>
-    <w:p>
-      <w:pPr>
-        <w:pStyle w:val="TableofFigures"/>
-        <w:tabs>
-          <w:tab w:val="right" w:leader="dot" w:pos="9868"/>
-        </w:tabs>
-        <w:rPr>
-          <w:rFonts w:asciiTheme="minorHAnsi" w:eastAsiaTheme="minorEastAsia" w:hAnsiTheme="minorHAnsi" w:cstheme="minorBidi"/>
-          <w:noProof/>
-          <w:color w:val="auto"/>
-          <w:kern w:val="2"/>
-          <w:sz w:val="24"/>
-          <w:szCs w:val="30"/>
-          <w:lang w:bidi="th-TH"/>
-          <w14:ligatures w14:val="standardContextual"/>
-        </w:rPr>
-      </w:pPr>
-      <w:hyperlink w:anchor="_Toc241327403" w:history="1">
-        <w:r>
-          <w:rPr>
-            <w:rStyle w:val="Hyperlink"/>
-            <w:noProof/>
-          </w:rPr>
-          <w:t>ตารางที่ 13  ความหมายฟิลด์สำหรับตรวจย้อนกลับ</w:t>
-        </w:r>
-        <w:r>
-          <w:rPr>
-            <w:noProof/>
-            <w:webHidden/>
-          </w:rPr>
-          <w:tab/>
-        </w:r>
-        <w:r>
-          <w:rPr>
-            <w:noProof/>
-            <w:webHidden/>
-          </w:rPr>
-          <w:fldChar w:fldCharType="begin"/>
-        </w:r>
-        <w:r>
-          <w:rPr>
-            <w:noProof/>
-            <w:webHidden/>
-          </w:rPr>
-          <w:instrText xml:space="preserve"> PAGEREF _Toc241327403 \h </w:instrText>
-        </w:r>
-        <w:r>
-          <w:rPr>
-            <w:noProof/>
-            <w:webHidden/>
-          </w:rPr>
-        </w:r>
-        <w:r>
-          <w:rPr>
-            <w:noProof/>
-            <w:webHidden/>
-          </w:rPr>
-          <w:fldChar w:fldCharType="separate"/>
-        </w:r>
-        <w:r>
-          <w:rPr>
-            <w:noProof/>
-            <w:webHidden/>
-          </w:rPr>
-          <w:t>15</w:t>
-        </w:r>
-        <w:r>
-          <w:rPr>
-            <w:noProof/>
-            <w:webHidden/>
-          </w:rPr>
-          <w:fldChar w:fldCharType="end"/>
-        </w:r>
-      </w:hyperlink>
-    </w:p>
-    <w:p>
-      <w:r>
-        <w:fldChar w:fldCharType="end"/>
-      </w:r>
-    </w:p>
-    <w:p>
-      <w:pPr>
-        <w:pStyle w:val="Heading1"/>
-      </w:pPr>
-      <w:bookmarkStart w:id="3" w:name="_Toc241327380"/>
-      <w:r>
-        <w:t>สารบัญภาพ</w:t>
-      </w:r>
-      <w:bookmarkEnd w:id="3"/>
-    </w:p>
-    <w:p>
-      <w:pPr>
-        <w:pStyle w:val="TableofFigures"/>
-        <w:tabs>
-          <w:tab w:val="right" w:leader="dot" w:pos="9868"/>
-        </w:tabs>
-        <w:rPr>
-          <w:rFonts w:asciiTheme="minorHAnsi" w:eastAsiaTheme="minorEastAsia" w:hAnsiTheme="minorHAnsi" w:cstheme="minorBidi"/>
-          <w:noProof/>
-          <w:color w:val="auto"/>
-          <w:kern w:val="2"/>
-          <w:sz w:val="24"/>
-          <w:szCs w:val="30"/>
-          <w:lang w:bidi="th-TH"/>
-          <w14:ligatures w14:val="standardContextual"/>
-        </w:rPr>
-      </w:pPr>
-      <w:r>
-        <w:fldChar w:fldCharType="begin"/>
-      </w:r>
-      <w:r>
-        <w:instrText xml:space="preserve"> TOC \h \z \c "Figure" </w:instrText>
-      </w:r>
-      <w:r>
-        <w:fldChar w:fldCharType="separate"/>
-      </w:r>
-      <w:hyperlink w:anchor="_Toc241327404" w:history="1">
-        <w:r>
-          <w:rPr>
-            <w:rStyle w:val="Hyperlink"/>
-            <w:noProof/>
-          </w:rPr>
-          <w:t>รูปที่ 1  สัดส่วนสถานะใน suite ที่นำมาประเมิน; n ระบุใต้แต่ละเทคนิค</w:t>
-        </w:r>
-        <w:r>
-          <w:rPr>
-            <w:noProof/>
-            <w:webHidden/>
-          </w:rPr>
-          <w:tab/>
-        </w:r>
-        <w:r>
-          <w:rPr>
-            <w:noProof/>
-            <w:webHidden/>
-          </w:rPr>
-          <w:fldChar w:fldCharType="begin"/>
-        </w:r>
-        <w:r>
-          <w:rPr>
-            <w:noProof/>
-            <w:webHidden/>
-          </w:rPr>
-          <w:instrText xml:space="preserve"> PAGEREF _Toc241327404 \h </w:instrText>
-        </w:r>
-        <w:r>
-          <w:rPr>
-            <w:noProof/>
-            <w:webHidden/>
-          </w:rPr>
-        </w:r>
-        <w:r>
-          <w:rPr>
-            <w:noProof/>
-            <w:webHidden/>
-          </w:rPr>
-          <w:fldChar w:fldCharType="separate"/>
-        </w:r>
-        <w:r>
-          <w:rPr>
-            <w:noProof/>
-            <w:webHidden/>
-          </w:rPr>
-          <w:t>8</w:t>
-        </w:r>
-        <w:r>
-          <w:rPr>
-            <w:noProof/>
-            <w:webHidden/>
-          </w:rPr>
-          <w:fldChar w:fldCharType="end"/>
-        </w:r>
-      </w:hyperlink>
-    </w:p>
-    <w:p>
-      <w:pPr>
-        <w:pStyle w:val="TableofFigures"/>
-        <w:tabs>
-          <w:tab w:val="right" w:leader="dot" w:pos="9868"/>
-        </w:tabs>
-        <w:rPr>
-          <w:rFonts w:asciiTheme="minorHAnsi" w:eastAsiaTheme="minorEastAsia" w:hAnsiTheme="minorHAnsi" w:cstheme="minorBidi"/>
-          <w:noProof/>
-          <w:color w:val="auto"/>
-          <w:kern w:val="2"/>
-          <w:sz w:val="24"/>
-          <w:szCs w:val="30"/>
-          <w:lang w:bidi="th-TH"/>
-          <w14:ligatures w14:val="standardContextual"/>
-        </w:rPr>
-      </w:pPr>
-      <w:hyperlink w:anchor="_Toc241327405" w:history="1">
-        <w:r>
-          <w:rPr>
-            <w:rStyle w:val="Hyperlink"/>
-            <w:noProof/>
-          </w:rPr>
-          <w:t>รูปที่ 2  Line และ branch coverage เฉลี่ยของทุก modified target class ที่วัดได้; n คือจำนวนบั๊ก</w:t>
-        </w:r>
-        <w:r>
-          <w:rPr>
-            <w:noProof/>
-            <w:webHidden/>
-          </w:rPr>
-          <w:tab/>
-        </w:r>
-        <w:r>
-          <w:rPr>
-            <w:noProof/>
-            <w:webHidden/>
-          </w:rPr>
-          <w:fldChar w:fldCharType="begin"/>
-        </w:r>
-        <w:r>
-          <w:rPr>
-            <w:noProof/>
-            <w:webHidden/>
-          </w:rPr>
-          <w:instrText xml:space="preserve"> PAGEREF _Toc241327405 \h </w:instrText>
-        </w:r>
-        <w:r>
-          <w:rPr>
-            <w:noProof/>
-            <w:webHidden/>
-          </w:rPr>
-        </w:r>
-        <w:r>
-          <w:rPr>
-            <w:noProof/>
-            <w:webHidden/>
-          </w:rPr>
-          <w:fldChar w:fldCharType="separate"/>
-        </w:r>
-        <w:r>
-          <w:rPr>
-            <w:noProof/>
-            <w:webHidden/>
-          </w:rPr>
-          <w:t>9</w:t>
-        </w:r>
-        <w:r>
-          <w:rPr>
-            <w:noProof/>
-            <w:webHidden/>
-          </w:rPr>
-          <w:fldChar w:fldCharType="end"/>
-        </w:r>
-      </w:hyperlink>
-    </w:p>
-    <w:p>
-      <w:pPr>
-        <w:pStyle w:val="TableofFigures"/>
-        <w:tabs>
-          <w:tab w:val="right" w:leader="dot" w:pos="9868"/>
-        </w:tabs>
-        <w:rPr>
-          <w:rFonts w:asciiTheme="minorHAnsi" w:eastAsiaTheme="minorEastAsia" w:hAnsiTheme="minorHAnsi" w:cstheme="minorBidi"/>
-          <w:noProof/>
-          <w:color w:val="auto"/>
-          <w:kern w:val="2"/>
-          <w:sz w:val="24"/>
-          <w:szCs w:val="30"/>
-          <w:lang w:bidi="th-TH"/>
-          <w14:ligatures w14:val="standardContextual"/>
-        </w:rPr>
-      </w:pPr>
-      <w:hyperlink w:anchor="_Toc241327406" w:history="1">
+      <w:hyperlink w:anchor="_Toc241349652" w:history="1">
         <w:r>
           <w:rPr>
             <w:rStyle w:val="Hyperlink"/>
@@ -2567,8 +2494,9 @@
         </w:r>
         <w:r>
           <w:rPr>
+            <w:rStyle w:val="Hyperlink"/>
             <w:noProof/>
-            <w:webHidden/>
+            <w:cs/>
           </w:rPr>
           <w:fldChar w:fldCharType="begin"/>
         </w:r>
@@ -2577,18 +2505,20 @@
             <w:noProof/>
             <w:webHidden/>
           </w:rPr>
-          <w:instrText xml:space="preserve"> PAGEREF _Toc241327406 \h </w:instrText>
+          <w:instrText xml:space="preserve"> PAGEREF _Toc241349652 \h </w:instrText>
         </w:r>
         <w:r>
           <w:rPr>
+            <w:rStyle w:val="Hyperlink"/>
             <w:noProof/>
-            <w:webHidden/>
+            <w:cs/>
           </w:rPr>
         </w:r>
         <w:r>
           <w:rPr>
+            <w:rStyle w:val="Hyperlink"/>
             <w:noProof/>
-            <w:webHidden/>
+            <w:cs/>
           </w:rPr>
           <w:fldChar w:fldCharType="separate"/>
         </w:r>
@@ -2601,8 +2531,9 @@
         </w:r>
         <w:r>
           <w:rPr>
+            <w:rStyle w:val="Hyperlink"/>
             <w:noProof/>
-            <w:webHidden/>
+            <w:cs/>
           </w:rPr>
           <w:fldChar w:fldCharType="end"/>
         </w:r>
@@ -2622,7 +2553,7 @@
       <w:pPr>
         <w:pStyle w:val="Heading1"/>
       </w:pPr>
-      <w:bookmarkStart w:id="4" w:name="_Toc241327381"/>
+      <w:bookmarkStart w:id="4" w:name="_Toc241349627"/>
       <w:r>
         <w:t>บทที่ 1 บทนำและขอบเขตการศึกษา</w:t>
       </w:r>
@@ -3150,7 +3081,7 @@
         <w:keepNext w:val="0"/>
         <w:jc w:val="center"/>
       </w:pPr>
-      <w:bookmarkStart w:id="5" w:name="_Toc241327391"/>
+      <w:bookmarkStart w:id="5" w:name="_Toc241349637"/>
       <w:r>
         <w:t xml:space="preserve">ตารางที่ </w:t>
       </w:r>
@@ -3194,7 +3125,7 @@
       <w:pPr>
         <w:pStyle w:val="Heading1"/>
       </w:pPr>
-      <w:bookmarkStart w:id="6" w:name="_Toc241327382"/>
+      <w:bookmarkStart w:id="6" w:name="_Toc241349628"/>
       <w:r>
         <w:t>บทที่ 2 แนวทางสร้างชุดทดสอบ</w:t>
       </w:r>
@@ -3780,7 +3711,7 @@
         <w:keepNext w:val="0"/>
         <w:jc w:val="center"/>
       </w:pPr>
-      <w:bookmarkStart w:id="7" w:name="_Toc241327392"/>
+      <w:bookmarkStart w:id="7" w:name="_Toc241349638"/>
       <w:r>
         <w:t xml:space="preserve">ตารางที่ </w:t>
       </w:r>
@@ -3824,7 +3755,7 @@
       <w:pPr>
         <w:pStyle w:val="Heading1"/>
       </w:pPr>
-      <w:bookmarkStart w:id="8" w:name="_Toc241327383"/>
+      <w:bookmarkStart w:id="8" w:name="_Toc241349629"/>
       <w:r>
         <w:t>บทที่ 3 สภาพแวดล้อมและวิธีทดลอง</w:t>
       </w:r>
@@ -3846,7 +3777,7 @@
         <w:t xml:space="preserve">Catalog </w:t>
       </w:r>
       <w:r>
-        <w:t>อยู่ใน `target_benchmark/all_bugs_catalog.json`; master results อยู่ใน `results/master_benchmark_summary.csv`; descriptive statistics อยู่ใน `results/master_descriptive_stats.json`. Master มี 3,416 คีย์ไม่ซ้ำ ครบ 854 บั๊ก × 4 เทคนิค. มี 2,768 คีย์ที่ runner พบ suite ซึ่งผ่านเกณฑ์ประเมิน; 648 คีย์เป็น NO_SUITE; ไม่มี unresolved outcomes. บัญชีตรวจเพิ่มเติมใน `results/suite_gap_audit.csv` แยกกรณีไม่มีไฟล์ Java ออกจากไฟล์ผู้สมัครที่ยังไม่ผ่าน manifest หรือ target matcher.</w:t>
+        <w:t>อยู่ใน `target_benchmark/all_bugs_catalog.json`; master results อยู่ใน `results/master_benchmark_summary.csv`; descriptive statistics อยู่ใน `results/master_descriptive_stats.json`. Master มี 3,416 คีย์ไม่ซ้ำ ครบ 854 บั๊ก × 4 เทคนิค. มี 2,797 คีย์ที่ runner ประเมินแล้ว; 619 คีย์เป็น NO_SUITE; unresolved outcomes 0. บัญชีตรวจเพิ่มเติมใน `results/suite_gap_audit.csv` แยกกรณีไม่มีไฟล์ Javaออกจากไฟล์ผู้สมัครที่ยังไม่ผ่าน manifest หรือ target matcher.</w:t>
       </w:r>
     </w:p>
     <w:p>
@@ -4298,7 +4229,7 @@
         <w:keepNext w:val="0"/>
         <w:jc w:val="center"/>
       </w:pPr>
-      <w:bookmarkStart w:id="9" w:name="_Toc241327393"/>
+      <w:bookmarkStart w:id="9" w:name="_Toc241349639"/>
       <w:r>
         <w:t xml:space="preserve">ตารางที่ </w:t>
       </w:r>
@@ -4847,7 +4778,7 @@
         <w:keepNext w:val="0"/>
         <w:jc w:val="center"/>
       </w:pPr>
-      <w:bookmarkStart w:id="10" w:name="_Toc241327394"/>
+      <w:bookmarkStart w:id="10" w:name="_Toc241349640"/>
       <w:r>
         <w:t xml:space="preserve">ตารางที่ </w:t>
       </w:r>
@@ -4894,7 +4825,7 @@
       <w:pPr>
         <w:pStyle w:val="Heading1"/>
       </w:pPr>
-      <w:bookmarkStart w:id="11" w:name="_Toc241327384"/>
+      <w:bookmarkStart w:id="11" w:name="_Toc241349630"/>
       <w:r>
         <w:t>บทที่ 4 ผลการทดลอง</w:t>
       </w:r>
@@ -4916,7 +4847,7 @@
         <w:t xml:space="preserve">Catalog </w:t>
       </w:r>
       <w:r>
-        <w:t>มี 854 บั๊ก × 4 เทคนิค รวม 3,416 คีย์ไม่ซ้ำ. มี suite และรันครบ 2,768 รายการ; 648 รายการไม่มี suite. สถานะ final มี 1,662 DONE และ 1,106 COMPILE_ERROR. ในผลที่รันได้มี 160 BUG_DETECTED, 830 NOT_DETECTED และ 672 FLAKY_OR_REGRESSION. ไม่มี timeout หรือ unresolved outcome ใน snapshot.</w:t>
+        <w:t>มี 854 บั๊ก × 4 เทคนิค รวม 3,416 คีย์ไม่ซ้ำ. มี suite และผลประเมิน 2,797 รายการ; 619 รายการไม่มี suite. สถานะมี 1,665 DONE, 1,132 COMPILE_ERROR และ 0 TIMEOUT. ในผลที่รันได้มี 160 BUG_DETECTED, 830 NOT_DETECTED และ 675 FLAKY_OR_REGRESSION; unresolved outcomes 0.</w:t>
       </w:r>
     </w:p>
     <w:tbl>
@@ -5931,7 +5862,7 @@
               <w:rPr>
                 <w:sz w:val="14"/>
               </w:rPr>
-              <w:t>836/854</w:t>
+              <w:t>853/854</w:t>
             </w:r>
           </w:p>
         </w:tc>
@@ -5960,7 +5891,7 @@
               <w:rPr>
                 <w:sz w:val="14"/>
               </w:rPr>
-              <w:t>18</w:t>
+              <w:t>1</w:t>
             </w:r>
           </w:p>
         </w:tc>
@@ -5989,7 +5920,7 @@
               <w:rPr>
                 <w:sz w:val="14"/>
               </w:rPr>
-              <w:t>191</w:t>
+              <w:t>192</w:t>
             </w:r>
           </w:p>
         </w:tc>
@@ -6018,7 +5949,7 @@
               <w:rPr>
                 <w:sz w:val="14"/>
               </w:rPr>
-              <w:t>645</w:t>
+              <w:t>661</w:t>
             </w:r>
           </w:p>
         </w:tc>
@@ -6076,7 +6007,7 @@
               <w:rPr>
                 <w:sz w:val="14"/>
               </w:rPr>
-              <w:t>174</w:t>
+              <w:t>175</w:t>
             </w:r>
           </w:p>
         </w:tc>
@@ -6134,7 +6065,7 @@
               <w:rPr>
                 <w:sz w:val="14"/>
               </w:rPr>
-              <w:t>1.32%</w:t>
+              <w:t>1.29%</w:t>
             </w:r>
           </w:p>
         </w:tc>
@@ -6229,7 +6160,7 @@
               <w:rPr>
                 <w:sz w:val="14"/>
               </w:rPr>
-              <w:t>841/854</w:t>
+              <w:t>853/854</w:t>
             </w:r>
           </w:p>
         </w:tc>
@@ -6259,7 +6190,7 @@
               <w:rPr>
                 <w:sz w:val="14"/>
               </w:rPr>
-              <w:t>13</w:t>
+              <w:t>1</w:t>
             </w:r>
           </w:p>
         </w:tc>
@@ -6289,7 +6220,7 @@
               <w:rPr>
                 <w:sz w:val="14"/>
               </w:rPr>
-              <w:t>422</w:t>
+              <w:t>424</w:t>
             </w:r>
           </w:p>
         </w:tc>
@@ -6319,7 +6250,7 @@
               <w:rPr>
                 <w:sz w:val="14"/>
               </w:rPr>
-              <w:t>419</w:t>
+              <w:t>429</w:t>
             </w:r>
           </w:p>
         </w:tc>
@@ -6379,7 +6310,7 @@
               <w:rPr>
                 <w:sz w:val="14"/>
               </w:rPr>
-              <w:t>304</w:t>
+              <w:t>306</w:t>
             </w:r>
           </w:p>
         </w:tc>
@@ -6439,7 +6370,7 @@
               <w:rPr>
                 <w:sz w:val="14"/>
               </w:rPr>
-              <w:t>12.72%</w:t>
+              <w:t>12.54%</w:t>
             </w:r>
           </w:p>
         </w:tc>
@@ -6481,7 +6412,7 @@
         <w:keepNext w:val="0"/>
         <w:jc w:val="center"/>
       </w:pPr>
-      <w:bookmarkStart w:id="12" w:name="_Toc241327395"/>
+      <w:bookmarkStart w:id="12" w:name="_Toc241349641"/>
       <w:r>
         <w:t xml:space="preserve">ตารางที่ </w:t>
       </w:r>
@@ -6521,7 +6452,7 @@
         <w:t xml:space="preserve">`DONE` </w:t>
       </w:r>
       <w:r>
-        <w:t>หมายถึงการประเมินสิ้นสุดโดยไม่เกิด compile error; fault status ของแถว DONE ยังอาจเป็น flaky/regression. จำนวน 648 NO_SUITE แสดงแยกจาก NOT_DETECTED.</w:t>
+        <w:t>หมายถึงการประเมินสิ้นสุดโดยไม่เกิด compile error; fault status ของแถว DONE ยังอาจเป็น flaky/regression. จำนวน 619 NO_SUITE แสดงแยกจาก NOT_DETECTED.</w:t>
       </w:r>
     </w:p>
     <w:p>
@@ -6535,7 +6466,7 @@
           <w:noProof/>
         </w:rPr>
         <w:drawing>
-          <wp:inline distT="0" distB="0" distL="0" distR="0" wp14:anchorId="382BF63C" wp14:editId="09923411">
+          <wp:inline distT="0" distB="0" distL="0" distR="0" wp14:anchorId="1BE28228" wp14:editId="5BA7F034">
             <wp:extent cx="6126480" cy="3341716"/>
             <wp:effectExtent l="0" t="0" r="0" b="0"/>
             <wp:docPr id="2" name="Picture 2"/>
@@ -6577,7 +6508,7 @@
         <w:keepNext w:val="0"/>
         <w:jc w:val="center"/>
       </w:pPr>
-      <w:bookmarkStart w:id="13" w:name="_Toc241327404"/>
+      <w:bookmarkStart w:id="13" w:name="_Toc241349650"/>
       <w:r>
         <w:t xml:space="preserve">รูปที่ </w:t>
       </w:r>
@@ -7086,7 +7017,7 @@
               <w:rPr>
                 <w:sz w:val="17"/>
               </w:rPr>
-              <w:t>191</w:t>
+              <w:t>192</w:t>
             </w:r>
           </w:p>
         </w:tc>
@@ -7115,7 +7046,7 @@
               <w:rPr>
                 <w:sz w:val="17"/>
               </w:rPr>
-              <w:t>77.99 ± 30.88%</w:t>
+              <w:t>78.02 ± 30.80%</w:t>
             </w:r>
           </w:p>
         </w:tc>
@@ -7144,7 +7075,7 @@
               <w:rPr>
                 <w:sz w:val="17"/>
               </w:rPr>
-              <w:t>70.25 ± 31.18%</w:t>
+              <w:t>70.22 ± 31.10%</w:t>
             </w:r>
           </w:p>
         </w:tc>
@@ -7210,7 +7141,7 @@
               <w:rPr>
                 <w:sz w:val="17"/>
               </w:rPr>
-              <w:t>422</w:t>
+              <w:t>424</w:t>
             </w:r>
           </w:p>
         </w:tc>
@@ -7240,7 +7171,7 @@
               <w:rPr>
                 <w:sz w:val="17"/>
               </w:rPr>
-              <w:t>86.24 ± 25.14%</w:t>
+              <w:t>86.29 ± 25.10%</w:t>
             </w:r>
           </w:p>
         </w:tc>
@@ -7270,7 +7201,7 @@
               <w:rPr>
                 <w:sz w:val="17"/>
               </w:rPr>
-              <w:t>79.45 ± 26.98%</w:t>
+              <w:t>79.54 ± 26.94%</w:t>
             </w:r>
           </w:p>
         </w:tc>
@@ -7282,7 +7213,7 @@
         <w:keepNext w:val="0"/>
         <w:jc w:val="center"/>
       </w:pPr>
-      <w:bookmarkStart w:id="14" w:name="_Toc241327396"/>
+      <w:bookmarkStart w:id="14" w:name="_Toc241349642"/>
       <w:r>
         <w:t xml:space="preserve">ตารางที่ </w:t>
       </w:r>
@@ -7328,7 +7259,7 @@
           <w:noProof/>
         </w:rPr>
         <w:drawing>
-          <wp:inline distT="0" distB="0" distL="0" distR="0" wp14:anchorId="48E4229A" wp14:editId="73105126">
+          <wp:inline distT="0" distB="0" distL="0" distR="0" wp14:anchorId="54B6D328" wp14:editId="04CF7E53">
             <wp:extent cx="6126480" cy="3318510"/>
             <wp:effectExtent l="0" t="0" r="0" b="0"/>
             <wp:docPr id="3" name="Picture 3"/>
@@ -7370,7 +7301,7 @@
         <w:keepNext w:val="0"/>
         <w:jc w:val="center"/>
       </w:pPr>
-      <w:bookmarkStart w:id="15" w:name="_Toc241327405"/>
+      <w:bookmarkStart w:id="15" w:name="_Toc241349651"/>
       <w:r>
         <w:t xml:space="preserve">รูปที่ </w:t>
       </w:r>
@@ -7405,7 +7336,7 @@
         <w:t xml:space="preserve">Gemini </w:t>
       </w:r>
       <w:r>
-        <w:t>มี coverage mean สูงสุดในผลที่วัดได้. ค่าเฉลี่ยนี้ยังมี selection bias ได้ เพราะ coverage คำนวณได้เฉพาะกรณีที่ suite ผ่านการ compile และทำงานสำเร็จ; Gemini compile error 419/841 และ DeepSeek 645/836.</w:t>
+        <w:t>มี coverage mean สูงสุดในผลที่วัดได้. ค่าเฉลี่ยนี้ยังมี selection bias ได้ เพราะ coverage คำนวณได้เฉพาะกรณีที่ suite ผ่านการ compile และทำงานสำเร็จ; Gemini compile error 429/853 และ DeepSeek 661/853.</w:t>
       </w:r>
     </w:p>
     <w:p>
@@ -7633,7 +7564,7 @@
               <w:rPr>
                 <w:sz w:val="16"/>
               </w:rPr>
-              <w:t>135</w:t>
+              <w:t>136</w:t>
             </w:r>
           </w:p>
         </w:tc>
@@ -7662,7 +7593,7 @@
               <w:rPr>
                 <w:sz w:val="16"/>
               </w:rPr>
-              <w:t>7.28e-12</w:t>
+              <w:t>4.92e-12</w:t>
             </w:r>
           </w:p>
         </w:tc>
@@ -7691,7 +7622,7 @@
               <w:rPr>
                 <w:sz w:val="16"/>
               </w:rPr>
-              <w:t>0.830</w:t>
+              <w:t>0.834</w:t>
             </w:r>
           </w:p>
         </w:tc>
@@ -7763,7 +7694,7 @@
               <w:rPr>
                 <w:sz w:val="16"/>
               </w:rPr>
-              <w:t>397</w:t>
+              <w:t>399</w:t>
             </w:r>
           </w:p>
         </w:tc>
@@ -7793,7 +7724,7 @@
               <w:rPr>
                 <w:sz w:val="16"/>
               </w:rPr>
-              <w:t>1.09e-32</w:t>
+              <w:t>7.28e-33</w:t>
             </w:r>
           </w:p>
         </w:tc>
@@ -7823,7 +7754,7 @@
               <w:rPr>
                 <w:sz w:val="16"/>
               </w:rPr>
-              <w:t>-0.758</w:t>
+              <w:t>-0.759</w:t>
             </w:r>
           </w:p>
         </w:tc>
@@ -7893,7 +7824,7 @@
               <w:rPr>
                 <w:sz w:val="16"/>
               </w:rPr>
-              <w:t>182</w:t>
+              <w:t>183</w:t>
             </w:r>
           </w:p>
         </w:tc>
@@ -7922,7 +7853,7 @@
               <w:rPr>
                 <w:sz w:val="16"/>
               </w:rPr>
-              <w:t>1.54e-02</w:t>
+              <w:t>1.75e-02</w:t>
             </w:r>
           </w:p>
         </w:tc>
@@ -7951,7 +7882,7 @@
               <w:rPr>
                 <w:sz w:val="16"/>
               </w:rPr>
-              <w:t>-0.227</w:t>
+              <w:t>-0.222</w:t>
             </w:r>
           </w:p>
         </w:tc>
@@ -8343,7 +8274,7 @@
         <w:keepNext w:val="0"/>
         <w:jc w:val="center"/>
       </w:pPr>
-      <w:bookmarkStart w:id="16" w:name="_Toc241327397"/>
+      <w:bookmarkStart w:id="16" w:name="_Toc241349643"/>
       <w:r>
         <w:t xml:space="preserve">ตารางที่ </w:t>
       </w:r>
@@ -8904,7 +8835,7 @@
         <w:keepNext w:val="0"/>
         <w:jc w:val="center"/>
       </w:pPr>
-      <w:bookmarkStart w:id="17" w:name="_Toc241327398"/>
+      <w:bookmarkStart w:id="17" w:name="_Toc241349644"/>
       <w:r>
         <w:t xml:space="preserve">ตารางที่ </w:t>
       </w:r>
@@ -8948,7 +8879,7 @@
       <w:pPr>
         <w:pStyle w:val="Heading1"/>
       </w:pPr>
-      <w:bookmarkStart w:id="18" w:name="_Toc241327385"/>
+      <w:bookmarkStart w:id="18" w:name="_Toc241349631"/>
       <w:r>
         <w:t>บทที่ 5 การวิเคราะห์และอภิปรายผล</w:t>
       </w:r>
@@ -8978,7 +8909,7 @@
         <w:t xml:space="preserve">Native IPO </w:t>
       </w:r>
       <w:r>
-        <w:t>ตรวจพบ 37/257 suite ที่นำมารัน (14.40%); ต่อ catalog เท่ากับ 37/854 (4.33%). มี suite ให้ประเมินเพียง 257 บั๊ก. Gemini ตรวจพบ 107/841 (12.72%) และ suite ครอบคลุม catalog กว้างกว่า แต่มี compile error 419 รายการ. การรายงานทั้งตัวหาร suite และตัวหาร catalog ป้องกันการอ่านเปอร์เซ็นต์โดยไม่เห็นขอบเขต.</w:t>
+        <w:t>ตรวจพบ 37/257 suite (14.40%); ต่อ catalog เท่ากับ 37/854 (4.33%). มี suite ให้ประเมิน 257 บั๊ก. Gemini ตรวจพบ 107/853 (12.54%) และมี compile error 429 รายการ. การรายงานทั้งตัวหาร suite และตัวหาร catalog ป้องกันการอ่านเปอร์เซ็นต์โดยไม่เห็นขอบเขต.</w:t>
       </w:r>
     </w:p>
     <w:p>
@@ -8994,7 +8925,7 @@
     </w:p>
     <w:p>
       <w:r>
-        <w:t>ใน suite evaluations 1,106 รายการ compile ไม่ผ่าน และ 672 รายการเป็น flaky/regression. DeepSeek มี compile errors 645/836 และ Gemini 419/841. สถานะเหล่านี้ไม่ถูกแทนด้วย coverage 0; FDR ต่อ suite รวมไว้ในตัวหารเพื่อให้เห็นความพร้อมใช้จริง.</w:t>
+        <w:t>ใน suite evaluations 1,132 รายการ compile ไม่ผ่าน และ 675 รายการเป็น flaky/regression. DeepSeek มี compile errors 661/853 และ Gemini 429/853. สถานะเหล่านี้ไม่ถูกแทนด้วย coverage 0; FDR ต่อ suite รวมไว้ในตัวหารเพื่อให้เห็นความพร้อมใช้จริง.</w:t>
       </w:r>
     </w:p>
     <w:p>
@@ -9861,7 +9792,7 @@
         <w:keepNext w:val="0"/>
         <w:jc w:val="center"/>
       </w:pPr>
-      <w:bookmarkStart w:id="19" w:name="_Toc241327399"/>
+      <w:bookmarkStart w:id="19" w:name="_Toc241349645"/>
       <w:r>
         <w:t xml:space="preserve">ตารางที่ </w:t>
       </w:r>
@@ -10134,7 +10065,7 @@
               <w:rPr>
                 <w:sz w:val="17"/>
               </w:rPr>
-              <w:t>1068</w:t>
+              <w:t>1079</w:t>
             </w:r>
           </w:p>
         </w:tc>
@@ -10163,7 +10094,7 @@
               <w:rPr>
                 <w:sz w:val="17"/>
               </w:rPr>
-              <w:t>20,699.64</w:t>
+              <w:t>20,855.06</w:t>
             </w:r>
           </w:p>
         </w:tc>
@@ -10192,7 +10123,7 @@
               <w:rPr>
                 <w:sz w:val="17"/>
               </w:rPr>
-              <w:t xml:space="preserve">88.66 </w:t>
+              <w:t xml:space="preserve">89.78 </w:t>
             </w:r>
             <w:r>
               <w:rPr>
@@ -10264,7 +10195,7 @@
               <w:rPr>
                 <w:sz w:val="17"/>
               </w:rPr>
-              <w:t>1069</w:t>
+              <w:t>1082</w:t>
             </w:r>
           </w:p>
         </w:tc>
@@ -10294,7 +10225,7 @@
               <w:rPr>
                 <w:sz w:val="17"/>
               </w:rPr>
-              <w:t>20,900.15</w:t>
+              <w:t>21,045.26</w:t>
             </w:r>
           </w:p>
         </w:tc>
@@ -10324,7 +10255,7 @@
               <w:rPr>
                 <w:sz w:val="17"/>
               </w:rPr>
-              <w:t xml:space="preserve">295.11 </w:t>
+              <w:t xml:space="preserve">295.54 </w:t>
             </w:r>
             <w:r>
               <w:rPr>
@@ -10342,7 +10273,7 @@
         <w:keepNext w:val="0"/>
         <w:jc w:val="center"/>
       </w:pPr>
-      <w:bookmarkStart w:id="20" w:name="_Toc241327400"/>
+      <w:bookmarkStart w:id="20" w:name="_Toc241349646"/>
       <w:r>
         <w:t xml:space="preserve">ตารางที่ </w:t>
       </w:r>
@@ -10388,7 +10319,7 @@
           <w:noProof/>
         </w:rPr>
         <w:drawing>
-          <wp:inline distT="0" distB="0" distL="0" distR="0" wp14:anchorId="54060B86" wp14:editId="06F5031A">
+          <wp:inline distT="0" distB="0" distL="0" distR="0" wp14:anchorId="272DF2FF" wp14:editId="28CFE6FF">
             <wp:extent cx="6126480" cy="2552700"/>
             <wp:effectExtent l="0" t="0" r="0" b="0"/>
             <wp:docPr id="4" name="Picture 4"/>
@@ -10430,7 +10361,7 @@
         <w:keepNext w:val="0"/>
         <w:jc w:val="center"/>
       </w:pPr>
-      <w:bookmarkStart w:id="21" w:name="_Toc241327406"/>
+      <w:bookmarkStart w:id="21" w:name="_Toc241349652"/>
       <w:r>
         <w:t xml:space="preserve">รูปที่ </w:t>
       </w:r>
@@ -10484,7 +10415,7 @@
         <w:pStyle w:val="ListBullet"/>
       </w:pPr>
       <w:r>
-        <w:t>จำนวน suite ต่างกันระหว่างเทคนิค; 648 ช่อง NO_SUITE ไม่ใช่ผลลบของการทดสอบ. บัญชีตรวจไฟล์พบ 591 ช่อง IPO และ 20 ช่อง MIO ที่ไม่มีไฟล์ Java ในตำแหน่ง suite, 6 ช่อง IPO มีไฟล์แต่ยังไม่อยู่ใน verified manifest, และ 31 ช่อง AI มีไฟล์ผู้สมัครแต่ไม่ผ่าน strict target matcher.</w:t>
+        <w:t>จำนวน suite ต่างกันระหว่างเทคนิค; 619 ช่อง NO_SUITE เป็นช่องที่ไม่มี suite สำหรับ benchmark evaluation และไม่ใช่ผลลบของการทดสอบ. IPO มี 597 ช่อง: 37 GENERATION_OR_VERIFICATION_ERROR และ 560 SKIPPED_NOT_READY. ใน 37 ช่องมี candidate Java 6 ช่องที่ fixed-version verification ไม่ผ่าน และอีก 31 ช่องไม่พบ candidate; ใน 560 ช่องที่ถูกข้าม มี 495 NEEDS_ADAPTER, 47 NEEDS_ENTRY_POINT, 16 ที่มีทั้งสองสาเหตุ และ 2 ที่มี NEEDS_ADAPTER ร่วมกับ NOT_PAIRWISE_APPLICABLE.</w:t>
       </w:r>
     </w:p>
     <w:p>
@@ -10492,10 +10423,10 @@
         <w:pStyle w:val="ListBullet"/>
       </w:pPr>
       <w:r>
-        <w:t xml:space="preserve">Coverage aggregate </w:t>
-      </w:r>
-      <w:r>
-        <w:t>รวม modified target classes จาก Defects4J summary; การเฉลี่ยนี้ยังขึ้นกับชุด suite ที่ compile และรันสำเร็จ.</w:t>
+        <w:t xml:space="preserve">MIO </w:t>
+      </w:r>
+      <w:r>
+        <w:t>มี 20 GENERATION_FAILURE หลังบันทึกการลองสร้าง 3 budgets คูณ 3 seeds ต่อบั๊ก: Mockito 15 ช่อง compile ไม่ผ่านจาก Bintray/JCenter; Math-13, Math-31 และ Gson-3 เกิด EvoSuite 1.0.6 internal NPE; Gson-8 เกิด JVM native crash; JacksonDatabind-24 เกิดปัญหา character encoding ตอน compile. ทุกช่องยังคงเป็น NO_SUITE ใน benchmark เพราะไม่มีไฟล์ suite สำหรับประเมิน.</w:t>
       </w:r>
     </w:p>
     <w:p>
@@ -10503,10 +10434,10 @@
         <w:pStyle w:val="ListBullet"/>
       </w:pPr>
       <w:r>
-        <w:t xml:space="preserve">Compile errors </w:t>
-      </w:r>
-      <w:r>
-        <w:t>และ flaky/regression สูงใน AI suites; coverage mean จากชุดที่วัดได้อาจมี survivorship bias.</w:t>
+        <w:t xml:space="preserve">Member 3 </w:t>
+      </w:r>
+      <w:r>
+        <w:t>ส่งไฟล์ AI 31 ไฟล์สำหรับ 29 คีย์บั๊ก–เทคนิค; runner ประเมินครบแล้ว ได้ COMPILE_ERROR 26 คีย์ และ DONE 3 คีย์ โดย 3 คีย์ในกลุ่ม DONE ยัง fail บน fixed. เหลือ AI NO_SUITE 2 คีย์ที่ target mismatch (Math-13); catalog/Defects4J ระบุ target org.apache.commons.math3.optimization.general.AbstractLeastSquaresOptimizer แต่ candidate ใช้ package org.apache.commons.math3.optim.nonlinear.vector.jacobian.</w:t>
       </w:r>
     </w:p>
     <w:p>
@@ -10514,10 +10445,10 @@
         <w:pStyle w:val="ListBullet"/>
       </w:pPr>
       <w:r>
-        <w:t xml:space="preserve">MIO budget summary </w:t>
-      </w:r>
-      <w:r>
-        <w:t>ใช้ criterion coverage รวม ไม่แยก line/branch; cohort ต่อ budget ไม่เหมือนกัน.</w:t>
+        <w:t xml:space="preserve">Coverage aggregate </w:t>
+      </w:r>
+      <w:r>
+        <w:t>รวม modified target classes จาก Defects4J summary; การเฉลี่ยนี้ยังขึ้นกับชุด suite ที่ compile และรันสำเร็จ.</w:t>
       </w:r>
     </w:p>
     <w:p>
@@ -10525,10 +10456,10 @@
         <w:pStyle w:val="ListBullet"/>
       </w:pPr>
       <w:r>
-        <w:t xml:space="preserve">AI generation log </w:t>
-      </w:r>
-      <w:r>
-        <w:t>ไม่มี run ID ครบ; ไม่รองรับการวิเคราะห์ token/time ต่อผล detection.</w:t>
+        <w:t xml:space="preserve">Compile errors </w:t>
+      </w:r>
+      <w:r>
+        <w:t>และ flaky/regression สูงใน AI suites; coverage mean จากชุดที่วัดได้อาจมี survivorship bias.</w:t>
       </w:r>
     </w:p>
     <w:p>
@@ -10536,10 +10467,10 @@
         <w:pStyle w:val="ListBullet"/>
       </w:pPr>
       <w:r>
-        <w:t xml:space="preserve">Benchmark evaluation </w:t>
-      </w:r>
-      <w:r>
-        <w:t>ต่อ bug-technique key ไม่ได้ทำซ้ำทุก suite หลายรอบเพื่อวัด variance.</w:t>
+        <w:t xml:space="preserve">MIO budget summary </w:t>
+      </w:r>
+      <w:r>
+        <w:t>ใช้ criterion coverage รวม ไม่แยก line/branch; cohort ต่อ budget ไม่เหมือนกัน.</w:t>
       </w:r>
     </w:p>
     <w:p>
@@ -10547,6 +10478,28 @@
         <w:pStyle w:val="ListBullet"/>
       </w:pPr>
       <w:r>
+        <w:t xml:space="preserve">AI generation log </w:t>
+      </w:r>
+      <w:r>
+        <w:t>ไม่มี run ID ครบ; ไม่รองรับการวิเคราะห์ token/time ต่อผล detection.</w:t>
+      </w:r>
+    </w:p>
+    <w:p>
+      <w:pPr>
+        <w:pStyle w:val="ListBullet"/>
+      </w:pPr>
+      <w:r>
+        <w:t xml:space="preserve">Benchmark evaluation </w:t>
+      </w:r>
+      <w:r>
+        <w:t>ต่อ bug-technique key ไม่ได้ทำซ้ำทุก suite หลายรอบเพื่อวัด variance.</w:t>
+      </w:r>
+    </w:p>
+    <w:p>
+      <w:pPr>
+        <w:pStyle w:val="ListBullet"/>
+      </w:pPr>
+      <w:r>
         <w:t>ข้อสรุปจำกัดอยู่ที่ Java Defects4J catalog และ suites ที่ทีมส่งมอบใน snapshot นี้.</w:t>
       </w:r>
     </w:p>
@@ -10559,7 +10512,7 @@
       <w:pPr>
         <w:pStyle w:val="Heading1"/>
       </w:pPr>
-      <w:bookmarkStart w:id="22" w:name="_Toc241327386"/>
+      <w:bookmarkStart w:id="22" w:name="_Toc241349632"/>
       <w:r>
         <w:t>บทที่ 6 สรุปผลและการทำซ้ำ</w:t>
       </w:r>
@@ -10595,7 +10548,7 @@
         <w:t xml:space="preserve">RQ2: Native IPO </w:t>
       </w:r>
       <w:r>
-        <w:t>มี FDR ต่อ suite สูงสุดที่ 14.40%; Gemini ตรวจพบจำนวนบั๊กมากที่สุด 107/841 (12.72%). ตัวหารต่างกัน.</w:t>
+        <w:t>มี FDR ต่อ suite สูงสุดที่ 14.40%; Gemini ตรวจพบจำนวนบั๊กมากที่สุด 107/853 (12.54%). ตัวหารต่างกัน.</w:t>
       </w:r>
     </w:p>
     <w:p>
@@ -10663,7 +10616,10 @@
         <w:pStyle w:val="ListBullet"/>
       </w:pPr>
       <w:r>
-        <w:t>เจ้าของแต่ละเทคนิคยืนยันไฟล์ผู้สมัครที่ยังไม่ผ่าน manifest หรือ target matcher; Member 4 เพิ่ม suite ที่ได้รับการยืนยันเข้า evaluation และสร้าง master dataset ใหม่.</w:t>
+        <w:t xml:space="preserve">Member 3 </w:t>
+      </w:r>
+      <w:r>
+        <w:t>ตรวจ Math-13: แก้ package ให้ตรงกับ classes.modified ที่ Defects4J ยืนยัน หรือยืนยันว่าไม่มี suite ใช้ได้เพื่อคงสถานะ NO_SUITE; หากส่งไฟล์ใหม่ Member 4 ประเมินเฉพาะคีย์ที่เปลี่ยน.</w:t>
       </w:r>
     </w:p>
     <w:p>
@@ -10784,7 +10740,7 @@
       <w:pPr>
         <w:pStyle w:val="Heading1"/>
       </w:pPr>
-      <w:bookmarkStart w:id="23" w:name="_Toc241327387"/>
+      <w:bookmarkStart w:id="23" w:name="_Toc241349633"/>
       <w:r>
         <w:t>เอกสารอ้างอิง</w:t>
       </w:r>
@@ -10894,7 +10850,7 @@
       <w:pPr>
         <w:pStyle w:val="Heading1"/>
       </w:pPr>
-      <w:bookmarkStart w:id="24" w:name="_Toc241327388"/>
+      <w:bookmarkStart w:id="24" w:name="_Toc241349634"/>
       <w:r>
         <w:t>ภาคผนวก ก แหล่งข้อมูลและไฟล์ทำซ้ำ</w:t>
       </w:r>
@@ -11372,7 +11328,7 @@
               <w:rPr>
                 <w:sz w:val="16"/>
               </w:rPr>
-              <w:t>Combinatorial_IPO/Code/; Combinatorial_IPO/Results/verified_suites_manifest.json</w:t>
+              <w:t>Combinatorial_IPO/Code/; Combinatorial_IPO/Results/verified_suites_manifest.json; generation_manifest.json; routing_manifest.json</w:t>
             </w:r>
           </w:p>
         </w:tc>
@@ -11436,7 +11392,7 @@
               <w:rPr>
                 <w:sz w:val="16"/>
               </w:rPr>
-              <w:t>MIO_Algorithm/Code/batch_evosuite.py; MIO_Algorithm/Result_Round2/evosuite_budget_summary.csv</w:t>
+              <w:t>MIO_Algorithm/Code/batch_evosuite.py; MIO_Algorithm/Result_Round2/evosuite_budget_summary.csv; MIO_FAILURE_ANALYSIS_REPORT.md</w:t>
             </w:r>
           </w:p>
         </w:tc>
@@ -11566,7 +11522,7 @@
               <w:rPr>
                 <w:sz w:val="16"/>
               </w:rPr>
-              <w:t>scripts/run_benchmark.py; scripts/consolidate_master_results.py; scripts/advanced_data_analytics.py</w:t>
+              <w:t>scripts/run_benchmark.py; scripts/run_member3_delivery.py; scripts/consolidate_master_results.py; scripts/advanced_data_analytics.py; results/member3_delivery_logs/</w:t>
             </w:r>
           </w:p>
         </w:tc>
@@ -11578,7 +11534,7 @@
         <w:keepNext w:val="0"/>
         <w:jc w:val="center"/>
       </w:pPr>
-      <w:bookmarkStart w:id="25" w:name="_Toc241327401"/>
+      <w:bookmarkStart w:id="25" w:name="_Toc241349647"/>
       <w:r>
         <w:t xml:space="preserve">ตารางที่ </w:t>
       </w:r>
@@ -11617,7 +11573,7 @@
       <w:pPr>
         <w:pStyle w:val="Heading1"/>
       </w:pPr>
-      <w:bookmarkStart w:id="26" w:name="_Toc241327389"/>
+      <w:bookmarkStart w:id="26" w:name="_Toc241349635"/>
       <w:r>
         <w:t>ภาคผนวก ข ตัวอย่างการตรวจย้อนกลับ</w:t>
       </w:r>
@@ -12430,7 +12386,7 @@
         <w:keepNext w:val="0"/>
         <w:jc w:val="center"/>
       </w:pPr>
-      <w:bookmarkStart w:id="27" w:name="_Toc241327402"/>
+      <w:bookmarkStart w:id="27" w:name="_Toc241349648"/>
       <w:r>
         <w:t xml:space="preserve">ตารางที่ </w:t>
       </w:r>
@@ -12474,7 +12430,7 @@
       <w:pPr>
         <w:pStyle w:val="Heading1"/>
       </w:pPr>
-      <w:bookmarkStart w:id="28" w:name="_Toc241327390"/>
+      <w:bookmarkStart w:id="28" w:name="_Toc241349636"/>
       <w:r>
         <w:t>ภาคผนวก ค Data dictionary แบบย่อ</w:t>
       </w:r>
@@ -12958,83 +12914,7 @@
               <w:rPr>
                 <w:sz w:val="17"/>
               </w:rPr>
-              <w:t xml:space="preserve">DONE, COMPILE_ERROR </w:t>
-            </w:r>
-            <w:r>
-              <w:rPr>
-                <w:sz w:val="17"/>
-              </w:rPr>
-              <w:t>หรือ NO_SUITE ใน snapshot</w:t>
-            </w:r>
-          </w:p>
-        </w:tc>
-      </w:tr>
-      <w:tr>
-        <w:trPr>
-          <w:cantSplit/>
-          <w:jc w:val="center"/>
-        </w:trPr>
-        <w:tc>
-          <w:tcPr>
-            <w:tcW w:w="3240" w:type="dxa"/>
-            <w:tcBorders>
-              <w:top w:val="single" w:sz="4" w:space="0" w:color="D9E0E6"/>
-              <w:left w:val="single" w:sz="4" w:space="0" w:color="D9E0E6"/>
-              <w:bottom w:val="single" w:sz="4" w:space="0" w:color="D9E0E6"/>
-              <w:right w:val="single" w:sz="4" w:space="0" w:color="D9E0E6"/>
-            </w:tcBorders>
-            <w:tcMar>
-              <w:top w:w="60" w:type="dxa"/>
-              <w:left w:w="70" w:type="dxa"/>
-              <w:bottom w:w="60" w:type="dxa"/>
-              <w:right w:w="70" w:type="dxa"/>
-            </w:tcMar>
-            <w:vAlign w:val="center"/>
-          </w:tcPr>
-          <w:p>
-            <w:pPr>
-              <w:spacing w:after="0" w:line="259" w:lineRule="auto"/>
-            </w:pPr>
-            <w:r>
-              <w:rPr>
-                <w:sz w:val="17"/>
-              </w:rPr>
-              <w:t>Suite_SHA256, Run_ID, Timestamp, Run_Log</w:t>
-            </w:r>
-          </w:p>
-        </w:tc>
-        <w:tc>
-          <w:tcPr>
-            <w:tcW w:w="6408" w:type="dxa"/>
-            <w:tcBorders>
-              <w:top w:val="single" w:sz="4" w:space="0" w:color="D9E0E6"/>
-              <w:left w:val="single" w:sz="4" w:space="0" w:color="D9E0E6"/>
-              <w:bottom w:val="single" w:sz="4" w:space="0" w:color="D9E0E6"/>
-              <w:right w:val="single" w:sz="4" w:space="0" w:color="D9E0E6"/>
-            </w:tcBorders>
-            <w:tcMar>
-              <w:top w:w="60" w:type="dxa"/>
-              <w:left w:w="70" w:type="dxa"/>
-              <w:bottom w:w="60" w:type="dxa"/>
-              <w:right w:w="70" w:type="dxa"/>
-            </w:tcMar>
-            <w:vAlign w:val="center"/>
-          </w:tcPr>
-          <w:p>
-            <w:pPr>
-              <w:spacing w:after="0" w:line="259" w:lineRule="auto"/>
-            </w:pPr>
-            <w:r>
-              <w:rPr>
-                <w:sz w:val="17"/>
-              </w:rPr>
-              <w:t xml:space="preserve">provenance </w:t>
-            </w:r>
-            <w:r>
-              <w:rPr>
-                <w:sz w:val="17"/>
-              </w:rPr>
-              <w:t>และ structured log</w:t>
+              <w:t>สถานะ benchmark; สถานะ generation อยู่ใน audit; hash และ log อยู่ใน master</w:t>
             </w:r>
           </w:p>
         </w:tc>
@@ -13046,7 +12926,7 @@
         <w:keepNext w:val="0"/>
         <w:jc w:val="center"/>
       </w:pPr>
-      <w:bookmarkStart w:id="29" w:name="_Toc241327403"/>
+      <w:bookmarkStart w:id="29" w:name="_Toc241349649"/>
       <w:r>
         <w:t xml:space="preserve">ตารางที่ </w:t>
       </w:r>
@@ -13078,7 +12958,7 @@
     </w:p>
     <w:p>
       <w:pPr>
-        <w:spacing w:after="20"/>
+        <w:spacing w:after="0" w:line="20" w:lineRule="exact"/>
       </w:pPr>
     </w:p>
     <w:sectPr>
@@ -13349,31 +13229,31 @@
       </w:rPr>
     </w:lvl>
   </w:abstractNum>
-  <w:num w:numId="1" w16cid:durableId="2003854628">
+  <w:num w:numId="1" w16cid:durableId="969094827">
     <w:abstractNumId w:val="8"/>
   </w:num>
-  <w:num w:numId="2" w16cid:durableId="1694841520">
+  <w:num w:numId="2" w16cid:durableId="808673531">
     <w:abstractNumId w:val="6"/>
   </w:num>
-  <w:num w:numId="3" w16cid:durableId="446659009">
+  <w:num w:numId="3" w16cid:durableId="1063067964">
     <w:abstractNumId w:val="5"/>
   </w:num>
-  <w:num w:numId="4" w16cid:durableId="1687753875">
+  <w:num w:numId="4" w16cid:durableId="1613123810">
     <w:abstractNumId w:val="4"/>
   </w:num>
-  <w:num w:numId="5" w16cid:durableId="2127116845">
+  <w:num w:numId="5" w16cid:durableId="721758994">
     <w:abstractNumId w:val="7"/>
   </w:num>
-  <w:num w:numId="6" w16cid:durableId="56130570">
+  <w:num w:numId="6" w16cid:durableId="429662659">
     <w:abstractNumId w:val="3"/>
   </w:num>
-  <w:num w:numId="7" w16cid:durableId="891042605">
+  <w:num w:numId="7" w16cid:durableId="1830319857">
     <w:abstractNumId w:val="2"/>
   </w:num>
-  <w:num w:numId="8" w16cid:durableId="1485469185">
+  <w:num w:numId="8" w16cid:durableId="93475128">
     <w:abstractNumId w:val="1"/>
   </w:num>
-  <w:num w:numId="9" w16cid:durableId="382682344">
+  <w:num w:numId="9" w16cid:durableId="1166092660">
     <w:abstractNumId w:val="0"/>
   </w:num>
 </w:numbering>
@@ -24795,14 +24675,14 @@
     <w:autoRedefine/>
     <w:uiPriority w:val="39"/>
     <w:unhideWhenUsed/>
-    <w:rsid w:val="009A7950"/>
+    <w:rsid w:val="007F425E"/>
   </w:style>
   <w:style w:type="character" w:styleId="Hyperlink">
     <w:name w:val="Hyperlink"/>
     <w:basedOn w:val="DefaultParagraphFont"/>
     <w:uiPriority w:val="99"/>
     <w:unhideWhenUsed/>
-    <w:rsid w:val="009A7950"/>
+    <w:rsid w:val="007F425E"/>
     <w:rPr>
       <w:color w:val="0000FF" w:themeColor="hyperlink"/>
       <w:u w:val="single"/>
@@ -24814,7 +24694,7 @@
     <w:next w:val="Normal"/>
     <w:uiPriority w:val="99"/>
     <w:unhideWhenUsed/>
-    <w:rsid w:val="009A7950"/>
+    <w:rsid w:val="007F425E"/>
     <w:pPr>
       <w:spacing w:after="0"/>
     </w:pPr>

</xml_diff>

<commit_message>
docs: fix MIO evidence path in final report
</commit_message>
<xml_diff>
--- a/Final_Report.docx
+++ b/Final_Report.docx
@@ -12,7 +12,7 @@
           <w:noProof/>
         </w:rPr>
         <w:drawing>
-          <wp:inline distT="0" distB="0" distL="0" distR="0" wp14:anchorId="02735602" wp14:editId="1DB74BC5">
+          <wp:inline distT="0" distB="0" distL="0" distR="0" wp14:anchorId="2E8379C7" wp14:editId="04E387F6">
             <wp:extent cx="733363" cy="1298448"/>
             <wp:effectExtent l="0" t="0" r="0" b="0"/>
             <wp:docPr id="1" name="Picture 1"/>
@@ -246,7 +246,7 @@
       <w:pPr>
         <w:pStyle w:val="Heading1"/>
       </w:pPr>
-      <w:bookmarkStart w:id="0" w:name="_Toc241349623"/>
+      <w:bookmarkStart w:id="0" w:name="_Toc241351630"/>
       <w:r>
         <w:t>บทคัดย่อ</w:t>
       </w:r>
@@ -290,7 +290,7 @@
       <w:pPr>
         <w:pStyle w:val="Heading1"/>
       </w:pPr>
-      <w:bookmarkStart w:id="1" w:name="_Toc241349624"/>
+      <w:bookmarkStart w:id="1" w:name="_Toc241351631"/>
       <w:r>
         <w:t>สารบัญ</w:t>
       </w:r>
@@ -315,7 +315,7 @@
       <w:r>
         <w:fldChar w:fldCharType="separate"/>
       </w:r>
-      <w:hyperlink w:anchor="_Toc241349623" w:history="1">
+      <w:hyperlink w:anchor="_Toc241351630" w:history="1">
         <w:r>
           <w:rPr>
             <w:rStyle w:val="Hyperlink"/>
@@ -343,7 +343,7 @@
             <w:noProof/>
             <w:webHidden/>
           </w:rPr>
-          <w:instrText xml:space="preserve"> PAGEREF _Toc241349623 \h </w:instrText>
+          <w:instrText xml:space="preserve"> PAGEREF _Toc241351630 \h </w:instrText>
         </w:r>
         <w:r>
           <w:rPr>
@@ -387,7 +387,7 @@
           <w:noProof/>
         </w:rPr>
       </w:pPr>
-      <w:hyperlink w:anchor="_Toc241349624" w:history="1">
+      <w:hyperlink w:anchor="_Toc241351631" w:history="1">
         <w:r>
           <w:rPr>
             <w:rStyle w:val="Hyperlink"/>
@@ -415,7 +415,7 @@
             <w:noProof/>
             <w:webHidden/>
           </w:rPr>
-          <w:instrText xml:space="preserve"> PAGEREF _Toc241349624 \h </w:instrText>
+          <w:instrText xml:space="preserve"> PAGEREF _Toc241351631 \h </w:instrText>
         </w:r>
         <w:r>
           <w:rPr>
@@ -459,7 +459,7 @@
           <w:noProof/>
         </w:rPr>
       </w:pPr>
-      <w:hyperlink w:anchor="_Toc241349625" w:history="1">
+      <w:hyperlink w:anchor="_Toc241351632" w:history="1">
         <w:r>
           <w:rPr>
             <w:rStyle w:val="Hyperlink"/>
@@ -487,7 +487,7 @@
             <w:noProof/>
             <w:webHidden/>
           </w:rPr>
-          <w:instrText xml:space="preserve"> PAGEREF _Toc241349625 \h </w:instrText>
+          <w:instrText xml:space="preserve"> PAGEREF _Toc241351632 \h </w:instrText>
         </w:r>
         <w:r>
           <w:rPr>
@@ -531,7 +531,7 @@
           <w:noProof/>
         </w:rPr>
       </w:pPr>
-      <w:hyperlink w:anchor="_Toc241349626" w:history="1">
+      <w:hyperlink w:anchor="_Toc241351633" w:history="1">
         <w:r>
           <w:rPr>
             <w:rStyle w:val="Hyperlink"/>
@@ -559,7 +559,7 @@
             <w:noProof/>
             <w:webHidden/>
           </w:rPr>
-          <w:instrText xml:space="preserve"> PAGEREF _Toc241349626 \h </w:instrText>
+          <w:instrText xml:space="preserve"> PAGEREF _Toc241351633 \h </w:instrText>
         </w:r>
         <w:r>
           <w:rPr>
@@ -603,7 +603,7 @@
           <w:noProof/>
         </w:rPr>
       </w:pPr>
-      <w:hyperlink w:anchor="_Toc241349627" w:history="1">
+      <w:hyperlink w:anchor="_Toc241351634" w:history="1">
         <w:r>
           <w:rPr>
             <w:rStyle w:val="Hyperlink"/>
@@ -631,7 +631,7 @@
             <w:noProof/>
             <w:webHidden/>
           </w:rPr>
-          <w:instrText xml:space="preserve"> PAGEREF _Toc241349627 \h </w:instrText>
+          <w:instrText xml:space="preserve"> PAGEREF _Toc241351634 \h </w:instrText>
         </w:r>
         <w:r>
           <w:rPr>
@@ -675,7 +675,7 @@
           <w:noProof/>
         </w:rPr>
       </w:pPr>
-      <w:hyperlink w:anchor="_Toc241349628" w:history="1">
+      <w:hyperlink w:anchor="_Toc241351635" w:history="1">
         <w:r>
           <w:rPr>
             <w:rStyle w:val="Hyperlink"/>
@@ -703,7 +703,7 @@
             <w:noProof/>
             <w:webHidden/>
           </w:rPr>
-          <w:instrText xml:space="preserve"> PAGEREF _Toc241349628 \h </w:instrText>
+          <w:instrText xml:space="preserve"> PAGEREF _Toc241351635 \h </w:instrText>
         </w:r>
         <w:r>
           <w:rPr>
@@ -747,7 +747,7 @@
           <w:noProof/>
         </w:rPr>
       </w:pPr>
-      <w:hyperlink w:anchor="_Toc241349629" w:history="1">
+      <w:hyperlink w:anchor="_Toc241351636" w:history="1">
         <w:r>
           <w:rPr>
             <w:rStyle w:val="Hyperlink"/>
@@ -775,7 +775,7 @@
             <w:noProof/>
             <w:webHidden/>
           </w:rPr>
-          <w:instrText xml:space="preserve"> PAGEREF _Toc241349629 \h </w:instrText>
+          <w:instrText xml:space="preserve"> PAGEREF _Toc241351636 \h </w:instrText>
         </w:r>
         <w:r>
           <w:rPr>
@@ -819,7 +819,7 @@
           <w:noProof/>
         </w:rPr>
       </w:pPr>
-      <w:hyperlink w:anchor="_Toc241349630" w:history="1">
+      <w:hyperlink w:anchor="_Toc241351637" w:history="1">
         <w:r>
           <w:rPr>
             <w:rStyle w:val="Hyperlink"/>
@@ -847,7 +847,7 @@
             <w:noProof/>
             <w:webHidden/>
           </w:rPr>
-          <w:instrText xml:space="preserve"> PAGEREF _Toc241349630 \h </w:instrText>
+          <w:instrText xml:space="preserve"> PAGEREF _Toc241351637 \h </w:instrText>
         </w:r>
         <w:r>
           <w:rPr>
@@ -891,7 +891,7 @@
           <w:noProof/>
         </w:rPr>
       </w:pPr>
-      <w:hyperlink w:anchor="_Toc241349631" w:history="1">
+      <w:hyperlink w:anchor="_Toc241351638" w:history="1">
         <w:r>
           <w:rPr>
             <w:rStyle w:val="Hyperlink"/>
@@ -919,7 +919,7 @@
             <w:noProof/>
             <w:webHidden/>
           </w:rPr>
-          <w:instrText xml:space="preserve"> PAGEREF _Toc241349631 \h </w:instrText>
+          <w:instrText xml:space="preserve"> PAGEREF _Toc241351638 \h </w:instrText>
         </w:r>
         <w:r>
           <w:rPr>
@@ -963,7 +963,7 @@
           <w:noProof/>
         </w:rPr>
       </w:pPr>
-      <w:hyperlink w:anchor="_Toc241349632" w:history="1">
+      <w:hyperlink w:anchor="_Toc241351639" w:history="1">
         <w:r>
           <w:rPr>
             <w:rStyle w:val="Hyperlink"/>
@@ -991,7 +991,7 @@
             <w:noProof/>
             <w:webHidden/>
           </w:rPr>
-          <w:instrText xml:space="preserve"> PAGEREF _Toc241349632 \h </w:instrText>
+          <w:instrText xml:space="preserve"> PAGEREF _Toc241351639 \h </w:instrText>
         </w:r>
         <w:r>
           <w:rPr>
@@ -1035,7 +1035,7 @@
           <w:noProof/>
         </w:rPr>
       </w:pPr>
-      <w:hyperlink w:anchor="_Toc241349633" w:history="1">
+      <w:hyperlink w:anchor="_Toc241351640" w:history="1">
         <w:r>
           <w:rPr>
             <w:rStyle w:val="Hyperlink"/>
@@ -1063,7 +1063,7 @@
             <w:noProof/>
             <w:webHidden/>
           </w:rPr>
-          <w:instrText xml:space="preserve"> PAGEREF _Toc241349633 \h </w:instrText>
+          <w:instrText xml:space="preserve"> PAGEREF _Toc241351640 \h </w:instrText>
         </w:r>
         <w:r>
           <w:rPr>
@@ -1107,7 +1107,7 @@
           <w:noProof/>
         </w:rPr>
       </w:pPr>
-      <w:hyperlink w:anchor="_Toc241349634" w:history="1">
+      <w:hyperlink w:anchor="_Toc241351641" w:history="1">
         <w:r>
           <w:rPr>
             <w:rStyle w:val="Hyperlink"/>
@@ -1135,7 +1135,7 @@
             <w:noProof/>
             <w:webHidden/>
           </w:rPr>
-          <w:instrText xml:space="preserve"> PAGEREF _Toc241349634 \h </w:instrText>
+          <w:instrText xml:space="preserve"> PAGEREF _Toc241351641 \h </w:instrText>
         </w:r>
         <w:r>
           <w:rPr>
@@ -1179,7 +1179,7 @@
           <w:noProof/>
         </w:rPr>
       </w:pPr>
-      <w:hyperlink w:anchor="_Toc241349635" w:history="1">
+      <w:hyperlink w:anchor="_Toc241351642" w:history="1">
         <w:r>
           <w:rPr>
             <w:rStyle w:val="Hyperlink"/>
@@ -1207,7 +1207,7 @@
             <w:noProof/>
             <w:webHidden/>
           </w:rPr>
-          <w:instrText xml:space="preserve"> PAGEREF _Toc241349635 \h </w:instrText>
+          <w:instrText xml:space="preserve"> PAGEREF _Toc241351642 \h </w:instrText>
         </w:r>
         <w:r>
           <w:rPr>
@@ -1251,7 +1251,7 @@
           <w:noProof/>
         </w:rPr>
       </w:pPr>
-      <w:hyperlink w:anchor="_Toc241349636" w:history="1">
+      <w:hyperlink w:anchor="_Toc241351643" w:history="1">
         <w:r>
           <w:rPr>
             <w:rStyle w:val="Hyperlink"/>
@@ -1279,7 +1279,7 @@
             <w:noProof/>
             <w:webHidden/>
           </w:rPr>
-          <w:instrText xml:space="preserve"> PAGEREF _Toc241349636 \h </w:instrText>
+          <w:instrText xml:space="preserve"> PAGEREF _Toc241351643 \h </w:instrText>
         </w:r>
         <w:r>
           <w:rPr>
@@ -1327,7 +1327,7 @@
       <w:pPr>
         <w:pStyle w:val="Heading1"/>
       </w:pPr>
-      <w:bookmarkStart w:id="2" w:name="_Toc241349625"/>
+      <w:bookmarkStart w:id="2" w:name="_Toc241351632"/>
       <w:r>
         <w:t>สารบัญตาราง</w:t>
       </w:r>
@@ -1352,7 +1352,7 @@
       <w:r>
         <w:fldChar w:fldCharType="separate"/>
       </w:r>
-      <w:hyperlink w:anchor="_Toc241349637" w:history="1">
+      <w:hyperlink w:anchor="_Toc241351644" w:history="1">
         <w:r>
           <w:rPr>
             <w:rStyle w:val="Hyperlink"/>
@@ -1380,7 +1380,7 @@
             <w:noProof/>
             <w:webHidden/>
           </w:rPr>
-          <w:instrText xml:space="preserve"> PAGEREF _Toc241349637 \h </w:instrText>
+          <w:instrText xml:space="preserve"> PAGEREF _Toc241351644 \h </w:instrText>
         </w:r>
         <w:r>
           <w:rPr>
@@ -1424,7 +1424,7 @@
           <w:noProof/>
         </w:rPr>
       </w:pPr>
-      <w:hyperlink w:anchor="_Toc241349638" w:history="1">
+      <w:hyperlink w:anchor="_Toc241351645" w:history="1">
         <w:r>
           <w:rPr>
             <w:rStyle w:val="Hyperlink"/>
@@ -1452,7 +1452,7 @@
             <w:noProof/>
             <w:webHidden/>
           </w:rPr>
-          <w:instrText xml:space="preserve"> PAGEREF _Toc241349638 \h </w:instrText>
+          <w:instrText xml:space="preserve"> PAGEREF _Toc241351645 \h </w:instrText>
         </w:r>
         <w:r>
           <w:rPr>
@@ -1496,7 +1496,7 @@
           <w:noProof/>
         </w:rPr>
       </w:pPr>
-      <w:hyperlink w:anchor="_Toc241349639" w:history="1">
+      <w:hyperlink w:anchor="_Toc241351646" w:history="1">
         <w:r>
           <w:rPr>
             <w:rStyle w:val="Hyperlink"/>
@@ -1524,7 +1524,7 @@
             <w:noProof/>
             <w:webHidden/>
           </w:rPr>
-          <w:instrText xml:space="preserve"> PAGEREF _Toc241349639 \h </w:instrText>
+          <w:instrText xml:space="preserve"> PAGEREF _Toc241351646 \h </w:instrText>
         </w:r>
         <w:r>
           <w:rPr>
@@ -1568,7 +1568,7 @@
           <w:noProof/>
         </w:rPr>
       </w:pPr>
-      <w:hyperlink w:anchor="_Toc241349640" w:history="1">
+      <w:hyperlink w:anchor="_Toc241351647" w:history="1">
         <w:r>
           <w:rPr>
             <w:rStyle w:val="Hyperlink"/>
@@ -1596,7 +1596,7 @@
             <w:noProof/>
             <w:webHidden/>
           </w:rPr>
-          <w:instrText xml:space="preserve"> PAGEREF _Toc241349640 \h </w:instrText>
+          <w:instrText xml:space="preserve"> PAGEREF _Toc241351647 \h </w:instrText>
         </w:r>
         <w:r>
           <w:rPr>
@@ -1640,7 +1640,7 @@
           <w:noProof/>
         </w:rPr>
       </w:pPr>
-      <w:hyperlink w:anchor="_Toc241349641" w:history="1">
+      <w:hyperlink w:anchor="_Toc241351648" w:history="1">
         <w:r>
           <w:rPr>
             <w:rStyle w:val="Hyperlink"/>
@@ -1668,7 +1668,7 @@
             <w:noProof/>
             <w:webHidden/>
           </w:rPr>
-          <w:instrText xml:space="preserve"> PAGEREF _Toc241349641 \h </w:instrText>
+          <w:instrText xml:space="preserve"> PAGEREF _Toc241351648 \h </w:instrText>
         </w:r>
         <w:r>
           <w:rPr>
@@ -1712,7 +1712,7 @@
           <w:noProof/>
         </w:rPr>
       </w:pPr>
-      <w:hyperlink w:anchor="_Toc241349642" w:history="1">
+      <w:hyperlink w:anchor="_Toc241351649" w:history="1">
         <w:r>
           <w:rPr>
             <w:rStyle w:val="Hyperlink"/>
@@ -1740,7 +1740,7 @@
             <w:noProof/>
             <w:webHidden/>
           </w:rPr>
-          <w:instrText xml:space="preserve"> PAGEREF _Toc241349642 \h </w:instrText>
+          <w:instrText xml:space="preserve"> PAGEREF _Toc241351649 \h </w:instrText>
         </w:r>
         <w:r>
           <w:rPr>
@@ -1784,7 +1784,7 @@
           <w:noProof/>
         </w:rPr>
       </w:pPr>
-      <w:hyperlink w:anchor="_Toc241349643" w:history="1">
+      <w:hyperlink w:anchor="_Toc241351650" w:history="1">
         <w:r>
           <w:rPr>
             <w:rStyle w:val="Hyperlink"/>
@@ -1812,7 +1812,7 @@
             <w:noProof/>
             <w:webHidden/>
           </w:rPr>
-          <w:instrText xml:space="preserve"> PAGEREF _Toc241349643 \h </w:instrText>
+          <w:instrText xml:space="preserve"> PAGEREF _Toc241351650 \h </w:instrText>
         </w:r>
         <w:r>
           <w:rPr>
@@ -1856,7 +1856,7 @@
           <w:noProof/>
         </w:rPr>
       </w:pPr>
-      <w:hyperlink w:anchor="_Toc241349644" w:history="1">
+      <w:hyperlink w:anchor="_Toc241351651" w:history="1">
         <w:r>
           <w:rPr>
             <w:rStyle w:val="Hyperlink"/>
@@ -1884,7 +1884,7 @@
             <w:noProof/>
             <w:webHidden/>
           </w:rPr>
-          <w:instrText xml:space="preserve"> PAGEREF _Toc241349644 \h </w:instrText>
+          <w:instrText xml:space="preserve"> PAGEREF _Toc241351651 \h </w:instrText>
         </w:r>
         <w:r>
           <w:rPr>
@@ -1928,7 +1928,7 @@
           <w:noProof/>
         </w:rPr>
       </w:pPr>
-      <w:hyperlink w:anchor="_Toc241349645" w:history="1">
+      <w:hyperlink w:anchor="_Toc241351652" w:history="1">
         <w:r>
           <w:rPr>
             <w:rStyle w:val="Hyperlink"/>
@@ -1956,7 +1956,7 @@
             <w:noProof/>
             <w:webHidden/>
           </w:rPr>
-          <w:instrText xml:space="preserve"> PAGEREF _Toc241349645 \h </w:instrText>
+          <w:instrText xml:space="preserve"> PAGEREF _Toc241351652 \h </w:instrText>
         </w:r>
         <w:r>
           <w:rPr>
@@ -2000,7 +2000,7 @@
           <w:noProof/>
         </w:rPr>
       </w:pPr>
-      <w:hyperlink w:anchor="_Toc241349646" w:history="1">
+      <w:hyperlink w:anchor="_Toc241351653" w:history="1">
         <w:r>
           <w:rPr>
             <w:rStyle w:val="Hyperlink"/>
@@ -2028,7 +2028,7 @@
             <w:noProof/>
             <w:webHidden/>
           </w:rPr>
-          <w:instrText xml:space="preserve"> PAGEREF _Toc241349646 \h </w:instrText>
+          <w:instrText xml:space="preserve"> PAGEREF _Toc241351653 \h </w:instrText>
         </w:r>
         <w:r>
           <w:rPr>
@@ -2072,7 +2072,7 @@
           <w:noProof/>
         </w:rPr>
       </w:pPr>
-      <w:hyperlink w:anchor="_Toc241349647" w:history="1">
+      <w:hyperlink w:anchor="_Toc241351654" w:history="1">
         <w:r>
           <w:rPr>
             <w:rStyle w:val="Hyperlink"/>
@@ -2100,7 +2100,7 @@
             <w:noProof/>
             <w:webHidden/>
           </w:rPr>
-          <w:instrText xml:space="preserve"> PAGEREF _Toc241349647 \h </w:instrText>
+          <w:instrText xml:space="preserve"> PAGEREF _Toc241351654 \h </w:instrText>
         </w:r>
         <w:r>
           <w:rPr>
@@ -2144,7 +2144,7 @@
           <w:noProof/>
         </w:rPr>
       </w:pPr>
-      <w:hyperlink w:anchor="_Toc241349648" w:history="1">
+      <w:hyperlink w:anchor="_Toc241351655" w:history="1">
         <w:r>
           <w:rPr>
             <w:rStyle w:val="Hyperlink"/>
@@ -2172,7 +2172,7 @@
             <w:noProof/>
             <w:webHidden/>
           </w:rPr>
-          <w:instrText xml:space="preserve"> PAGEREF _Toc241349648 \h </w:instrText>
+          <w:instrText xml:space="preserve"> PAGEREF _Toc241351655 \h </w:instrText>
         </w:r>
         <w:r>
           <w:rPr>
@@ -2216,7 +2216,7 @@
           <w:noProof/>
         </w:rPr>
       </w:pPr>
-      <w:hyperlink w:anchor="_Toc241349649" w:history="1">
+      <w:hyperlink w:anchor="_Toc241351656" w:history="1">
         <w:r>
           <w:rPr>
             <w:rStyle w:val="Hyperlink"/>
@@ -2244,7 +2244,7 @@
             <w:noProof/>
             <w:webHidden/>
           </w:rPr>
-          <w:instrText xml:space="preserve"> PAGEREF _Toc241349649 \h </w:instrText>
+          <w:instrText xml:space="preserve"> PAGEREF _Toc241351656 \h </w:instrText>
         </w:r>
         <w:r>
           <w:rPr>
@@ -2287,7 +2287,7 @@
       <w:pPr>
         <w:pStyle w:val="Heading1"/>
       </w:pPr>
-      <w:bookmarkStart w:id="3" w:name="_Toc241349626"/>
+      <w:bookmarkStart w:id="3" w:name="_Toc241351633"/>
       <w:r>
         <w:t>สารบัญภาพ</w:t>
       </w:r>
@@ -2319,7 +2319,7 @@
       <w:r>
         <w:fldChar w:fldCharType="separate"/>
       </w:r>
-      <w:hyperlink w:anchor="_Toc241349650" w:history="1">
+      <w:hyperlink w:anchor="_Toc241351657" w:history="1">
         <w:r>
           <w:rPr>
             <w:rStyle w:val="Hyperlink"/>
@@ -2347,7 +2347,7 @@
             <w:noProof/>
             <w:webHidden/>
           </w:rPr>
-          <w:instrText xml:space="preserve"> PAGEREF _Toc241349650 \h </w:instrText>
+          <w:instrText xml:space="preserve"> PAGEREF _Toc241351657 \h </w:instrText>
         </w:r>
         <w:r>
           <w:rPr>
@@ -2398,7 +2398,7 @@
           <w14:ligatures w14:val="standardContextual"/>
         </w:rPr>
       </w:pPr>
-      <w:hyperlink w:anchor="_Toc241349651" w:history="1">
+      <w:hyperlink w:anchor="_Toc241351658" w:history="1">
         <w:r>
           <w:rPr>
             <w:rStyle w:val="Hyperlink"/>
@@ -2426,7 +2426,7 @@
             <w:noProof/>
             <w:webHidden/>
           </w:rPr>
-          <w:instrText xml:space="preserve"> PAGEREF _Toc241349651 \h </w:instrText>
+          <w:instrText xml:space="preserve"> PAGEREF _Toc241351658 \h </w:instrText>
         </w:r>
         <w:r>
           <w:rPr>
@@ -2477,7 +2477,7 @@
           <w14:ligatures w14:val="standardContextual"/>
         </w:rPr>
       </w:pPr>
-      <w:hyperlink w:anchor="_Toc241349652" w:history="1">
+      <w:hyperlink w:anchor="_Toc241351659" w:history="1">
         <w:r>
           <w:rPr>
             <w:rStyle w:val="Hyperlink"/>
@@ -2505,7 +2505,7 @@
             <w:noProof/>
             <w:webHidden/>
           </w:rPr>
-          <w:instrText xml:space="preserve"> PAGEREF _Toc241349652 \h </w:instrText>
+          <w:instrText xml:space="preserve"> PAGEREF _Toc241351659 \h </w:instrText>
         </w:r>
         <w:r>
           <w:rPr>
@@ -2553,7 +2553,7 @@
       <w:pPr>
         <w:pStyle w:val="Heading1"/>
       </w:pPr>
-      <w:bookmarkStart w:id="4" w:name="_Toc241349627"/>
+      <w:bookmarkStart w:id="4" w:name="_Toc241351634"/>
       <w:r>
         <w:t>บทที่ 1 บทนำและขอบเขตการศึกษา</w:t>
       </w:r>
@@ -3081,7 +3081,7 @@
         <w:keepNext w:val="0"/>
         <w:jc w:val="center"/>
       </w:pPr>
-      <w:bookmarkStart w:id="5" w:name="_Toc241349637"/>
+      <w:bookmarkStart w:id="5" w:name="_Toc241351644"/>
       <w:r>
         <w:t xml:space="preserve">ตารางที่ </w:t>
       </w:r>
@@ -3125,7 +3125,7 @@
       <w:pPr>
         <w:pStyle w:val="Heading1"/>
       </w:pPr>
-      <w:bookmarkStart w:id="6" w:name="_Toc241349628"/>
+      <w:bookmarkStart w:id="6" w:name="_Toc241351635"/>
       <w:r>
         <w:t>บทที่ 2 แนวทางสร้างชุดทดสอบ</w:t>
       </w:r>
@@ -3711,7 +3711,7 @@
         <w:keepNext w:val="0"/>
         <w:jc w:val="center"/>
       </w:pPr>
-      <w:bookmarkStart w:id="7" w:name="_Toc241349638"/>
+      <w:bookmarkStart w:id="7" w:name="_Toc241351645"/>
       <w:r>
         <w:t xml:space="preserve">ตารางที่ </w:t>
       </w:r>
@@ -3755,7 +3755,7 @@
       <w:pPr>
         <w:pStyle w:val="Heading1"/>
       </w:pPr>
-      <w:bookmarkStart w:id="8" w:name="_Toc241349629"/>
+      <w:bookmarkStart w:id="8" w:name="_Toc241351636"/>
       <w:r>
         <w:t>บทที่ 3 สภาพแวดล้อมและวิธีทดลอง</w:t>
       </w:r>
@@ -4229,7 +4229,7 @@
         <w:keepNext w:val="0"/>
         <w:jc w:val="center"/>
       </w:pPr>
-      <w:bookmarkStart w:id="9" w:name="_Toc241349639"/>
+      <w:bookmarkStart w:id="9" w:name="_Toc241351646"/>
       <w:r>
         <w:t xml:space="preserve">ตารางที่ </w:t>
       </w:r>
@@ -4778,7 +4778,7 @@
         <w:keepNext w:val="0"/>
         <w:jc w:val="center"/>
       </w:pPr>
-      <w:bookmarkStart w:id="10" w:name="_Toc241349640"/>
+      <w:bookmarkStart w:id="10" w:name="_Toc241351647"/>
       <w:r>
         <w:t xml:space="preserve">ตารางที่ </w:t>
       </w:r>
@@ -4825,7 +4825,7 @@
       <w:pPr>
         <w:pStyle w:val="Heading1"/>
       </w:pPr>
-      <w:bookmarkStart w:id="11" w:name="_Toc241349630"/>
+      <w:bookmarkStart w:id="11" w:name="_Toc241351637"/>
       <w:r>
         <w:t>บทที่ 4 ผลการทดลอง</w:t>
       </w:r>
@@ -6412,7 +6412,7 @@
         <w:keepNext w:val="0"/>
         <w:jc w:val="center"/>
       </w:pPr>
-      <w:bookmarkStart w:id="12" w:name="_Toc241349641"/>
+      <w:bookmarkStart w:id="12" w:name="_Toc241351648"/>
       <w:r>
         <w:t xml:space="preserve">ตารางที่ </w:t>
       </w:r>
@@ -6466,7 +6466,7 @@
           <w:noProof/>
         </w:rPr>
         <w:drawing>
-          <wp:inline distT="0" distB="0" distL="0" distR="0" wp14:anchorId="1BE28228" wp14:editId="5BA7F034">
+          <wp:inline distT="0" distB="0" distL="0" distR="0" wp14:anchorId="27E3927B" wp14:editId="60772F4E">
             <wp:extent cx="6126480" cy="3341716"/>
             <wp:effectExtent l="0" t="0" r="0" b="0"/>
             <wp:docPr id="2" name="Picture 2"/>
@@ -6508,7 +6508,7 @@
         <w:keepNext w:val="0"/>
         <w:jc w:val="center"/>
       </w:pPr>
-      <w:bookmarkStart w:id="13" w:name="_Toc241349650"/>
+      <w:bookmarkStart w:id="13" w:name="_Toc241351657"/>
       <w:r>
         <w:t xml:space="preserve">รูปที่ </w:t>
       </w:r>
@@ -7213,7 +7213,7 @@
         <w:keepNext w:val="0"/>
         <w:jc w:val="center"/>
       </w:pPr>
-      <w:bookmarkStart w:id="14" w:name="_Toc241349642"/>
+      <w:bookmarkStart w:id="14" w:name="_Toc241351649"/>
       <w:r>
         <w:t xml:space="preserve">ตารางที่ </w:t>
       </w:r>
@@ -7259,7 +7259,7 @@
           <w:noProof/>
         </w:rPr>
         <w:drawing>
-          <wp:inline distT="0" distB="0" distL="0" distR="0" wp14:anchorId="54B6D328" wp14:editId="04CF7E53">
+          <wp:inline distT="0" distB="0" distL="0" distR="0" wp14:anchorId="575EAD22" wp14:editId="6624DD79">
             <wp:extent cx="6126480" cy="3318510"/>
             <wp:effectExtent l="0" t="0" r="0" b="0"/>
             <wp:docPr id="3" name="Picture 3"/>
@@ -7301,7 +7301,7 @@
         <w:keepNext w:val="0"/>
         <w:jc w:val="center"/>
       </w:pPr>
-      <w:bookmarkStart w:id="15" w:name="_Toc241349651"/>
+      <w:bookmarkStart w:id="15" w:name="_Toc241351658"/>
       <w:r>
         <w:t xml:space="preserve">รูปที่ </w:t>
       </w:r>
@@ -8274,7 +8274,7 @@
         <w:keepNext w:val="0"/>
         <w:jc w:val="center"/>
       </w:pPr>
-      <w:bookmarkStart w:id="16" w:name="_Toc241349643"/>
+      <w:bookmarkStart w:id="16" w:name="_Toc241351650"/>
       <w:r>
         <w:t xml:space="preserve">ตารางที่ </w:t>
       </w:r>
@@ -8835,7 +8835,7 @@
         <w:keepNext w:val="0"/>
         <w:jc w:val="center"/>
       </w:pPr>
-      <w:bookmarkStart w:id="17" w:name="_Toc241349644"/>
+      <w:bookmarkStart w:id="17" w:name="_Toc241351651"/>
       <w:r>
         <w:t xml:space="preserve">ตารางที่ </w:t>
       </w:r>
@@ -8879,7 +8879,7 @@
       <w:pPr>
         <w:pStyle w:val="Heading1"/>
       </w:pPr>
-      <w:bookmarkStart w:id="18" w:name="_Toc241349631"/>
+      <w:bookmarkStart w:id="18" w:name="_Toc241351638"/>
       <w:r>
         <w:t>บทที่ 5 การวิเคราะห์และอภิปรายผล</w:t>
       </w:r>
@@ -9792,7 +9792,7 @@
         <w:keepNext w:val="0"/>
         <w:jc w:val="center"/>
       </w:pPr>
-      <w:bookmarkStart w:id="19" w:name="_Toc241349645"/>
+      <w:bookmarkStart w:id="19" w:name="_Toc241351652"/>
       <w:r>
         <w:t xml:space="preserve">ตารางที่ </w:t>
       </w:r>
@@ -10273,7 +10273,7 @@
         <w:keepNext w:val="0"/>
         <w:jc w:val="center"/>
       </w:pPr>
-      <w:bookmarkStart w:id="20" w:name="_Toc241349646"/>
+      <w:bookmarkStart w:id="20" w:name="_Toc241351653"/>
       <w:r>
         <w:t xml:space="preserve">ตารางที่ </w:t>
       </w:r>
@@ -10319,7 +10319,7 @@
           <w:noProof/>
         </w:rPr>
         <w:drawing>
-          <wp:inline distT="0" distB="0" distL="0" distR="0" wp14:anchorId="272DF2FF" wp14:editId="28CFE6FF">
+          <wp:inline distT="0" distB="0" distL="0" distR="0" wp14:anchorId="2F5148EB" wp14:editId="5C6730AB">
             <wp:extent cx="6126480" cy="2552700"/>
             <wp:effectExtent l="0" t="0" r="0" b="0"/>
             <wp:docPr id="4" name="Picture 4"/>
@@ -10361,7 +10361,7 @@
         <w:keepNext w:val="0"/>
         <w:jc w:val="center"/>
       </w:pPr>
-      <w:bookmarkStart w:id="21" w:name="_Toc241349652"/>
+      <w:bookmarkStart w:id="21" w:name="_Toc241351659"/>
       <w:r>
         <w:t xml:space="preserve">รูปที่ </w:t>
       </w:r>
@@ -10512,7 +10512,7 @@
       <w:pPr>
         <w:pStyle w:val="Heading1"/>
       </w:pPr>
-      <w:bookmarkStart w:id="22" w:name="_Toc241349632"/>
+      <w:bookmarkStart w:id="22" w:name="_Toc241351639"/>
       <w:r>
         <w:t>บทที่ 6 สรุปผลและการทำซ้ำ</w:t>
       </w:r>
@@ -10740,7 +10740,7 @@
       <w:pPr>
         <w:pStyle w:val="Heading1"/>
       </w:pPr>
-      <w:bookmarkStart w:id="23" w:name="_Toc241349633"/>
+      <w:bookmarkStart w:id="23" w:name="_Toc241351640"/>
       <w:r>
         <w:t>เอกสารอ้างอิง</w:t>
       </w:r>
@@ -10850,7 +10850,7 @@
       <w:pPr>
         <w:pStyle w:val="Heading1"/>
       </w:pPr>
-      <w:bookmarkStart w:id="24" w:name="_Toc241349634"/>
+      <w:bookmarkStart w:id="24" w:name="_Toc241351641"/>
       <w:r>
         <w:t>ภาคผนวก ก แหล่งข้อมูลและไฟล์ทำซ้ำ</w:t>
       </w:r>
@@ -11392,7 +11392,7 @@
               <w:rPr>
                 <w:sz w:val="16"/>
               </w:rPr>
-              <w:t>MIO_Algorithm/Code/batch_evosuite.py; MIO_Algorithm/Result_Round2/evosuite_budget_summary.csv; MIO_FAILURE_ANALYSIS_REPORT.md</w:t>
+              <w:t>MIO_Algorithm/Code/batch_evosuite.py; MIO_Algorithm/Result_Round2/evosuite_budget_summary.csv; MIO_Algorithm/MIO_FAILURE_ANALYSIS_REPORT.md</w:t>
             </w:r>
           </w:p>
         </w:tc>
@@ -11534,7 +11534,7 @@
         <w:keepNext w:val="0"/>
         <w:jc w:val="center"/>
       </w:pPr>
-      <w:bookmarkStart w:id="25" w:name="_Toc241349647"/>
+      <w:bookmarkStart w:id="25" w:name="_Toc241351654"/>
       <w:r>
         <w:t xml:space="preserve">ตารางที่ </w:t>
       </w:r>
@@ -11573,7 +11573,7 @@
       <w:pPr>
         <w:pStyle w:val="Heading1"/>
       </w:pPr>
-      <w:bookmarkStart w:id="26" w:name="_Toc241349635"/>
+      <w:bookmarkStart w:id="26" w:name="_Toc241351642"/>
       <w:r>
         <w:t>ภาคผนวก ข ตัวอย่างการตรวจย้อนกลับ</w:t>
       </w:r>
@@ -12386,7 +12386,7 @@
         <w:keepNext w:val="0"/>
         <w:jc w:val="center"/>
       </w:pPr>
-      <w:bookmarkStart w:id="27" w:name="_Toc241349648"/>
+      <w:bookmarkStart w:id="27" w:name="_Toc241351655"/>
       <w:r>
         <w:t xml:space="preserve">ตารางที่ </w:t>
       </w:r>
@@ -12430,7 +12430,7 @@
       <w:pPr>
         <w:pStyle w:val="Heading1"/>
       </w:pPr>
-      <w:bookmarkStart w:id="28" w:name="_Toc241349636"/>
+      <w:bookmarkStart w:id="28" w:name="_Toc241351643"/>
       <w:r>
         <w:t>ภาคผนวก ค Data dictionary แบบย่อ</w:t>
       </w:r>
@@ -12926,7 +12926,7 @@
         <w:keepNext w:val="0"/>
         <w:jc w:val="center"/>
       </w:pPr>
-      <w:bookmarkStart w:id="29" w:name="_Toc241349649"/>
+      <w:bookmarkStart w:id="29" w:name="_Toc241351656"/>
       <w:r>
         <w:t xml:space="preserve">ตารางที่ </w:t>
       </w:r>
@@ -13229,31 +13229,31 @@
       </w:rPr>
     </w:lvl>
   </w:abstractNum>
-  <w:num w:numId="1" w16cid:durableId="969094827">
+  <w:num w:numId="1" w16cid:durableId="115759159">
     <w:abstractNumId w:val="8"/>
   </w:num>
-  <w:num w:numId="2" w16cid:durableId="808673531">
+  <w:num w:numId="2" w16cid:durableId="367678844">
     <w:abstractNumId w:val="6"/>
   </w:num>
-  <w:num w:numId="3" w16cid:durableId="1063067964">
+  <w:num w:numId="3" w16cid:durableId="299269742">
     <w:abstractNumId w:val="5"/>
   </w:num>
-  <w:num w:numId="4" w16cid:durableId="1613123810">
+  <w:num w:numId="4" w16cid:durableId="1824733149">
     <w:abstractNumId w:val="4"/>
   </w:num>
-  <w:num w:numId="5" w16cid:durableId="721758994">
+  <w:num w:numId="5" w16cid:durableId="309680149">
     <w:abstractNumId w:val="7"/>
   </w:num>
-  <w:num w:numId="6" w16cid:durableId="429662659">
+  <w:num w:numId="6" w16cid:durableId="412555161">
     <w:abstractNumId w:val="3"/>
   </w:num>
-  <w:num w:numId="7" w16cid:durableId="1830319857">
+  <w:num w:numId="7" w16cid:durableId="471950189">
     <w:abstractNumId w:val="2"/>
   </w:num>
-  <w:num w:numId="8" w16cid:durableId="93475128">
+  <w:num w:numId="8" w16cid:durableId="715588632">
     <w:abstractNumId w:val="1"/>
   </w:num>
-  <w:num w:numId="9" w16cid:durableId="1166092660">
+  <w:num w:numId="9" w16cid:durableId="1638803412">
     <w:abstractNumId w:val="0"/>
   </w:num>
 </w:numbering>
@@ -24675,14 +24675,14 @@
     <w:autoRedefine/>
     <w:uiPriority w:val="39"/>
     <w:unhideWhenUsed/>
-    <w:rsid w:val="007F425E"/>
+    <w:rsid w:val="008F515F"/>
   </w:style>
   <w:style w:type="character" w:styleId="Hyperlink">
     <w:name w:val="Hyperlink"/>
     <w:basedOn w:val="DefaultParagraphFont"/>
     <w:uiPriority w:val="99"/>
     <w:unhideWhenUsed/>
-    <w:rsid w:val="007F425E"/>
+    <w:rsid w:val="008F515F"/>
     <w:rPr>
       <w:color w:val="0000FF" w:themeColor="hyperlink"/>
       <w:u w:val="single"/>
@@ -24694,7 +24694,7 @@
     <w:next w:val="Normal"/>
     <w:uiPriority w:val="99"/>
     <w:unhideWhenUsed/>
-    <w:rsid w:val="007F425E"/>
+    <w:rsid w:val="008F515F"/>
     <w:pPr>
       <w:spacing w:after="0"/>
     </w:pPr>

</xml_diff>

<commit_message>
Correct fixed-version regression classification and refresh report
</commit_message>
<xml_diff>
--- a/Final_Report.docx
+++ b/Final_Report.docx
@@ -12,7 +12,7 @@
           <w:noProof/>
         </w:rPr>
         <w:drawing>
-          <wp:inline distT="0" distB="0" distL="0" distR="0" wp14:anchorId="2E8379C7" wp14:editId="04E387F6">
+          <wp:inline distT="0" distB="0" distL="0" distR="0" wp14:anchorId="02650016" wp14:editId="77C10875">
             <wp:extent cx="733363" cy="1298448"/>
             <wp:effectExtent l="0" t="0" r="0" b="0"/>
             <wp:docPr id="1" name="Picture 1"/>
@@ -246,7 +246,7 @@
       <w:pPr>
         <w:pStyle w:val="Heading1"/>
       </w:pPr>
-      <w:bookmarkStart w:id="0" w:name="_Toc241351630"/>
+      <w:bookmarkStart w:id="0" w:name="_Toc241352713"/>
       <w:r>
         <w:t>บทคัดย่อ</w:t>
       </w:r>
@@ -290,7 +290,7 @@
       <w:pPr>
         <w:pStyle w:val="Heading1"/>
       </w:pPr>
-      <w:bookmarkStart w:id="1" w:name="_Toc241351631"/>
+      <w:bookmarkStart w:id="1" w:name="_Toc241352714"/>
       <w:r>
         <w:t>สารบัญ</w:t>
       </w:r>
@@ -315,7 +315,7 @@
       <w:r>
         <w:fldChar w:fldCharType="separate"/>
       </w:r>
-      <w:hyperlink w:anchor="_Toc241351630" w:history="1">
+      <w:hyperlink w:anchor="_Toc241352713" w:history="1">
         <w:r>
           <w:rPr>
             <w:rStyle w:val="Hyperlink"/>
@@ -343,7 +343,7 @@
             <w:noProof/>
             <w:webHidden/>
           </w:rPr>
-          <w:instrText xml:space="preserve"> PAGEREF _Toc241351630 \h </w:instrText>
+          <w:instrText xml:space="preserve"> PAGEREF _Toc241352713 \h </w:instrText>
         </w:r>
         <w:r>
           <w:rPr>
@@ -387,7 +387,7 @@
           <w:noProof/>
         </w:rPr>
       </w:pPr>
-      <w:hyperlink w:anchor="_Toc241351631" w:history="1">
+      <w:hyperlink w:anchor="_Toc241352714" w:history="1">
         <w:r>
           <w:rPr>
             <w:rStyle w:val="Hyperlink"/>
@@ -415,7 +415,7 @@
             <w:noProof/>
             <w:webHidden/>
           </w:rPr>
-          <w:instrText xml:space="preserve"> PAGEREF _Toc241351631 \h </w:instrText>
+          <w:instrText xml:space="preserve"> PAGEREF _Toc241352714 \h </w:instrText>
         </w:r>
         <w:r>
           <w:rPr>
@@ -459,7 +459,7 @@
           <w:noProof/>
         </w:rPr>
       </w:pPr>
-      <w:hyperlink w:anchor="_Toc241351632" w:history="1">
+      <w:hyperlink w:anchor="_Toc241352715" w:history="1">
         <w:r>
           <w:rPr>
             <w:rStyle w:val="Hyperlink"/>
@@ -487,7 +487,7 @@
             <w:noProof/>
             <w:webHidden/>
           </w:rPr>
-          <w:instrText xml:space="preserve"> PAGEREF _Toc241351632 \h </w:instrText>
+          <w:instrText xml:space="preserve"> PAGEREF _Toc241352715 \h </w:instrText>
         </w:r>
         <w:r>
           <w:rPr>
@@ -531,7 +531,7 @@
           <w:noProof/>
         </w:rPr>
       </w:pPr>
-      <w:hyperlink w:anchor="_Toc241351633" w:history="1">
+      <w:hyperlink w:anchor="_Toc241352716" w:history="1">
         <w:r>
           <w:rPr>
             <w:rStyle w:val="Hyperlink"/>
@@ -559,7 +559,7 @@
             <w:noProof/>
             <w:webHidden/>
           </w:rPr>
-          <w:instrText xml:space="preserve"> PAGEREF _Toc241351633 \h </w:instrText>
+          <w:instrText xml:space="preserve"> PAGEREF _Toc241352716 \h </w:instrText>
         </w:r>
         <w:r>
           <w:rPr>
@@ -603,7 +603,7 @@
           <w:noProof/>
         </w:rPr>
       </w:pPr>
-      <w:hyperlink w:anchor="_Toc241351634" w:history="1">
+      <w:hyperlink w:anchor="_Toc241352717" w:history="1">
         <w:r>
           <w:rPr>
             <w:rStyle w:val="Hyperlink"/>
@@ -631,7 +631,7 @@
             <w:noProof/>
             <w:webHidden/>
           </w:rPr>
-          <w:instrText xml:space="preserve"> PAGEREF _Toc241351634 \h </w:instrText>
+          <w:instrText xml:space="preserve"> PAGEREF _Toc241352717 \h </w:instrText>
         </w:r>
         <w:r>
           <w:rPr>
@@ -675,7 +675,7 @@
           <w:noProof/>
         </w:rPr>
       </w:pPr>
-      <w:hyperlink w:anchor="_Toc241351635" w:history="1">
+      <w:hyperlink w:anchor="_Toc241352718" w:history="1">
         <w:r>
           <w:rPr>
             <w:rStyle w:val="Hyperlink"/>
@@ -703,7 +703,7 @@
             <w:noProof/>
             <w:webHidden/>
           </w:rPr>
-          <w:instrText xml:space="preserve"> PAGEREF _Toc241351635 \h </w:instrText>
+          <w:instrText xml:space="preserve"> PAGEREF _Toc241352718 \h </w:instrText>
         </w:r>
         <w:r>
           <w:rPr>
@@ -747,7 +747,7 @@
           <w:noProof/>
         </w:rPr>
       </w:pPr>
-      <w:hyperlink w:anchor="_Toc241351636" w:history="1">
+      <w:hyperlink w:anchor="_Toc241352719" w:history="1">
         <w:r>
           <w:rPr>
             <w:rStyle w:val="Hyperlink"/>
@@ -775,7 +775,7 @@
             <w:noProof/>
             <w:webHidden/>
           </w:rPr>
-          <w:instrText xml:space="preserve"> PAGEREF _Toc241351636 \h </w:instrText>
+          <w:instrText xml:space="preserve"> PAGEREF _Toc241352719 \h </w:instrText>
         </w:r>
         <w:r>
           <w:rPr>
@@ -819,7 +819,7 @@
           <w:noProof/>
         </w:rPr>
       </w:pPr>
-      <w:hyperlink w:anchor="_Toc241351637" w:history="1">
+      <w:hyperlink w:anchor="_Toc241352720" w:history="1">
         <w:r>
           <w:rPr>
             <w:rStyle w:val="Hyperlink"/>
@@ -847,7 +847,7 @@
             <w:noProof/>
             <w:webHidden/>
           </w:rPr>
-          <w:instrText xml:space="preserve"> PAGEREF _Toc241351637 \h </w:instrText>
+          <w:instrText xml:space="preserve"> PAGEREF _Toc241352720 \h </w:instrText>
         </w:r>
         <w:r>
           <w:rPr>
@@ -891,7 +891,7 @@
           <w:noProof/>
         </w:rPr>
       </w:pPr>
-      <w:hyperlink w:anchor="_Toc241351638" w:history="1">
+      <w:hyperlink w:anchor="_Toc241352721" w:history="1">
         <w:r>
           <w:rPr>
             <w:rStyle w:val="Hyperlink"/>
@@ -919,7 +919,7 @@
             <w:noProof/>
             <w:webHidden/>
           </w:rPr>
-          <w:instrText xml:space="preserve"> PAGEREF _Toc241351638 \h </w:instrText>
+          <w:instrText xml:space="preserve"> PAGEREF _Toc241352721 \h </w:instrText>
         </w:r>
         <w:r>
           <w:rPr>
@@ -963,7 +963,7 @@
           <w:noProof/>
         </w:rPr>
       </w:pPr>
-      <w:hyperlink w:anchor="_Toc241351639" w:history="1">
+      <w:hyperlink w:anchor="_Toc241352722" w:history="1">
         <w:r>
           <w:rPr>
             <w:rStyle w:val="Hyperlink"/>
@@ -991,7 +991,7 @@
             <w:noProof/>
             <w:webHidden/>
           </w:rPr>
-          <w:instrText xml:space="preserve"> PAGEREF _Toc241351639 \h </w:instrText>
+          <w:instrText xml:space="preserve"> PAGEREF _Toc241352722 \h </w:instrText>
         </w:r>
         <w:r>
           <w:rPr>
@@ -1035,7 +1035,7 @@
           <w:noProof/>
         </w:rPr>
       </w:pPr>
-      <w:hyperlink w:anchor="_Toc241351640" w:history="1">
+      <w:hyperlink w:anchor="_Toc241352723" w:history="1">
         <w:r>
           <w:rPr>
             <w:rStyle w:val="Hyperlink"/>
@@ -1063,7 +1063,7 @@
             <w:noProof/>
             <w:webHidden/>
           </w:rPr>
-          <w:instrText xml:space="preserve"> PAGEREF _Toc241351640 \h </w:instrText>
+          <w:instrText xml:space="preserve"> PAGEREF _Toc241352723 \h </w:instrText>
         </w:r>
         <w:r>
           <w:rPr>
@@ -1107,7 +1107,7 @@
           <w:noProof/>
         </w:rPr>
       </w:pPr>
-      <w:hyperlink w:anchor="_Toc241351641" w:history="1">
+      <w:hyperlink w:anchor="_Toc241352724" w:history="1">
         <w:r>
           <w:rPr>
             <w:rStyle w:val="Hyperlink"/>
@@ -1135,7 +1135,7 @@
             <w:noProof/>
             <w:webHidden/>
           </w:rPr>
-          <w:instrText xml:space="preserve"> PAGEREF _Toc241351641 \h </w:instrText>
+          <w:instrText xml:space="preserve"> PAGEREF _Toc241352724 \h </w:instrText>
         </w:r>
         <w:r>
           <w:rPr>
@@ -1179,7 +1179,7 @@
           <w:noProof/>
         </w:rPr>
       </w:pPr>
-      <w:hyperlink w:anchor="_Toc241351642" w:history="1">
+      <w:hyperlink w:anchor="_Toc241352725" w:history="1">
         <w:r>
           <w:rPr>
             <w:rStyle w:val="Hyperlink"/>
@@ -1207,7 +1207,7 @@
             <w:noProof/>
             <w:webHidden/>
           </w:rPr>
-          <w:instrText xml:space="preserve"> PAGEREF _Toc241351642 \h </w:instrText>
+          <w:instrText xml:space="preserve"> PAGEREF _Toc241352725 \h </w:instrText>
         </w:r>
         <w:r>
           <w:rPr>
@@ -1251,7 +1251,7 @@
           <w:noProof/>
         </w:rPr>
       </w:pPr>
-      <w:hyperlink w:anchor="_Toc241351643" w:history="1">
+      <w:hyperlink w:anchor="_Toc241352726" w:history="1">
         <w:r>
           <w:rPr>
             <w:rStyle w:val="Hyperlink"/>
@@ -1279,7 +1279,7 @@
             <w:noProof/>
             <w:webHidden/>
           </w:rPr>
-          <w:instrText xml:space="preserve"> PAGEREF _Toc241351643 \h </w:instrText>
+          <w:instrText xml:space="preserve"> PAGEREF _Toc241352726 \h </w:instrText>
         </w:r>
         <w:r>
           <w:rPr>
@@ -1327,7 +1327,7 @@
       <w:pPr>
         <w:pStyle w:val="Heading1"/>
       </w:pPr>
-      <w:bookmarkStart w:id="2" w:name="_Toc241351632"/>
+      <w:bookmarkStart w:id="2" w:name="_Toc241352715"/>
       <w:r>
         <w:t>สารบัญตาราง</w:t>
       </w:r>
@@ -1352,7 +1352,7 @@
       <w:r>
         <w:fldChar w:fldCharType="separate"/>
       </w:r>
-      <w:hyperlink w:anchor="_Toc241351644" w:history="1">
+      <w:hyperlink w:anchor="_Toc241352727" w:history="1">
         <w:r>
           <w:rPr>
             <w:rStyle w:val="Hyperlink"/>
@@ -1380,7 +1380,7 @@
             <w:noProof/>
             <w:webHidden/>
           </w:rPr>
-          <w:instrText xml:space="preserve"> PAGEREF _Toc241351644 \h </w:instrText>
+          <w:instrText xml:space="preserve"> PAGEREF _Toc241352727 \h </w:instrText>
         </w:r>
         <w:r>
           <w:rPr>
@@ -1424,7 +1424,7 @@
           <w:noProof/>
         </w:rPr>
       </w:pPr>
-      <w:hyperlink w:anchor="_Toc241351645" w:history="1">
+      <w:hyperlink w:anchor="_Toc241352728" w:history="1">
         <w:r>
           <w:rPr>
             <w:rStyle w:val="Hyperlink"/>
@@ -1452,7 +1452,7 @@
             <w:noProof/>
             <w:webHidden/>
           </w:rPr>
-          <w:instrText xml:space="preserve"> PAGEREF _Toc241351645 \h </w:instrText>
+          <w:instrText xml:space="preserve"> PAGEREF _Toc241352728 \h </w:instrText>
         </w:r>
         <w:r>
           <w:rPr>
@@ -1496,7 +1496,7 @@
           <w:noProof/>
         </w:rPr>
       </w:pPr>
-      <w:hyperlink w:anchor="_Toc241351646" w:history="1">
+      <w:hyperlink w:anchor="_Toc241352729" w:history="1">
         <w:r>
           <w:rPr>
             <w:rStyle w:val="Hyperlink"/>
@@ -1524,7 +1524,7 @@
             <w:noProof/>
             <w:webHidden/>
           </w:rPr>
-          <w:instrText xml:space="preserve"> PAGEREF _Toc241351646 \h </w:instrText>
+          <w:instrText xml:space="preserve"> PAGEREF _Toc241352729 \h </w:instrText>
         </w:r>
         <w:r>
           <w:rPr>
@@ -1568,7 +1568,7 @@
           <w:noProof/>
         </w:rPr>
       </w:pPr>
-      <w:hyperlink w:anchor="_Toc241351647" w:history="1">
+      <w:hyperlink w:anchor="_Toc241352730" w:history="1">
         <w:r>
           <w:rPr>
             <w:rStyle w:val="Hyperlink"/>
@@ -1596,7 +1596,7 @@
             <w:noProof/>
             <w:webHidden/>
           </w:rPr>
-          <w:instrText xml:space="preserve"> PAGEREF _Toc241351647 \h </w:instrText>
+          <w:instrText xml:space="preserve"> PAGEREF _Toc241352730 \h </w:instrText>
         </w:r>
         <w:r>
           <w:rPr>
@@ -1640,7 +1640,7 @@
           <w:noProof/>
         </w:rPr>
       </w:pPr>
-      <w:hyperlink w:anchor="_Toc241351648" w:history="1">
+      <w:hyperlink w:anchor="_Toc241352731" w:history="1">
         <w:r>
           <w:rPr>
             <w:rStyle w:val="Hyperlink"/>
@@ -1668,7 +1668,7 @@
             <w:noProof/>
             <w:webHidden/>
           </w:rPr>
-          <w:instrText xml:space="preserve"> PAGEREF _Toc241351648 \h </w:instrText>
+          <w:instrText xml:space="preserve"> PAGEREF _Toc241352731 \h </w:instrText>
         </w:r>
         <w:r>
           <w:rPr>
@@ -1712,7 +1712,7 @@
           <w:noProof/>
         </w:rPr>
       </w:pPr>
-      <w:hyperlink w:anchor="_Toc241351649" w:history="1">
+      <w:hyperlink w:anchor="_Toc241352732" w:history="1">
         <w:r>
           <w:rPr>
             <w:rStyle w:val="Hyperlink"/>
@@ -1740,7 +1740,7 @@
             <w:noProof/>
             <w:webHidden/>
           </w:rPr>
-          <w:instrText xml:space="preserve"> PAGEREF _Toc241351649 \h </w:instrText>
+          <w:instrText xml:space="preserve"> PAGEREF _Toc241352732 \h </w:instrText>
         </w:r>
         <w:r>
           <w:rPr>
@@ -1784,7 +1784,7 @@
           <w:noProof/>
         </w:rPr>
       </w:pPr>
-      <w:hyperlink w:anchor="_Toc241351650" w:history="1">
+      <w:hyperlink w:anchor="_Toc241352733" w:history="1">
         <w:r>
           <w:rPr>
             <w:rStyle w:val="Hyperlink"/>
@@ -1812,7 +1812,7 @@
             <w:noProof/>
             <w:webHidden/>
           </w:rPr>
-          <w:instrText xml:space="preserve"> PAGEREF _Toc241351650 \h </w:instrText>
+          <w:instrText xml:space="preserve"> PAGEREF _Toc241352733 \h </w:instrText>
         </w:r>
         <w:r>
           <w:rPr>
@@ -1856,7 +1856,7 @@
           <w:noProof/>
         </w:rPr>
       </w:pPr>
-      <w:hyperlink w:anchor="_Toc241351651" w:history="1">
+      <w:hyperlink w:anchor="_Toc241352734" w:history="1">
         <w:r>
           <w:rPr>
             <w:rStyle w:val="Hyperlink"/>
@@ -1884,7 +1884,7 @@
             <w:noProof/>
             <w:webHidden/>
           </w:rPr>
-          <w:instrText xml:space="preserve"> PAGEREF _Toc241351651 \h </w:instrText>
+          <w:instrText xml:space="preserve"> PAGEREF _Toc241352734 \h </w:instrText>
         </w:r>
         <w:r>
           <w:rPr>
@@ -1928,7 +1928,7 @@
           <w:noProof/>
         </w:rPr>
       </w:pPr>
-      <w:hyperlink w:anchor="_Toc241351652" w:history="1">
+      <w:hyperlink w:anchor="_Toc241352735" w:history="1">
         <w:r>
           <w:rPr>
             <w:rStyle w:val="Hyperlink"/>
@@ -1956,7 +1956,7 @@
             <w:noProof/>
             <w:webHidden/>
           </w:rPr>
-          <w:instrText xml:space="preserve"> PAGEREF _Toc241351652 \h </w:instrText>
+          <w:instrText xml:space="preserve"> PAGEREF _Toc241352735 \h </w:instrText>
         </w:r>
         <w:r>
           <w:rPr>
@@ -2000,7 +2000,7 @@
           <w:noProof/>
         </w:rPr>
       </w:pPr>
-      <w:hyperlink w:anchor="_Toc241351653" w:history="1">
+      <w:hyperlink w:anchor="_Toc241352736" w:history="1">
         <w:r>
           <w:rPr>
             <w:rStyle w:val="Hyperlink"/>
@@ -2028,7 +2028,7 @@
             <w:noProof/>
             <w:webHidden/>
           </w:rPr>
-          <w:instrText xml:space="preserve"> PAGEREF _Toc241351653 \h </w:instrText>
+          <w:instrText xml:space="preserve"> PAGEREF _Toc241352736 \h </w:instrText>
         </w:r>
         <w:r>
           <w:rPr>
@@ -2072,7 +2072,7 @@
           <w:noProof/>
         </w:rPr>
       </w:pPr>
-      <w:hyperlink w:anchor="_Toc241351654" w:history="1">
+      <w:hyperlink w:anchor="_Toc241352737" w:history="1">
         <w:r>
           <w:rPr>
             <w:rStyle w:val="Hyperlink"/>
@@ -2100,7 +2100,7 @@
             <w:noProof/>
             <w:webHidden/>
           </w:rPr>
-          <w:instrText xml:space="preserve"> PAGEREF _Toc241351654 \h </w:instrText>
+          <w:instrText xml:space="preserve"> PAGEREF _Toc241352737 \h </w:instrText>
         </w:r>
         <w:r>
           <w:rPr>
@@ -2144,7 +2144,7 @@
           <w:noProof/>
         </w:rPr>
       </w:pPr>
-      <w:hyperlink w:anchor="_Toc241351655" w:history="1">
+      <w:hyperlink w:anchor="_Toc241352738" w:history="1">
         <w:r>
           <w:rPr>
             <w:rStyle w:val="Hyperlink"/>
@@ -2172,7 +2172,7 @@
             <w:noProof/>
             <w:webHidden/>
           </w:rPr>
-          <w:instrText xml:space="preserve"> PAGEREF _Toc241351655 \h </w:instrText>
+          <w:instrText xml:space="preserve"> PAGEREF _Toc241352738 \h </w:instrText>
         </w:r>
         <w:r>
           <w:rPr>
@@ -2216,7 +2216,7 @@
           <w:noProof/>
         </w:rPr>
       </w:pPr>
-      <w:hyperlink w:anchor="_Toc241351656" w:history="1">
+      <w:hyperlink w:anchor="_Toc241352739" w:history="1">
         <w:r>
           <w:rPr>
             <w:rStyle w:val="Hyperlink"/>
@@ -2244,7 +2244,7 @@
             <w:noProof/>
             <w:webHidden/>
           </w:rPr>
-          <w:instrText xml:space="preserve"> PAGEREF _Toc241351656 \h </w:instrText>
+          <w:instrText xml:space="preserve"> PAGEREF _Toc241352739 \h </w:instrText>
         </w:r>
         <w:r>
           <w:rPr>
@@ -2287,7 +2287,7 @@
       <w:pPr>
         <w:pStyle w:val="Heading1"/>
       </w:pPr>
-      <w:bookmarkStart w:id="3" w:name="_Toc241351633"/>
+      <w:bookmarkStart w:id="3" w:name="_Toc241352716"/>
       <w:r>
         <w:t>สารบัญภาพ</w:t>
       </w:r>
@@ -2319,7 +2319,7 @@
       <w:r>
         <w:fldChar w:fldCharType="separate"/>
       </w:r>
-      <w:hyperlink w:anchor="_Toc241351657" w:history="1">
+      <w:hyperlink w:anchor="_Toc241352740" w:history="1">
         <w:r>
           <w:rPr>
             <w:rStyle w:val="Hyperlink"/>
@@ -2347,7 +2347,7 @@
             <w:noProof/>
             <w:webHidden/>
           </w:rPr>
-          <w:instrText xml:space="preserve"> PAGEREF _Toc241351657 \h </w:instrText>
+          <w:instrText xml:space="preserve"> PAGEREF _Toc241352740 \h </w:instrText>
         </w:r>
         <w:r>
           <w:rPr>
@@ -2398,7 +2398,7 @@
           <w14:ligatures w14:val="standardContextual"/>
         </w:rPr>
       </w:pPr>
-      <w:hyperlink w:anchor="_Toc241351658" w:history="1">
+      <w:hyperlink w:anchor="_Toc241352741" w:history="1">
         <w:r>
           <w:rPr>
             <w:rStyle w:val="Hyperlink"/>
@@ -2426,7 +2426,7 @@
             <w:noProof/>
             <w:webHidden/>
           </w:rPr>
-          <w:instrText xml:space="preserve"> PAGEREF _Toc241351658 \h </w:instrText>
+          <w:instrText xml:space="preserve"> PAGEREF _Toc241352741 \h </w:instrText>
         </w:r>
         <w:r>
           <w:rPr>
@@ -2477,7 +2477,7 @@
           <w14:ligatures w14:val="standardContextual"/>
         </w:rPr>
       </w:pPr>
-      <w:hyperlink w:anchor="_Toc241351659" w:history="1">
+      <w:hyperlink w:anchor="_Toc241352742" w:history="1">
         <w:r>
           <w:rPr>
             <w:rStyle w:val="Hyperlink"/>
@@ -2505,7 +2505,7 @@
             <w:noProof/>
             <w:webHidden/>
           </w:rPr>
-          <w:instrText xml:space="preserve"> PAGEREF _Toc241351659 \h </w:instrText>
+          <w:instrText xml:space="preserve"> PAGEREF _Toc241352742 \h </w:instrText>
         </w:r>
         <w:r>
           <w:rPr>
@@ -2553,7 +2553,7 @@
       <w:pPr>
         <w:pStyle w:val="Heading1"/>
       </w:pPr>
-      <w:bookmarkStart w:id="4" w:name="_Toc241351634"/>
+      <w:bookmarkStart w:id="4" w:name="_Toc241352717"/>
       <w:r>
         <w:t>บทที่ 1 บทนำและขอบเขตการศึกษา</w:t>
       </w:r>
@@ -3081,7 +3081,7 @@
         <w:keepNext w:val="0"/>
         <w:jc w:val="center"/>
       </w:pPr>
-      <w:bookmarkStart w:id="5" w:name="_Toc241351644"/>
+      <w:bookmarkStart w:id="5" w:name="_Toc241352727"/>
       <w:r>
         <w:t xml:space="preserve">ตารางที่ </w:t>
       </w:r>
@@ -3125,7 +3125,7 @@
       <w:pPr>
         <w:pStyle w:val="Heading1"/>
       </w:pPr>
-      <w:bookmarkStart w:id="6" w:name="_Toc241351635"/>
+      <w:bookmarkStart w:id="6" w:name="_Toc241352718"/>
       <w:r>
         <w:t>บทที่ 2 แนวทางสร้างชุดทดสอบ</w:t>
       </w:r>
@@ -3711,7 +3711,7 @@
         <w:keepNext w:val="0"/>
         <w:jc w:val="center"/>
       </w:pPr>
-      <w:bookmarkStart w:id="7" w:name="_Toc241351645"/>
+      <w:bookmarkStart w:id="7" w:name="_Toc241352728"/>
       <w:r>
         <w:t xml:space="preserve">ตารางที่ </w:t>
       </w:r>
@@ -3755,7 +3755,7 @@
       <w:pPr>
         <w:pStyle w:val="Heading1"/>
       </w:pPr>
-      <w:bookmarkStart w:id="8" w:name="_Toc241351636"/>
+      <w:bookmarkStart w:id="8" w:name="_Toc241352719"/>
       <w:r>
         <w:t>บทที่ 3 สภาพแวดล้อมและวิธีทดลอง</w:t>
       </w:r>
@@ -4229,7 +4229,7 @@
         <w:keepNext w:val="0"/>
         <w:jc w:val="center"/>
       </w:pPr>
-      <w:bookmarkStart w:id="9" w:name="_Toc241351646"/>
+      <w:bookmarkStart w:id="9" w:name="_Toc241352729"/>
       <w:r>
         <w:t xml:space="preserve">ตารางที่ </w:t>
       </w:r>
@@ -4778,7 +4778,7 @@
         <w:keepNext w:val="0"/>
         <w:jc w:val="center"/>
       </w:pPr>
-      <w:bookmarkStart w:id="10" w:name="_Toc241351647"/>
+      <w:bookmarkStart w:id="10" w:name="_Toc241352730"/>
       <w:r>
         <w:t xml:space="preserve">ตารางที่ </w:t>
       </w:r>
@@ -4825,7 +4825,7 @@
       <w:pPr>
         <w:pStyle w:val="Heading1"/>
       </w:pPr>
-      <w:bookmarkStart w:id="11" w:name="_Toc241351637"/>
+      <w:bookmarkStart w:id="11" w:name="_Toc241352720"/>
       <w:r>
         <w:t>บทที่ 4 ผลการทดลอง</w:t>
       </w:r>
@@ -4847,7 +4847,7 @@
         <w:t xml:space="preserve">Catalog </w:t>
       </w:r>
       <w:r>
-        <w:t>มี 854 บั๊ก × 4 เทคนิค รวม 3,416 คีย์ไม่ซ้ำ. มี suite และผลประเมิน 2,797 รายการ; 619 รายการไม่มี suite. สถานะมี 1,665 DONE, 1,132 COMPILE_ERROR และ 0 TIMEOUT. ในผลที่รันได้มี 160 BUG_DETECTED, 830 NOT_DETECTED และ 675 FLAKY_OR_REGRESSION; unresolved outcomes 0.</w:t>
+        <w:t>มี 854 บั๊ก × 4 เทคนิค รวม 3,416 คีย์ไม่ซ้ำ. มี suite และผลประเมิน 2,797 รายการ; 619 รายการไม่มี suite. สถานะมี 1,665 DONE, 1,132 COMPILE_ERROR และ 0 TIMEOUT. ในผลที่รันได้มี 160 BUG_DETECTED, 711 NOT_DETECTED และ 794 FLAKY_OR_REGRESSION; unresolved outcomes 0.</w:t>
       </w:r>
     </w:p>
     <w:tbl>
@@ -5708,7 +5708,7 @@
               <w:rPr>
                 <w:sz w:val="14"/>
               </w:rPr>
-              <w:t>176</w:t>
+              <w:t>291</w:t>
             </w:r>
           </w:p>
         </w:tc>
@@ -5738,7 +5738,7 @@
               <w:rPr>
                 <w:sz w:val="14"/>
               </w:rPr>
-              <w:t>616</w:t>
+              <w:t>501</w:t>
             </w:r>
           </w:p>
         </w:tc>
@@ -6007,7 +6007,7 @@
               <w:rPr>
                 <w:sz w:val="14"/>
               </w:rPr>
-              <w:t>175</w:t>
+              <w:t>177</w:t>
             </w:r>
           </w:p>
         </w:tc>
@@ -6036,7 +6036,7 @@
               <w:rPr>
                 <w:sz w:val="14"/>
               </w:rPr>
-              <w:t>6</w:t>
+              <w:t>4</w:t>
             </w:r>
           </w:p>
         </w:tc>
@@ -6310,7 +6310,7 @@
               <w:rPr>
                 <w:sz w:val="14"/>
               </w:rPr>
-              <w:t>306</w:t>
+              <w:t>308</w:t>
             </w:r>
           </w:p>
         </w:tc>
@@ -6340,7 +6340,7 @@
               <w:rPr>
                 <w:sz w:val="14"/>
               </w:rPr>
-              <w:t>11</w:t>
+              <w:t>9</w:t>
             </w:r>
           </w:p>
         </w:tc>
@@ -6412,7 +6412,7 @@
         <w:keepNext w:val="0"/>
         <w:jc w:val="center"/>
       </w:pPr>
-      <w:bookmarkStart w:id="12" w:name="_Toc241351648"/>
+      <w:bookmarkStart w:id="12" w:name="_Toc241352731"/>
       <w:r>
         <w:t xml:space="preserve">ตารางที่ </w:t>
       </w:r>
@@ -6466,7 +6466,7 @@
           <w:noProof/>
         </w:rPr>
         <w:drawing>
-          <wp:inline distT="0" distB="0" distL="0" distR="0" wp14:anchorId="27E3927B" wp14:editId="60772F4E">
+          <wp:inline distT="0" distB="0" distL="0" distR="0" wp14:anchorId="436E60C0" wp14:editId="7C82740C">
             <wp:extent cx="6126480" cy="3341716"/>
             <wp:effectExtent l="0" t="0" r="0" b="0"/>
             <wp:docPr id="2" name="Picture 2"/>
@@ -6508,7 +6508,7 @@
         <w:keepNext w:val="0"/>
         <w:jc w:val="center"/>
       </w:pPr>
-      <w:bookmarkStart w:id="13" w:name="_Toc241351657"/>
+      <w:bookmarkStart w:id="13" w:name="_Toc241352740"/>
       <w:r>
         <w:t xml:space="preserve">รูปที่ </w:t>
       </w:r>
@@ -7213,7 +7213,7 @@
         <w:keepNext w:val="0"/>
         <w:jc w:val="center"/>
       </w:pPr>
-      <w:bookmarkStart w:id="14" w:name="_Toc241351649"/>
+      <w:bookmarkStart w:id="14" w:name="_Toc241352732"/>
       <w:r>
         <w:t xml:space="preserve">ตารางที่ </w:t>
       </w:r>
@@ -7259,7 +7259,7 @@
           <w:noProof/>
         </w:rPr>
         <w:drawing>
-          <wp:inline distT="0" distB="0" distL="0" distR="0" wp14:anchorId="575EAD22" wp14:editId="6624DD79">
+          <wp:inline distT="0" distB="0" distL="0" distR="0" wp14:anchorId="33AAE972" wp14:editId="3ECA8245">
             <wp:extent cx="6126480" cy="3318510"/>
             <wp:effectExtent l="0" t="0" r="0" b="0"/>
             <wp:docPr id="3" name="Picture 3"/>
@@ -7301,7 +7301,7 @@
         <w:keepNext w:val="0"/>
         <w:jc w:val="center"/>
       </w:pPr>
-      <w:bookmarkStart w:id="15" w:name="_Toc241351658"/>
+      <w:bookmarkStart w:id="15" w:name="_Toc241352741"/>
       <w:r>
         <w:t xml:space="preserve">รูปที่ </w:t>
       </w:r>
@@ -8274,7 +8274,7 @@
         <w:keepNext w:val="0"/>
         <w:jc w:val="center"/>
       </w:pPr>
-      <w:bookmarkStart w:id="16" w:name="_Toc241351650"/>
+      <w:bookmarkStart w:id="16" w:name="_Toc241352733"/>
       <w:r>
         <w:t xml:space="preserve">ตารางที่ </w:t>
       </w:r>
@@ -8835,7 +8835,7 @@
         <w:keepNext w:val="0"/>
         <w:jc w:val="center"/>
       </w:pPr>
-      <w:bookmarkStart w:id="17" w:name="_Toc241351651"/>
+      <w:bookmarkStart w:id="17" w:name="_Toc241352734"/>
       <w:r>
         <w:t xml:space="preserve">ตารางที่ </w:t>
       </w:r>
@@ -8879,7 +8879,7 @@
       <w:pPr>
         <w:pStyle w:val="Heading1"/>
       </w:pPr>
-      <w:bookmarkStart w:id="18" w:name="_Toc241351638"/>
+      <w:bookmarkStart w:id="18" w:name="_Toc241352721"/>
       <w:r>
         <w:t>บทที่ 5 การวิเคราะห์และอภิปรายผล</w:t>
       </w:r>
@@ -8925,7 +8925,7 @@
     </w:p>
     <w:p>
       <w:r>
-        <w:t>ใน suite evaluations 1,132 รายการ compile ไม่ผ่าน และ 675 รายการเป็น flaky/regression. DeepSeek มี compile errors 661/853 และ Gemini 429/853. สถานะเหล่านี้ไม่ถูกแทนด้วย coverage 0; FDR ต่อ suite รวมไว้ในตัวหารเพื่อให้เห็นความพร้อมใช้จริง.</w:t>
+        <w:t>ใน suite evaluations 1,132 รายการ compile ไม่ผ่าน และ 794 รายการเป็น flaky/regression. DeepSeek มี compile errors 661/853 และ Gemini 429/853. สถานะเหล่านี้ไม่ถูกแทนด้วย coverage 0; FDR ต่อ suite รวมไว้ในตัวหารเพื่อให้เห็นความพร้อมใช้จริง.</w:t>
       </w:r>
     </w:p>
     <w:p>
@@ -9792,7 +9792,7 @@
         <w:keepNext w:val="0"/>
         <w:jc w:val="center"/>
       </w:pPr>
-      <w:bookmarkStart w:id="19" w:name="_Toc241351652"/>
+      <w:bookmarkStart w:id="19" w:name="_Toc241352735"/>
       <w:r>
         <w:t xml:space="preserve">ตารางที่ </w:t>
       </w:r>
@@ -10273,7 +10273,7 @@
         <w:keepNext w:val="0"/>
         <w:jc w:val="center"/>
       </w:pPr>
-      <w:bookmarkStart w:id="20" w:name="_Toc241351653"/>
+      <w:bookmarkStart w:id="20" w:name="_Toc241352736"/>
       <w:r>
         <w:t xml:space="preserve">ตารางที่ </w:t>
       </w:r>
@@ -10319,7 +10319,7 @@
           <w:noProof/>
         </w:rPr>
         <w:drawing>
-          <wp:inline distT="0" distB="0" distL="0" distR="0" wp14:anchorId="2F5148EB" wp14:editId="5C6730AB">
+          <wp:inline distT="0" distB="0" distL="0" distR="0" wp14:anchorId="79F47252" wp14:editId="31D2AB27">
             <wp:extent cx="6126480" cy="2552700"/>
             <wp:effectExtent l="0" t="0" r="0" b="0"/>
             <wp:docPr id="4" name="Picture 4"/>
@@ -10361,7 +10361,7 @@
         <w:keepNext w:val="0"/>
         <w:jc w:val="center"/>
       </w:pPr>
-      <w:bookmarkStart w:id="21" w:name="_Toc241351659"/>
+      <w:bookmarkStart w:id="21" w:name="_Toc241352742"/>
       <w:r>
         <w:t xml:space="preserve">รูปที่ </w:t>
       </w:r>
@@ -10512,7 +10512,7 @@
       <w:pPr>
         <w:pStyle w:val="Heading1"/>
       </w:pPr>
-      <w:bookmarkStart w:id="22" w:name="_Toc241351639"/>
+      <w:bookmarkStart w:id="22" w:name="_Toc241352722"/>
       <w:r>
         <w:t>บทที่ 6 สรุปผลและการทำซ้ำ</w:t>
       </w:r>
@@ -10740,7 +10740,7 @@
       <w:pPr>
         <w:pStyle w:val="Heading1"/>
       </w:pPr>
-      <w:bookmarkStart w:id="23" w:name="_Toc241351640"/>
+      <w:bookmarkStart w:id="23" w:name="_Toc241352723"/>
       <w:r>
         <w:t>เอกสารอ้างอิง</w:t>
       </w:r>
@@ -10850,7 +10850,7 @@
       <w:pPr>
         <w:pStyle w:val="Heading1"/>
       </w:pPr>
-      <w:bookmarkStart w:id="24" w:name="_Toc241351641"/>
+      <w:bookmarkStart w:id="24" w:name="_Toc241352724"/>
       <w:r>
         <w:t>ภาคผนวก ก แหล่งข้อมูลและไฟล์ทำซ้ำ</w:t>
       </w:r>
@@ -11534,7 +11534,7 @@
         <w:keepNext w:val="0"/>
         <w:jc w:val="center"/>
       </w:pPr>
-      <w:bookmarkStart w:id="25" w:name="_Toc241351654"/>
+      <w:bookmarkStart w:id="25" w:name="_Toc241352737"/>
       <w:r>
         <w:t xml:space="preserve">ตารางที่ </w:t>
       </w:r>
@@ -11573,7 +11573,7 @@
       <w:pPr>
         <w:pStyle w:val="Heading1"/>
       </w:pPr>
-      <w:bookmarkStart w:id="26" w:name="_Toc241351642"/>
+      <w:bookmarkStart w:id="26" w:name="_Toc241352725"/>
       <w:r>
         <w:t>ภาคผนวก ข ตัวอย่างการตรวจย้อนกลับ</w:t>
       </w:r>
@@ -12386,7 +12386,7 @@
         <w:keepNext w:val="0"/>
         <w:jc w:val="center"/>
       </w:pPr>
-      <w:bookmarkStart w:id="27" w:name="_Toc241351655"/>
+      <w:bookmarkStart w:id="27" w:name="_Toc241352738"/>
       <w:r>
         <w:t xml:space="preserve">ตารางที่ </w:t>
       </w:r>
@@ -12430,7 +12430,7 @@
       <w:pPr>
         <w:pStyle w:val="Heading1"/>
       </w:pPr>
-      <w:bookmarkStart w:id="28" w:name="_Toc241351643"/>
+      <w:bookmarkStart w:id="28" w:name="_Toc241352726"/>
       <w:r>
         <w:t>ภาคผนวก ค Data dictionary แบบย่อ</w:t>
       </w:r>
@@ -12926,7 +12926,7 @@
         <w:keepNext w:val="0"/>
         <w:jc w:val="center"/>
       </w:pPr>
-      <w:bookmarkStart w:id="29" w:name="_Toc241351656"/>
+      <w:bookmarkStart w:id="29" w:name="_Toc241352739"/>
       <w:r>
         <w:t xml:space="preserve">ตารางที่ </w:t>
       </w:r>
@@ -13229,31 +13229,31 @@
       </w:rPr>
     </w:lvl>
   </w:abstractNum>
-  <w:num w:numId="1" w16cid:durableId="115759159">
+  <w:num w:numId="1" w16cid:durableId="2044088497">
     <w:abstractNumId w:val="8"/>
   </w:num>
-  <w:num w:numId="2" w16cid:durableId="367678844">
+  <w:num w:numId="2" w16cid:durableId="210112597">
     <w:abstractNumId w:val="6"/>
   </w:num>
-  <w:num w:numId="3" w16cid:durableId="299269742">
+  <w:num w:numId="3" w16cid:durableId="769661533">
     <w:abstractNumId w:val="5"/>
   </w:num>
-  <w:num w:numId="4" w16cid:durableId="1824733149">
+  <w:num w:numId="4" w16cid:durableId="483547433">
     <w:abstractNumId w:val="4"/>
   </w:num>
-  <w:num w:numId="5" w16cid:durableId="309680149">
+  <w:num w:numId="5" w16cid:durableId="991326011">
     <w:abstractNumId w:val="7"/>
   </w:num>
-  <w:num w:numId="6" w16cid:durableId="412555161">
+  <w:num w:numId="6" w16cid:durableId="1629509613">
     <w:abstractNumId w:val="3"/>
   </w:num>
-  <w:num w:numId="7" w16cid:durableId="471950189">
+  <w:num w:numId="7" w16cid:durableId="1675760745">
     <w:abstractNumId w:val="2"/>
   </w:num>
-  <w:num w:numId="8" w16cid:durableId="715588632">
+  <w:num w:numId="8" w16cid:durableId="1632634806">
     <w:abstractNumId w:val="1"/>
   </w:num>
-  <w:num w:numId="9" w16cid:durableId="1638803412">
+  <w:num w:numId="9" w16cid:durableId="1433554807">
     <w:abstractNumId w:val="0"/>
   </w:num>
 </w:numbering>
@@ -24675,14 +24675,14 @@
     <w:autoRedefine/>
     <w:uiPriority w:val="39"/>
     <w:unhideWhenUsed/>
-    <w:rsid w:val="008F515F"/>
+    <w:rsid w:val="00DB1B1A"/>
   </w:style>
   <w:style w:type="character" w:styleId="Hyperlink">
     <w:name w:val="Hyperlink"/>
     <w:basedOn w:val="DefaultParagraphFont"/>
     <w:uiPriority w:val="99"/>
     <w:unhideWhenUsed/>
-    <w:rsid w:val="008F515F"/>
+    <w:rsid w:val="00DB1B1A"/>
     <w:rPr>
       <w:color w:val="0000FF" w:themeColor="hyperlink"/>
       <w:u w:val="single"/>
@@ -24694,7 +24694,7 @@
     <w:next w:val="Normal"/>
     <w:uiPriority w:val="99"/>
     <w:unhideWhenUsed/>
-    <w:rsid w:val="008F515F"/>
+    <w:rsid w:val="00DB1B1A"/>
     <w:pPr>
       <w:spacing w:after="0"/>
     </w:pPr>

</xml_diff>